<commit_message>
Deploying to gh-pages from @ Morrison-Lab/sds@706f18375093dab29231b4eb8c40d9aedddc04a0 🚀
</commit_message>
<xml_diff>
--- a/bayesian-inference-handout.docx
+++ b/bayesian-inference-handout.docx
@@ -15,7 +15,7 @@
         <w:pStyle w:val="Date"/>
       </w:pPr>
       <w:r>
-        <w:t xml:space="preserve">Last modified: 2026-10-08 21:40:49 (PDT)</w:t>
+        <w:t xml:space="preserve">Last modified: 2026-10-08 23:15:22 (PDT)</w:t>
       </w:r>
     </w:p>
     <w:p>
@@ -3228,54 +3228,8 @@
           <m:jc m:val="center"/>
         </m:oMathParaPr>
         <m:oMath>
-          <m:r>
-            <m:rPr>
-              <m:sty m:val="p"/>
-            </m:rPr>
-            <m:t>p</m:t>
-          </m:r>
-          <m:r>
-            <m:rPr>
-              <m:sty m:val="p"/>
-            </m:rPr>
-            <m:t>(</m:t>
-          </m:r>
-          <m:r>
-            <m:t>0.8</m:t>
-          </m:r>
-          <m:r>
-            <m:rPr>
-              <m:sty m:val="p"/>
-            </m:rPr>
-            <m:t>∣</m:t>
-          </m:r>
-          <m:acc>
-            <m:accPr>
-              <m:chr m:val="̃"/>
-            </m:accPr>
+          <m:eqArr>
             <m:e>
-              <m:r>
-                <m:t>y</m:t>
-              </m:r>
-            </m:e>
-          </m:acc>
-          <m:r>
-            <m:rPr>
-              <m:sty m:val="p"/>
-            </m:rPr>
-            <m:t>)</m:t>
-          </m:r>
-          <m:r>
-            <m:rPr>
-              <m:sty m:val="p"/>
-            </m:rPr>
-            <m:t>=</m:t>
-          </m:r>
-          <m:f>
-            <m:fPr>
-              <m:type m:val="bar"/>
-            </m:fPr>
-            <m:num>
               <m:r>
                 <m:rPr>
                   <m:sty m:val="p"/>
@@ -3287,6 +3241,15 @@
                   <m:sty m:val="p"/>
                 </m:rPr>
                 <m:t>(</m:t>
+              </m:r>
+              <m:r>
+                <m:t>0.8</m:t>
+              </m:r>
+              <m:r>
+                <m:rPr>
+                  <m:sty m:val="p"/>
+                </m:rPr>
+                <m:t>∣</m:t>
               </m:r>
               <m:acc>
                 <m:accPr>
@@ -3302,109 +3265,163 @@
                 <m:rPr>
                   <m:sty m:val="p"/>
                 </m:rPr>
-                <m:t>∣</m:t>
-              </m:r>
-              <m:r>
-                <m:t>0.8</m:t>
+                <m:t>)</m:t>
+              </m:r>
+              <m:r>
+                <m:t>&amp;</m:t>
               </m:r>
               <m:r>
                 <m:rPr>
                   <m:sty m:val="p"/>
                 </m:rPr>
-                <m:t>)</m:t>
-              </m:r>
-              <m:r>
-                <m:t> </m:t>
+                <m:t>=</m:t>
+              </m:r>
+              <m:f>
+                <m:fPr>
+                  <m:type m:val="bar"/>
+                </m:fPr>
+                <m:num>
+                  <m:r>
+                    <m:rPr>
+                      <m:sty m:val="p"/>
+                    </m:rPr>
+                    <m:t>p</m:t>
+                  </m:r>
+                  <m:r>
+                    <m:rPr>
+                      <m:sty m:val="p"/>
+                    </m:rPr>
+                    <m:t>(</m:t>
+                  </m:r>
+                  <m:acc>
+                    <m:accPr>
+                      <m:chr m:val="̃"/>
+                    </m:accPr>
+                    <m:e>
+                      <m:r>
+                        <m:t>y</m:t>
+                      </m:r>
+                    </m:e>
+                  </m:acc>
+                  <m:r>
+                    <m:rPr>
+                      <m:sty m:val="p"/>
+                    </m:rPr>
+                    <m:t>∣</m:t>
+                  </m:r>
+                  <m:r>
+                    <m:t>0.8</m:t>
+                  </m:r>
+                  <m:r>
+                    <m:rPr>
+                      <m:sty m:val="p"/>
+                    </m:rPr>
+                    <m:t>)</m:t>
+                  </m:r>
+                  <m:r>
+                    <m:t> </m:t>
+                  </m:r>
+                  <m:r>
+                    <m:rPr>
+                      <m:sty m:val="p"/>
+                    </m:rPr>
+                    <m:t>p</m:t>
+                  </m:r>
+                  <m:r>
+                    <m:rPr>
+                      <m:sty m:val="p"/>
+                    </m:rPr>
+                    <m:t>(</m:t>
+                  </m:r>
+                  <m:r>
+                    <m:t>0.8</m:t>
+                  </m:r>
+                  <m:r>
+                    <m:rPr>
+                      <m:sty m:val="p"/>
+                    </m:rPr>
+                    <m:t>)</m:t>
+                  </m:r>
+                </m:num>
+                <m:den>
+                  <m:r>
+                    <m:rPr>
+                      <m:sty m:val="p"/>
+                    </m:rPr>
+                    <m:t>p</m:t>
+                  </m:r>
+                  <m:r>
+                    <m:rPr>
+                      <m:sty m:val="p"/>
+                    </m:rPr>
+                    <m:t>(</m:t>
+                  </m:r>
+                  <m:acc>
+                    <m:accPr>
+                      <m:chr m:val="̃"/>
+                    </m:accPr>
+                    <m:e>
+                      <m:r>
+                        <m:t>y</m:t>
+                      </m:r>
+                    </m:e>
+                  </m:acc>
+                  <m:r>
+                    <m:rPr>
+                      <m:sty m:val="p"/>
+                    </m:rPr>
+                    <m:t>)</m:t>
+                  </m:r>
+                </m:den>
+              </m:f>
+            </m:e>
+            <m:e>
+              <m:r>
+                <m:t>&amp;</m:t>
               </m:r>
               <m:r>
                 <m:rPr>
                   <m:sty m:val="p"/>
                 </m:rPr>
-                <m:t>p</m:t>
+                <m:t>=</m:t>
+              </m:r>
+              <m:f>
+                <m:fPr>
+                  <m:type m:val="bar"/>
+                </m:fPr>
+                <m:num>
+                  <m:r>
+                    <m:t>0.0512</m:t>
+                  </m:r>
+                </m:num>
+                <m:den>
+                  <m:r>
+                    <m:t>0.1637</m:t>
+                  </m:r>
+                </m:den>
+              </m:f>
+            </m:e>
+            <m:e>
+              <m:r>
+                <m:t>&amp;</m:t>
               </m:r>
               <m:r>
                 <m:rPr>
                   <m:sty m:val="p"/>
                 </m:rPr>
-                <m:t>(</m:t>
-              </m:r>
-              <m:r>
-                <m:t>0.8</m:t>
+                <m:t>≈</m:t>
+              </m:r>
+              <m:r>
+                <m:t>0.313</m:t>
               </m:r>
               <m:r>
                 <m:rPr>
                   <m:sty m:val="p"/>
                 </m:rPr>
-                <m:t>)</m:t>
-              </m:r>
-            </m:num>
-            <m:den>
-              <m:r>
-                <m:rPr>
-                  <m:sty m:val="p"/>
-                </m:rPr>
-                <m:t>p</m:t>
-              </m:r>
-              <m:r>
-                <m:rPr>
-                  <m:sty m:val="p"/>
-                </m:rPr>
-                <m:t>(</m:t>
-              </m:r>
-              <m:acc>
-                <m:accPr>
-                  <m:chr m:val="̃"/>
-                </m:accPr>
-                <m:e>
-                  <m:r>
-                    <m:t>y</m:t>
-                  </m:r>
-                </m:e>
-              </m:acc>
-              <m:r>
-                <m:rPr>
-                  <m:sty m:val="p"/>
-                </m:rPr>
-                <m:t>)</m:t>
-              </m:r>
-            </m:den>
-          </m:f>
-          <m:r>
-            <m:rPr>
-              <m:sty m:val="p"/>
-            </m:rPr>
-            <m:t>=</m:t>
-          </m:r>
-          <m:f>
-            <m:fPr>
-              <m:type m:val="bar"/>
-            </m:fPr>
-            <m:num>
-              <m:r>
-                <m:t>0.0512</m:t>
-              </m:r>
-            </m:num>
-            <m:den>
-              <m:r>
-                <m:t>0.1637</m:t>
-              </m:r>
-            </m:den>
-          </m:f>
-          <m:r>
-            <m:rPr>
-              <m:sty m:val="p"/>
-            </m:rPr>
-            <m:t>≈</m:t>
-          </m:r>
-          <m:r>
-            <m:t>0.313</m:t>
-          </m:r>
-          <m:r>
-            <m:rPr>
-              <m:sty m:val="p"/>
-            </m:rPr>
-            <m:t>,</m:t>
-          </m:r>
+                <m:t>,</m:t>
+              </m:r>
+            </m:e>
+          </m:eqArr>
         </m:oMath>
       </m:oMathPara>
     </w:p>

</xml_diff>

<commit_message>
Deploying to gh-pages from @ Morrison-Lab/sds@5b5bcb30fb326894d778d9127a8ef359223e5bb4 🚀
</commit_message>
<xml_diff>
--- a/bayesian-inference-handout.docx
+++ b/bayesian-inference-handout.docx
@@ -15,7 +15,7 @@
         <w:pStyle w:val="Date"/>
       </w:pPr>
       <w:r>
-        <w:t xml:space="preserve">Last modified: 2026-10-08 23:15:22 (PDT)</w:t>
+        <w:t xml:space="preserve">Last modified: 2026-10-09 01:37:12 (PDT)</w:t>
       </w:r>
     </w:p>
     <w:p>
@@ -43480,7 +43480,7 @@
       </w:r>
     </w:p>
     <w:bookmarkEnd w:id="126"/>
-    <w:bookmarkStart w:id="140" w:name="sec-bayes-resources"/>
+    <w:bookmarkStart w:id="141" w:name="sec-bayes-resources"/>
     <w:p>
       <w:pPr>
         <w:pStyle w:val="Heading2"/>
@@ -43715,7 +43715,7 @@
       </w:r>
     </w:p>
     <w:bookmarkEnd w:id="135"/>
-    <w:bookmarkStart w:id="139" w:name="books"/>
+    <w:bookmarkStart w:id="140" w:name="books"/>
     <w:p>
       <w:pPr>
         <w:pStyle w:val="Heading3"/>
@@ -43854,6 +43854,32 @@
           <w:t xml:space="preserve">course materials</w:t>
         </w:r>
       </w:hyperlink>
+      <w:r>
+        <w:t xml:space="preserve">;</w:t>
+      </w:r>
+      <w:r>
+        <w:t xml:space="preserve"> </w:t>
+      </w:r>
+      <w:r>
+        <w:t xml:space="preserve">the Data Science Learning Community’s</w:t>
+      </w:r>
+      <w:r>
+        <w:t xml:space="preserve"> </w:t>
+      </w:r>
+      <w:hyperlink r:id="rId139">
+        <w:r>
+          <w:rPr>
+            <w:rStyle w:val="Hyperlink"/>
+          </w:rPr>
+          <w:t xml:space="preserve">book club</w:t>
+        </w:r>
+      </w:hyperlink>
+      <w:r>
+        <w:t xml:space="preserve"> </w:t>
+      </w:r>
+      <w:r>
+        <w:t xml:space="preserve">recorded its discussion of the first twelve chapters</w:t>
+      </w:r>
     </w:p>
     <w:p>
       <w:pPr>
@@ -43923,9 +43949,9 @@
         </w:r>
       </w:hyperlink>
     </w:p>
-    <w:bookmarkEnd w:id="139"/>
     <w:bookmarkEnd w:id="140"/>
-    <w:bookmarkStart w:id="162" w:name="references"/>
+    <w:bookmarkEnd w:id="141"/>
+    <w:bookmarkStart w:id="163" w:name="references"/>
     <w:p>
       <w:pPr>
         <w:pStyle w:val="Heading2"/>
@@ -43934,8 +43960,8 @@
         <w:t xml:space="preserve">References</w:t>
       </w:r>
     </w:p>
-    <w:bookmarkStart w:id="161" w:name="refs"/>
-    <w:bookmarkStart w:id="142" w:name="ref-aragon2018population"/>
+    <w:bookmarkStart w:id="162" w:name="refs"/>
+    <w:bookmarkStart w:id="143" w:name="ref-aragon2018population"/>
     <w:p>
       <w:pPr>
         <w:pStyle w:val="Bibliography"/>
@@ -43987,7 +44013,7 @@
       <w:r>
         <w:t xml:space="preserve"> </w:t>
       </w:r>
-      <w:hyperlink r:id="rId141">
+      <w:hyperlink r:id="rId142">
         <w:r>
           <w:rPr>
             <w:rStyle w:val="Hyperlink"/>
@@ -43999,8 +44025,8 @@
         <w:t xml:space="preserve">.</w:t>
       </w:r>
     </w:p>
-    <w:bookmarkEnd w:id="142"/>
-    <w:bookmarkStart w:id="144" w:name="ref-CaseBerg01"/>
+    <w:bookmarkEnd w:id="143"/>
+    <w:bookmarkStart w:id="145" w:name="ref-CaseBerg01"/>
     <w:p>
       <w:pPr>
         <w:pStyle w:val="Bibliography"/>
@@ -44024,7 +44050,7 @@
       <w:r>
         <w:t xml:space="preserve"> </w:t>
       </w:r>
-      <w:hyperlink r:id="rId143">
+      <w:hyperlink r:id="rId144">
         <w:r>
           <w:rPr>
             <w:rStyle w:val="Hyperlink"/>
@@ -44036,8 +44062,8 @@
         <w:t xml:space="preserve">.</w:t>
       </w:r>
     </w:p>
-    <w:bookmarkEnd w:id="144"/>
-    <w:bookmarkStart w:id="146" w:name="ref-CowlesMaryKathryn2013ABSW"/>
+    <w:bookmarkEnd w:id="145"/>
+    <w:bookmarkStart w:id="147" w:name="ref-CowlesMaryKathryn2013ABSW"/>
     <w:p>
       <w:pPr>
         <w:pStyle w:val="Bibliography"/>
@@ -44117,7 +44143,7 @@
       <w:r>
         <w:t xml:space="preserve"> </w:t>
       </w:r>
-      <w:hyperlink r:id="rId145">
+      <w:hyperlink r:id="rId146">
         <w:r>
           <w:rPr>
             <w:rStyle w:val="Hyperlink"/>
@@ -44129,8 +44155,8 @@
         <w:t xml:space="preserve">.</w:t>
       </w:r>
     </w:p>
-    <w:bookmarkEnd w:id="146"/>
-    <w:bookmarkStart w:id="148" w:name="ref-dobson4e"/>
+    <w:bookmarkEnd w:id="147"/>
+    <w:bookmarkStart w:id="149" w:name="ref-dobson4e"/>
     <w:p>
       <w:pPr>
         <w:pStyle w:val="Bibliography"/>
@@ -44154,7 +44180,7 @@
       <w:r>
         <w:t xml:space="preserve"> </w:t>
       </w:r>
-      <w:hyperlink r:id="rId147">
+      <w:hyperlink r:id="rId148">
         <w:r>
           <w:rPr>
             <w:rStyle w:val="Hyperlink"/>
@@ -44166,8 +44192,8 @@
         <w:t xml:space="preserve">.</w:t>
       </w:r>
     </w:p>
-    <w:bookmarkEnd w:id="148"/>
-    <w:bookmarkStart w:id="150" w:name="ref-gelman2013bda"/>
+    <w:bookmarkEnd w:id="149"/>
+    <w:bookmarkStart w:id="151" w:name="ref-gelman2013bda"/>
     <w:p>
       <w:pPr>
         <w:pStyle w:val="Bibliography"/>
@@ -44191,7 +44217,7 @@
       <w:r>
         <w:t xml:space="preserve"> </w:t>
       </w:r>
-      <w:hyperlink r:id="rId149">
+      <w:hyperlink r:id="rId150">
         <w:r>
           <w:rPr>
             <w:rStyle w:val="Hyperlink"/>
@@ -44203,8 +44229,8 @@
         <w:t xml:space="preserve">.</w:t>
       </w:r>
     </w:p>
-    <w:bookmarkEnd w:id="150"/>
-    <w:bookmarkStart w:id="151" w:name="ref-HobbsN.Thompson2015Bmas"/>
+    <w:bookmarkEnd w:id="151"/>
+    <w:bookmarkStart w:id="152" w:name="ref-HobbsN.Thompson2015Bmas"/>
     <w:p>
       <w:pPr>
         <w:pStyle w:val="Bibliography"/>
@@ -44226,8 +44252,8 @@
         <w:t xml:space="preserve">. STU - Student edition. Princeton University Press.</w:t>
       </w:r>
     </w:p>
-    <w:bookmarkEnd w:id="151"/>
-    <w:bookmarkStart w:id="152" w:name="ref-hosmer1989applied"/>
+    <w:bookmarkEnd w:id="152"/>
+    <w:bookmarkStart w:id="153" w:name="ref-hosmer1989applied"/>
     <w:p>
       <w:pPr>
         <w:pStyle w:val="Bibliography"/>
@@ -44249,8 +44275,8 @@
         <w:t xml:space="preserve">. Wiley.</w:t>
       </w:r>
     </w:p>
-    <w:bookmarkEnd w:id="152"/>
-    <w:bookmarkStart w:id="154" w:name="ref-kery-bayes-pop"/>
+    <w:bookmarkEnd w:id="153"/>
+    <w:bookmarkStart w:id="155" w:name="ref-kery-bayes-pop"/>
     <w:p>
       <w:pPr>
         <w:pStyle w:val="Bibliography"/>
@@ -44302,7 +44328,7 @@
       <w:r>
         <w:t xml:space="preserve"> </w:t>
       </w:r>
-      <w:hyperlink r:id="rId153">
+      <w:hyperlink r:id="rId154">
         <w:r>
           <w:rPr>
             <w:rStyle w:val="Hyperlink"/>
@@ -44314,8 +44340,8 @@
         <w:t xml:space="preserve">.</w:t>
       </w:r>
     </w:p>
-    <w:bookmarkEnd w:id="154"/>
-    <w:bookmarkStart w:id="155" w:name="ref-korner.bayes.ecology"/>
+    <w:bookmarkEnd w:id="155"/>
+    <w:bookmarkStart w:id="156" w:name="ref-korner.bayes.ecology"/>
     <w:p>
       <w:pPr>
         <w:pStyle w:val="Bibliography"/>
@@ -44393,8 +44419,8 @@
         <w:t xml:space="preserve">. 1st ed. Academic Press.</w:t>
       </w:r>
     </w:p>
-    <w:bookmarkEnd w:id="155"/>
-    <w:bookmarkStart w:id="156" w:name="ref-statrethink2e"/>
+    <w:bookmarkEnd w:id="156"/>
+    <w:bookmarkStart w:id="157" w:name="ref-statrethink2e"/>
     <w:p>
       <w:pPr>
         <w:pStyle w:val="Bibliography"/>
@@ -44486,8 +44512,8 @@
         <w:t xml:space="preserve">. Second edition. Chapman &amp; Hall/CRC Texts in Statistical Science Series. CRC Press.</w:t>
       </w:r>
     </w:p>
-    <w:bookmarkEnd w:id="156"/>
-    <w:bookmarkStart w:id="158" w:name="ref-rossbayes"/>
+    <w:bookmarkEnd w:id="157"/>
+    <w:bookmarkStart w:id="159" w:name="ref-rossbayes"/>
     <w:p>
       <w:pPr>
         <w:pStyle w:val="Bibliography"/>
@@ -44511,7 +44537,7 @@
       <w:r>
         <w:t xml:space="preserve"> </w:t>
       </w:r>
-      <w:hyperlink r:id="rId157">
+      <w:hyperlink r:id="rId158">
         <w:r>
           <w:rPr>
             <w:rStyle w:val="Hyperlink"/>
@@ -44523,8 +44549,8 @@
         <w:t xml:space="preserve">.</w:t>
       </w:r>
     </w:p>
-    <w:bookmarkEnd w:id="158"/>
-    <w:bookmarkStart w:id="160" w:name="ref-venables2002modern"/>
+    <w:bookmarkEnd w:id="159"/>
+    <w:bookmarkStart w:id="161" w:name="ref-venables2002modern"/>
     <w:p>
       <w:pPr>
         <w:pStyle w:val="Bibliography"/>
@@ -44562,7 +44588,7 @@
       <w:r>
         <w:t xml:space="preserve"> </w:t>
       </w:r>
-      <w:hyperlink r:id="rId159">
+      <w:hyperlink r:id="rId160">
         <w:r>
           <w:rPr>
             <w:rStyle w:val="Hyperlink"/>
@@ -44574,9 +44600,9 @@
         <w:t xml:space="preserve">.</w:t>
       </w:r>
     </w:p>
-    <w:bookmarkEnd w:id="160"/>
     <w:bookmarkEnd w:id="161"/>
     <w:bookmarkEnd w:id="162"/>
+    <w:bookmarkEnd w:id="163"/>
     <w:sectPr>
       <w:footnotePr>
         <w:numRestart w:val="eachSect"/>

</xml_diff>

<commit_message>
Deploying to gh-pages from @ Morrison-Lab/sds@84b3d73908719e517c4d9049e4e9226625f72bb7 🚀
</commit_message>
<xml_diff>
--- a/bayesian-inference-handout.docx
+++ b/bayesian-inference-handout.docx
@@ -15,7 +15,7 @@
         <w:pStyle w:val="Date"/>
       </w:pPr>
       <w:r>
-        <w:t xml:space="preserve">Last modified: 2026-10-09 10:39:54 (PDT)</w:t>
+        <w:t xml:space="preserve">Last modified: 2026-10-09 12:07:46 (PDT)</w:t>
       </w:r>
     </w:p>
     <w:p>
@@ -25298,18 +25298,261 @@
               <w:rPr>
                 <w:rStyle w:val="NormalTok"/>
               </w:rPr>
+              <w:t xml:space="preserve"> dplyr</w:t>
+            </w:r>
+            <w:r>
+              <w:rPr>
+                <w:rStyle w:val="SpecialCharTok"/>
+              </w:rPr>
+              <w:t xml:space="preserve">::</w:t>
+            </w:r>
+            <w:r>
+              <w:rPr>
+                <w:rStyle w:val="FunctionTok"/>
+              </w:rPr>
+              <w:t xml:space="preserve">bind_rows</w:t>
+            </w:r>
+            <w:r>
+              <w:rPr>
+                <w:rStyle w:val="NormalTok"/>
+              </w:rPr>
+              <w:t xml:space="preserve">(</w:t>
+            </w:r>
+            <w:r>
+              <w:br/>
+            </w:r>
+            <w:r>
+              <w:rPr>
+                <w:rStyle w:val="NormalTok"/>
+              </w:rPr>
+              <w:t xml:space="preserve">  </w:t>
+            </w:r>
+            <w:r>
+              <w:rPr>
+                <w:rStyle w:val="FunctionTok"/>
+              </w:rPr>
+              <w:t xml:space="preserve">lapply</w:t>
+            </w:r>
+            <w:r>
+              <w:rPr>
+                <w:rStyle w:val="NormalTok"/>
+              </w:rPr>
+              <w:t xml:space="preserve">(</w:t>
+            </w:r>
+            <w:r>
+              <w:rPr>
+                <w:rStyle w:val="FunctionTok"/>
+              </w:rPr>
+              <w:t xml:space="preserve">rownames</w:t>
+            </w:r>
+            <w:r>
+              <w:rPr>
+                <w:rStyle w:val="NormalTok"/>
+              </w:rPr>
+              <w:t xml:space="preserve">(post_params), \(data_set) {</w:t>
+            </w:r>
+            <w:r>
+              <w:br/>
+            </w:r>
+            <w:r>
+              <w:rPr>
+                <w:rStyle w:val="NormalTok"/>
+              </w:rPr>
+              <w:t xml:space="preserve">    dplyr</w:t>
+            </w:r>
+            <w:r>
+              <w:rPr>
+                <w:rStyle w:val="SpecialCharTok"/>
+              </w:rPr>
+              <w:t xml:space="preserve">::</w:t>
+            </w:r>
+            <w:r>
+              <w:rPr>
+                <w:rStyle w:val="FunctionTok"/>
+              </w:rPr>
+              <w:t xml:space="preserve">bind_rows</w:t>
+            </w:r>
+            <w:r>
+              <w:rPr>
+                <w:rStyle w:val="NormalTok"/>
+              </w:rPr>
+              <w:t xml:space="preserve">(</w:t>
+            </w:r>
+            <w:r>
+              <w:br/>
+            </w:r>
+            <w:r>
+              <w:rPr>
+                <w:rStyle w:val="NormalTok"/>
+              </w:rPr>
+              <w:t xml:space="preserve">      tibble</w:t>
+            </w:r>
+            <w:r>
+              <w:rPr>
+                <w:rStyle w:val="SpecialCharTok"/>
+              </w:rPr>
+              <w:t xml:space="preserve">::</w:t>
+            </w:r>
+            <w:r>
+              <w:rPr>
+                <w:rStyle w:val="FunctionTok"/>
+              </w:rPr>
+              <w:t xml:space="preserve">tibble</w:t>
+            </w:r>
+            <w:r>
+              <w:rPr>
+                <w:rStyle w:val="NormalTok"/>
+              </w:rPr>
+              <w:t xml:space="preserve">(</w:t>
+            </w:r>
+            <w:r>
+              <w:br/>
+            </w:r>
+            <w:r>
+              <w:rPr>
+                <w:rStyle w:val="NormalTok"/>
+              </w:rPr>
+              <w:t xml:space="preserve">        </w:t>
+            </w:r>
+            <w:r>
+              <w:rPr>
+                <w:rStyle w:val="AttributeTok"/>
+              </w:rPr>
+              <w:t xml:space="preserve">data_set =</w:t>
+            </w:r>
+            <w:r>
+              <w:rPr>
+                <w:rStyle w:val="NormalTok"/>
+              </w:rPr>
+              <w:t xml:space="preserve"> data_set,</w:t>
+            </w:r>
+            <w:r>
+              <w:br/>
+            </w:r>
+            <w:r>
+              <w:rPr>
+                <w:rStyle w:val="NormalTok"/>
+              </w:rPr>
+              <w:t xml:space="preserve">        </w:t>
+            </w:r>
+            <w:r>
+              <w:rPr>
+                <w:rStyle w:val="AttributeTok"/>
+              </w:rPr>
+              <w:t xml:space="preserve">prob =</w:t>
+            </w:r>
+            <w:r>
+              <w:rPr>
+                <w:rStyle w:val="NormalTok"/>
+              </w:rPr>
+              <w:t xml:space="preserve"> prob_grid,</w:t>
+            </w:r>
+            <w:r>
+              <w:br/>
+            </w:r>
+            <w:r>
+              <w:rPr>
+                <w:rStyle w:val="NormalTok"/>
+              </w:rPr>
+              <w:t xml:space="preserve">        </w:t>
+            </w:r>
+            <w:r>
+              <w:rPr>
+                <w:rStyle w:val="AttributeTok"/>
+              </w:rPr>
+              <w:t xml:space="preserve">distribution =</w:t>
+            </w:r>
+            <w:r>
+              <w:rPr>
+                <w:rStyle w:val="NormalTok"/>
+              </w:rPr>
               <w:t xml:space="preserve"> </w:t>
             </w:r>
             <w:r>
               <w:rPr>
+                <w:rStyle w:val="StringTok"/>
+              </w:rPr>
+              <w:t xml:space="preserve">"prior"</w:t>
+            </w:r>
+            <w:r>
+              <w:rPr>
+                <w:rStyle w:val="NormalTok"/>
+              </w:rPr>
+              <w:t xml:space="preserve">,</w:t>
+            </w:r>
+            <w:r>
+              <w:br/>
+            </w:r>
+            <w:r>
+              <w:rPr>
+                <w:rStyle w:val="NormalTok"/>
+              </w:rPr>
+              <w:t xml:space="preserve">        </w:t>
+            </w:r>
+            <w:r>
+              <w:rPr>
+                <w:rStyle w:val="AttributeTok"/>
+              </w:rPr>
+              <w:t xml:space="preserve">density =</w:t>
+            </w:r>
+            <w:r>
+              <w:rPr>
+                <w:rStyle w:val="NormalTok"/>
+              </w:rPr>
+              <w:t xml:space="preserve"> stats</w:t>
+            </w:r>
+            <w:r>
+              <w:rPr>
+                <w:rStyle w:val="SpecialCharTok"/>
+              </w:rPr>
+              <w:t xml:space="preserve">::</w:t>
+            </w:r>
+            <w:r>
+              <w:rPr>
                 <w:rStyle w:val="FunctionTok"/>
               </w:rPr>
-              <w:t xml:space="preserve">do.call</w:t>
+              <w:t xml:space="preserve">dbeta</w:t>
             </w:r>
             <w:r>
               <w:rPr>
                 <w:rStyle w:val="NormalTok"/>
               </w:rPr>
+              <w:t xml:space="preserve">(prob_grid, prior_a, prior_b)</w:t>
+            </w:r>
+            <w:r>
+              <w:br/>
+            </w:r>
+            <w:r>
+              <w:rPr>
+                <w:rStyle w:val="NormalTok"/>
+              </w:rPr>
+              <w:t xml:space="preserve">      ),</w:t>
+            </w:r>
+            <w:r>
+              <w:br/>
+            </w:r>
+            <w:r>
+              <w:rPr>
+                <w:rStyle w:val="NormalTok"/>
+              </w:rPr>
+              <w:t xml:space="preserve">      tibble</w:t>
+            </w:r>
+            <w:r>
+              <w:rPr>
+                <w:rStyle w:val="SpecialCharTok"/>
+              </w:rPr>
+              <w:t xml:space="preserve">::</w:t>
+            </w:r>
+            <w:r>
+              <w:rPr>
+                <w:rStyle w:val="FunctionTok"/>
+              </w:rPr>
+              <w:t xml:space="preserve">tibble</w:t>
+            </w:r>
+            <w:r>
+              <w:rPr>
+                <w:rStyle w:val="NormalTok"/>
+              </w:rPr>
               <w:t xml:space="preserve">(</w:t>
             </w:r>
             <w:r>
@@ -25319,7 +25562,19 @@
               <w:rPr>
                 <w:rStyle w:val="NormalTok"/>
               </w:rPr>
-              <w:t xml:space="preserve">  rbind,</w:t>
+              <w:t xml:space="preserve">        </w:t>
+            </w:r>
+            <w:r>
+              <w:rPr>
+                <w:rStyle w:val="AttributeTok"/>
+              </w:rPr>
+              <w:t xml:space="preserve">data_set =</w:t>
+            </w:r>
+            <w:r>
+              <w:rPr>
+                <w:rStyle w:val="NormalTok"/>
+              </w:rPr>
+              <w:t xml:space="preserve"> data_set,</w:t>
             </w:r>
             <w:r>
               <w:br/>
@@ -25328,31 +25583,418 @@
               <w:rPr>
                 <w:rStyle w:val="NormalTok"/>
               </w:rPr>
+              <w:t xml:space="preserve">        </w:t>
+            </w:r>
+            <w:r>
+              <w:rPr>
+                <w:rStyle w:val="AttributeTok"/>
+              </w:rPr>
+              <w:t xml:space="preserve">prob =</w:t>
+            </w:r>
+            <w:r>
+              <w:rPr>
+                <w:rStyle w:val="NormalTok"/>
+              </w:rPr>
+              <w:t xml:space="preserve"> prob_grid,</w:t>
+            </w:r>
+            <w:r>
+              <w:br/>
+            </w:r>
+            <w:r>
+              <w:rPr>
+                <w:rStyle w:val="NormalTok"/>
+              </w:rPr>
+              <w:t xml:space="preserve">        </w:t>
+            </w:r>
+            <w:r>
+              <w:rPr>
+                <w:rStyle w:val="AttributeTok"/>
+              </w:rPr>
+              <w:t xml:space="preserve">distribution =</w:t>
+            </w:r>
+            <w:r>
+              <w:rPr>
+                <w:rStyle w:val="NormalTok"/>
+              </w:rPr>
+              <w:t xml:space="preserve"> </w:t>
+            </w:r>
+            <w:r>
+              <w:rPr>
+                <w:rStyle w:val="StringTok"/>
+              </w:rPr>
+              <w:t xml:space="preserve">"posterior"</w:t>
+            </w:r>
+            <w:r>
+              <w:rPr>
+                <w:rStyle w:val="NormalTok"/>
+              </w:rPr>
+              <w:t xml:space="preserve">,</w:t>
+            </w:r>
+            <w:r>
+              <w:br/>
+            </w:r>
+            <w:r>
+              <w:rPr>
+                <w:rStyle w:val="NormalTok"/>
+              </w:rPr>
+              <w:t xml:space="preserve">        </w:t>
+            </w:r>
+            <w:r>
+              <w:rPr>
+                <w:rStyle w:val="AttributeTok"/>
+              </w:rPr>
+              <w:t xml:space="preserve">density =</w:t>
+            </w:r>
+            <w:r>
+              <w:rPr>
+                <w:rStyle w:val="NormalTok"/>
+              </w:rPr>
+              <w:t xml:space="preserve"> stats</w:t>
+            </w:r>
+            <w:r>
+              <w:rPr>
+                <w:rStyle w:val="SpecialCharTok"/>
+              </w:rPr>
+              <w:t xml:space="preserve">::</w:t>
+            </w:r>
+            <w:r>
+              <w:rPr>
+                <w:rStyle w:val="FunctionTok"/>
+              </w:rPr>
+              <w:t xml:space="preserve">dbeta</w:t>
+            </w:r>
+            <w:r>
+              <w:rPr>
+                <w:rStyle w:val="NormalTok"/>
+              </w:rPr>
+              <w:t xml:space="preserve">(</w:t>
+            </w:r>
+            <w:r>
+              <w:br/>
+            </w:r>
+            <w:r>
+              <w:rPr>
+                <w:rStyle w:val="NormalTok"/>
+              </w:rPr>
+              <w:t xml:space="preserve">          prob_grid,</w:t>
+            </w:r>
+            <w:r>
+              <w:br/>
+            </w:r>
+            <w:r>
+              <w:rPr>
+                <w:rStyle w:val="NormalTok"/>
+              </w:rPr>
+              <w:t xml:space="preserve">          post_params[data_set, </w:t>
+            </w:r>
+            <w:r>
+              <w:rPr>
+                <w:rStyle w:val="StringTok"/>
+              </w:rPr>
+              <w:t xml:space="preserve">"a"</w:t>
+            </w:r>
+            <w:r>
+              <w:rPr>
+                <w:rStyle w:val="NormalTok"/>
+              </w:rPr>
+              <w:t xml:space="preserve">],</w:t>
+            </w:r>
+            <w:r>
+              <w:br/>
+            </w:r>
+            <w:r>
+              <w:rPr>
+                <w:rStyle w:val="NormalTok"/>
+              </w:rPr>
+              <w:t xml:space="preserve">          post_params[data_set, </w:t>
+            </w:r>
+            <w:r>
+              <w:rPr>
+                <w:rStyle w:val="StringTok"/>
+              </w:rPr>
+              <w:t xml:space="preserve">"b"</w:t>
+            </w:r>
+            <w:r>
+              <w:rPr>
+                <w:rStyle w:val="NormalTok"/>
+              </w:rPr>
+              <w:t xml:space="preserve">]</w:t>
+            </w:r>
+            <w:r>
+              <w:br/>
+            </w:r>
+            <w:r>
+              <w:rPr>
+                <w:rStyle w:val="NormalTok"/>
+              </w:rPr>
+              <w:t xml:space="preserve">        )</w:t>
+            </w:r>
+            <w:r>
+              <w:br/>
+            </w:r>
+            <w:r>
+              <w:rPr>
+                <w:rStyle w:val="NormalTok"/>
+              </w:rPr>
+              <w:t xml:space="preserve">      )</w:t>
+            </w:r>
+            <w:r>
+              <w:br/>
+            </w:r>
+            <w:r>
+              <w:rPr>
+                <w:rStyle w:val="NormalTok"/>
+              </w:rPr>
+              <w:t xml:space="preserve">    )</w:t>
+            </w:r>
+            <w:r>
+              <w:br/>
+            </w:r>
+            <w:r>
+              <w:rPr>
+                <w:rStyle w:val="NormalTok"/>
+              </w:rPr>
+              <w:t xml:space="preserve">  })</w:t>
+            </w:r>
+            <w:r>
+              <w:br/>
+            </w:r>
+            <w:r>
+              <w:rPr>
+                <w:rStyle w:val="NormalTok"/>
+              </w:rPr>
+              <w:t xml:space="preserve">)</w:t>
+            </w:r>
+            <w:r>
+              <w:br/>
+            </w:r>
+            <w:r>
+              <w:rPr>
+                <w:rStyle w:val="NormalTok"/>
+              </w:rPr>
+              <w:t xml:space="preserve">density_curves</w:t>
+            </w:r>
+            <w:r>
+              <w:rPr>
+                <w:rStyle w:val="SpecialCharTok"/>
+              </w:rPr>
+              <w:t xml:space="preserve">$</w:t>
+            </w:r>
+            <w:r>
+              <w:rPr>
+                <w:rStyle w:val="NormalTok"/>
+              </w:rPr>
+              <w:t xml:space="preserve">data_set </w:t>
+            </w:r>
+            <w:r>
+              <w:rPr>
+                <w:rStyle w:val="OtherTok"/>
+              </w:rPr>
+              <w:t xml:space="preserve">&lt;-</w:t>
+            </w:r>
+            <w:r>
+              <w:rPr>
+                <w:rStyle w:val="NormalTok"/>
+              </w:rPr>
+              <w:t xml:space="preserve"> </w:t>
+            </w:r>
+            <w:r>
+              <w:rPr>
+                <w:rStyle w:val="FunctionTok"/>
+              </w:rPr>
+              <w:t xml:space="preserve">factor</w:t>
+            </w:r>
+            <w:r>
+              <w:rPr>
+                <w:rStyle w:val="NormalTok"/>
+              </w:rPr>
+              <w:t xml:space="preserve">(</w:t>
+            </w:r>
+            <w:r>
+              <w:br/>
+            </w:r>
+            <w:r>
+              <w:rPr>
+                <w:rStyle w:val="NormalTok"/>
+              </w:rPr>
+              <w:t xml:space="preserve">  density_curves</w:t>
+            </w:r>
+            <w:r>
+              <w:rPr>
+                <w:rStyle w:val="SpecialCharTok"/>
+              </w:rPr>
+              <w:t xml:space="preserve">$</w:t>
+            </w:r>
+            <w:r>
+              <w:rPr>
+                <w:rStyle w:val="NormalTok"/>
+              </w:rPr>
+              <w:t xml:space="preserve">data_set,</w:t>
+            </w:r>
+            <w:r>
+              <w:br/>
+            </w:r>
+            <w:r>
+              <w:rPr>
+                <w:rStyle w:val="NormalTok"/>
+              </w:rPr>
               <w:t xml:space="preserve">  </w:t>
             </w:r>
             <w:r>
               <w:rPr>
+                <w:rStyle w:val="AttributeTok"/>
+              </w:rPr>
+              <w:t xml:space="preserve">levels =</w:t>
+            </w:r>
+            <w:r>
+              <w:rPr>
+                <w:rStyle w:val="NormalTok"/>
+              </w:rPr>
+              <w:t xml:space="preserve"> </w:t>
+            </w:r>
+            <w:r>
+              <w:rPr>
                 <w:rStyle w:val="FunctionTok"/>
               </w:rPr>
-              <w:t xml:space="preserve">lapply</w:t>
+              <w:t xml:space="preserve">rownames</w:t>
             </w:r>
             <w:r>
               <w:rPr>
                 <w:rStyle w:val="NormalTok"/>
               </w:rPr>
+              <w:t xml:space="preserve">(post_params)</w:t>
+            </w:r>
+            <w:r>
+              <w:br/>
+            </w:r>
+            <w:r>
+              <w:rPr>
+                <w:rStyle w:val="NormalTok"/>
+              </w:rPr>
+              <w:t xml:space="preserve">)</w:t>
+            </w:r>
+            <w:r>
+              <w:br/>
+            </w:r>
+            <w:r>
+              <w:rPr>
+                <w:rStyle w:val="NormalTok"/>
+              </w:rPr>
+              <w:t xml:space="preserve">density_curves</w:t>
+            </w:r>
+            <w:r>
+              <w:rPr>
+                <w:rStyle w:val="SpecialCharTok"/>
+              </w:rPr>
+              <w:t xml:space="preserve">$</w:t>
+            </w:r>
+            <w:r>
+              <w:rPr>
+                <w:rStyle w:val="NormalTok"/>
+              </w:rPr>
+              <w:t xml:space="preserve">distribution </w:t>
+            </w:r>
+            <w:r>
+              <w:rPr>
+                <w:rStyle w:val="OtherTok"/>
+              </w:rPr>
+              <w:t xml:space="preserve">&lt;-</w:t>
+            </w:r>
+            <w:r>
+              <w:rPr>
+                <w:rStyle w:val="NormalTok"/>
+              </w:rPr>
+              <w:t xml:space="preserve"> </w:t>
+            </w:r>
+            <w:r>
+              <w:rPr>
+                <w:rStyle w:val="FunctionTok"/>
+              </w:rPr>
+              <w:t xml:space="preserve">factor</w:t>
+            </w:r>
+            <w:r>
+              <w:rPr>
+                <w:rStyle w:val="NormalTok"/>
+              </w:rPr>
               <w:t xml:space="preserve">(</w:t>
             </w:r>
             <w:r>
+              <w:br/>
+            </w:r>
+            <w:r>
+              <w:rPr>
+                <w:rStyle w:val="NormalTok"/>
+              </w:rPr>
+              <w:t xml:space="preserve">  density_curves</w:t>
+            </w:r>
+            <w:r>
+              <w:rPr>
+                <w:rStyle w:val="SpecialCharTok"/>
+              </w:rPr>
+              <w:t xml:space="preserve">$</w:t>
+            </w:r>
+            <w:r>
+              <w:rPr>
+                <w:rStyle w:val="NormalTok"/>
+              </w:rPr>
+              <w:t xml:space="preserve">distribution,</w:t>
+            </w:r>
+            <w:r>
+              <w:br/>
+            </w:r>
+            <w:r>
+              <w:rPr>
+                <w:rStyle w:val="NormalTok"/>
+              </w:rPr>
+              <w:t xml:space="preserve">  </w:t>
+            </w:r>
+            <w:r>
+              <w:rPr>
+                <w:rStyle w:val="AttributeTok"/>
+              </w:rPr>
+              <w:t xml:space="preserve">levels =</w:t>
+            </w:r>
+            <w:r>
+              <w:rPr>
+                <w:rStyle w:val="NormalTok"/>
+              </w:rPr>
+              <w:t xml:space="preserve"> </w:t>
+            </w:r>
+            <w:r>
               <w:rPr>
                 <w:rStyle w:val="FunctionTok"/>
               </w:rPr>
-              <w:t xml:space="preserve">rownames</w:t>
+              <w:t xml:space="preserve">c</w:t>
             </w:r>
             <w:r>
               <w:rPr>
                 <w:rStyle w:val="NormalTok"/>
               </w:rPr>
-              <w:t xml:space="preserve">(post_params), \(data_set) {</w:t>
+              <w:t xml:space="preserve">(</w:t>
+            </w:r>
+            <w:r>
+              <w:rPr>
+                <w:rStyle w:val="StringTok"/>
+              </w:rPr>
+              <w:t xml:space="preserve">"prior"</w:t>
+            </w:r>
+            <w:r>
+              <w:rPr>
+                <w:rStyle w:val="NormalTok"/>
+              </w:rPr>
+              <w:t xml:space="preserve">, </w:t>
+            </w:r>
+            <w:r>
+              <w:rPr>
+                <w:rStyle w:val="StringTok"/>
+              </w:rPr>
+              <w:t xml:space="preserve">"posterior"</w:t>
+            </w:r>
+            <w:r>
+              <w:rPr>
+                <w:rStyle w:val="NormalTok"/>
+              </w:rPr>
+              <w:t xml:space="preserve">)</w:t>
             </w:r>
             <w:r>
               <w:br/>
@@ -25361,850 +26003,229 @@
               <w:rPr>
                 <w:rStyle w:val="NormalTok"/>
               </w:rPr>
+              <w:t xml:space="preserve">)</w:t>
+            </w:r>
+            <w:r>
+              <w:br/>
+            </w:r>
+            <w:r>
+              <w:br/>
+            </w:r>
+            <w:r>
+              <w:rPr>
+                <w:rStyle w:val="NormalTok"/>
+              </w:rPr>
+              <w:t xml:space="preserve">ggplot2</w:t>
+            </w:r>
+            <w:r>
+              <w:rPr>
+                <w:rStyle w:val="SpecialCharTok"/>
+              </w:rPr>
+              <w:t xml:space="preserve">::</w:t>
+            </w:r>
+            <w:r>
+              <w:rPr>
+                <w:rStyle w:val="FunctionTok"/>
+              </w:rPr>
+              <w:t xml:space="preserve">ggplot</w:t>
+            </w:r>
+            <w:r>
+              <w:rPr>
+                <w:rStyle w:val="NormalTok"/>
+              </w:rPr>
+              <w:t xml:space="preserve">(</w:t>
+            </w:r>
+            <w:r>
+              <w:br/>
+            </w:r>
+            <w:r>
+              <w:rPr>
+                <w:rStyle w:val="NormalTok"/>
+              </w:rPr>
+              <w:t xml:space="preserve">  density_curves,</w:t>
+            </w:r>
+            <w:r>
+              <w:br/>
+            </w:r>
+            <w:r>
+              <w:rPr>
+                <w:rStyle w:val="NormalTok"/>
+              </w:rPr>
+              <w:t xml:space="preserve">  ggplot2</w:t>
+            </w:r>
+            <w:r>
+              <w:rPr>
+                <w:rStyle w:val="SpecialCharTok"/>
+              </w:rPr>
+              <w:t xml:space="preserve">::</w:t>
+            </w:r>
+            <w:r>
+              <w:rPr>
+                <w:rStyle w:val="FunctionTok"/>
+              </w:rPr>
+              <w:t xml:space="preserve">aes</w:t>
+            </w:r>
+            <w:r>
+              <w:rPr>
+                <w:rStyle w:val="NormalTok"/>
+              </w:rPr>
+              <w:t xml:space="preserve">(prob, density, </w:t>
+            </w:r>
+            <w:r>
+              <w:rPr>
+                <w:rStyle w:val="AttributeTok"/>
+              </w:rPr>
+              <w:t xml:space="preserve">colour =</w:t>
+            </w:r>
+            <w:r>
+              <w:rPr>
+                <w:rStyle w:val="NormalTok"/>
+              </w:rPr>
+              <w:t xml:space="preserve"> distribution, </w:t>
+            </w:r>
+            <w:r>
+              <w:rPr>
+                <w:rStyle w:val="AttributeTok"/>
+              </w:rPr>
+              <w:t xml:space="preserve">linetype =</w:t>
+            </w:r>
+            <w:r>
+              <w:rPr>
+                <w:rStyle w:val="NormalTok"/>
+              </w:rPr>
+              <w:t xml:space="preserve"> distribution)</w:t>
+            </w:r>
+            <w:r>
+              <w:br/>
+            </w:r>
+            <w:r>
+              <w:rPr>
+                <w:rStyle w:val="NormalTok"/>
+              </w:rPr>
+              <w:t xml:space="preserve">) </w:t>
+            </w:r>
+            <w:r>
+              <w:rPr>
+                <w:rStyle w:val="SpecialCharTok"/>
+              </w:rPr>
+              <w:t xml:space="preserve">+</w:t>
+            </w:r>
+            <w:r>
+              <w:br/>
+            </w:r>
+            <w:r>
+              <w:rPr>
+                <w:rStyle w:val="NormalTok"/>
+              </w:rPr>
+              <w:t xml:space="preserve">  ggplot2</w:t>
+            </w:r>
+            <w:r>
+              <w:rPr>
+                <w:rStyle w:val="SpecialCharTok"/>
+              </w:rPr>
+              <w:t xml:space="preserve">::</w:t>
+            </w:r>
+            <w:r>
+              <w:rPr>
+                <w:rStyle w:val="FunctionTok"/>
+              </w:rPr>
+              <w:t xml:space="preserve">geom_line</w:t>
+            </w:r>
+            <w:r>
+              <w:rPr>
+                <w:rStyle w:val="NormalTok"/>
+              </w:rPr>
+              <w:t xml:space="preserve">(</w:t>
+            </w:r>
+            <w:r>
+              <w:rPr>
+                <w:rStyle w:val="AttributeTok"/>
+              </w:rPr>
+              <w:t xml:space="preserve">linewidth =</w:t>
+            </w:r>
+            <w:r>
+              <w:rPr>
+                <w:rStyle w:val="NormalTok"/>
+              </w:rPr>
+              <w:t xml:space="preserve"> </w:t>
+            </w:r>
+            <w:r>
+              <w:rPr>
+                <w:rStyle w:val="FloatTok"/>
+              </w:rPr>
+              <w:t xml:space="preserve">0.8</w:t>
+            </w:r>
+            <w:r>
+              <w:rPr>
+                <w:rStyle w:val="NormalTok"/>
+              </w:rPr>
+              <w:t xml:space="preserve">) </w:t>
+            </w:r>
+            <w:r>
+              <w:rPr>
+                <w:rStyle w:val="SpecialCharTok"/>
+              </w:rPr>
+              <w:t xml:space="preserve">+</w:t>
+            </w:r>
+            <w:r>
+              <w:br/>
+            </w:r>
+            <w:r>
+              <w:rPr>
+                <w:rStyle w:val="NormalTok"/>
+              </w:rPr>
+              <w:t xml:space="preserve">  ggplot2</w:t>
+            </w:r>
+            <w:r>
+              <w:rPr>
+                <w:rStyle w:val="SpecialCharTok"/>
+              </w:rPr>
+              <w:t xml:space="preserve">::</w:t>
+            </w:r>
+            <w:r>
+              <w:rPr>
+                <w:rStyle w:val="FunctionTok"/>
+              </w:rPr>
+              <w:t xml:space="preserve">geom_vline</w:t>
+            </w:r>
+            <w:r>
+              <w:rPr>
+                <w:rStyle w:val="NormalTok"/>
+              </w:rPr>
+              <w:t xml:space="preserve">(</w:t>
+            </w:r>
+            <w:r>
+              <w:br/>
+            </w:r>
+            <w:r>
+              <w:rPr>
+                <w:rStyle w:val="NormalTok"/>
+              </w:rPr>
               <w:t xml:space="preserve">    </w:t>
             </w:r>
             <w:r>
               <w:rPr>
+                <w:rStyle w:val="AttributeTok"/>
+              </w:rPr>
+              <w:t xml:space="preserve">data =</w:t>
+            </w:r>
+            <w:r>
+              <w:rPr>
+                <w:rStyle w:val="NormalTok"/>
+              </w:rPr>
+              <w:t xml:space="preserve"> tibble</w:t>
+            </w:r>
+            <w:r>
+              <w:rPr>
+                <w:rStyle w:val="SpecialCharTok"/>
+              </w:rPr>
+              <w:t xml:space="preserve">::</w:t>
+            </w:r>
+            <w:r>
+              <w:rPr>
                 <w:rStyle w:val="FunctionTok"/>
               </w:rPr>
-              <w:t xml:space="preserve">rbind</w:t>
-            </w:r>
-            <w:r>
-              <w:rPr>
-                <w:rStyle w:val="NormalTok"/>
-              </w:rPr>
-              <w:t xml:space="preserve">(</w:t>
-            </w:r>
-            <w:r>
-              <w:br/>
-            </w:r>
-            <w:r>
-              <w:rPr>
-                <w:rStyle w:val="NormalTok"/>
-              </w:rPr>
-              <w:t xml:space="preserve">      </w:t>
-            </w:r>
-            <w:r>
-              <w:rPr>
-                <w:rStyle w:val="FunctionTok"/>
-              </w:rPr>
-              <w:t xml:space="preserve">data.frame</w:t>
-            </w:r>
-            <w:r>
-              <w:rPr>
-                <w:rStyle w:val="NormalTok"/>
-              </w:rPr>
-              <w:t xml:space="preserve">(</w:t>
-            </w:r>
-            <w:r>
-              <w:br/>
-            </w:r>
-            <w:r>
-              <w:rPr>
-                <w:rStyle w:val="NormalTok"/>
-              </w:rPr>
-              <w:t xml:space="preserve">        </w:t>
-            </w:r>
-            <w:r>
-              <w:rPr>
-                <w:rStyle w:val="AttributeTok"/>
-              </w:rPr>
-              <w:t xml:space="preserve">data_set =</w:t>
-            </w:r>
-            <w:r>
-              <w:rPr>
-                <w:rStyle w:val="NormalTok"/>
-              </w:rPr>
-              <w:t xml:space="preserve"> data_set,</w:t>
-            </w:r>
-            <w:r>
-              <w:br/>
-            </w:r>
-            <w:r>
-              <w:rPr>
-                <w:rStyle w:val="NormalTok"/>
-              </w:rPr>
-              <w:t xml:space="preserve">        </w:t>
-            </w:r>
-            <w:r>
-              <w:rPr>
-                <w:rStyle w:val="AttributeTok"/>
-              </w:rPr>
-              <w:t xml:space="preserve">prob =</w:t>
-            </w:r>
-            <w:r>
-              <w:rPr>
-                <w:rStyle w:val="NormalTok"/>
-              </w:rPr>
-              <w:t xml:space="preserve"> prob_grid,</w:t>
-            </w:r>
-            <w:r>
-              <w:br/>
-            </w:r>
-            <w:r>
-              <w:rPr>
-                <w:rStyle w:val="NormalTok"/>
-              </w:rPr>
-              <w:t xml:space="preserve">        </w:t>
-            </w:r>
-            <w:r>
-              <w:rPr>
-                <w:rStyle w:val="AttributeTok"/>
-              </w:rPr>
-              <w:t xml:space="preserve">distribution =</w:t>
-            </w:r>
-            <w:r>
-              <w:rPr>
-                <w:rStyle w:val="NormalTok"/>
-              </w:rPr>
-              <w:t xml:space="preserve"> </w:t>
-            </w:r>
-            <w:r>
-              <w:rPr>
-                <w:rStyle w:val="StringTok"/>
-              </w:rPr>
-              <w:t xml:space="preserve">"prior"</w:t>
-            </w:r>
-            <w:r>
-              <w:rPr>
-                <w:rStyle w:val="NormalTok"/>
-              </w:rPr>
-              <w:t xml:space="preserve">,</w:t>
-            </w:r>
-            <w:r>
-              <w:br/>
-            </w:r>
-            <w:r>
-              <w:rPr>
-                <w:rStyle w:val="NormalTok"/>
-              </w:rPr>
-              <w:t xml:space="preserve">        </w:t>
-            </w:r>
-            <w:r>
-              <w:rPr>
-                <w:rStyle w:val="AttributeTok"/>
-              </w:rPr>
-              <w:t xml:space="preserve">density =</w:t>
-            </w:r>
-            <w:r>
-              <w:rPr>
-                <w:rStyle w:val="NormalTok"/>
-              </w:rPr>
-              <w:t xml:space="preserve"> stats</w:t>
-            </w:r>
-            <w:r>
-              <w:rPr>
-                <w:rStyle w:val="SpecialCharTok"/>
-              </w:rPr>
-              <w:t xml:space="preserve">::</w:t>
-            </w:r>
-            <w:r>
-              <w:rPr>
-                <w:rStyle w:val="FunctionTok"/>
-              </w:rPr>
-              <w:t xml:space="preserve">dbeta</w:t>
-            </w:r>
-            <w:r>
-              <w:rPr>
-                <w:rStyle w:val="NormalTok"/>
-              </w:rPr>
-              <w:t xml:space="preserve">(prob_grid, prior_a, prior_b)</w:t>
-            </w:r>
-            <w:r>
-              <w:br/>
-            </w:r>
-            <w:r>
-              <w:rPr>
-                <w:rStyle w:val="NormalTok"/>
-              </w:rPr>
-              <w:t xml:space="preserve">      ),</w:t>
-            </w:r>
-            <w:r>
-              <w:br/>
-            </w:r>
-            <w:r>
-              <w:rPr>
-                <w:rStyle w:val="NormalTok"/>
-              </w:rPr>
-              <w:t xml:space="preserve">      </w:t>
-            </w:r>
-            <w:r>
-              <w:rPr>
-                <w:rStyle w:val="FunctionTok"/>
-              </w:rPr>
-              <w:t xml:space="preserve">data.frame</w:t>
-            </w:r>
-            <w:r>
-              <w:rPr>
-                <w:rStyle w:val="NormalTok"/>
-              </w:rPr>
-              <w:t xml:space="preserve">(</w:t>
-            </w:r>
-            <w:r>
-              <w:br/>
-            </w:r>
-            <w:r>
-              <w:rPr>
-                <w:rStyle w:val="NormalTok"/>
-              </w:rPr>
-              <w:t xml:space="preserve">        </w:t>
-            </w:r>
-            <w:r>
-              <w:rPr>
-                <w:rStyle w:val="AttributeTok"/>
-              </w:rPr>
-              <w:t xml:space="preserve">data_set =</w:t>
-            </w:r>
-            <w:r>
-              <w:rPr>
-                <w:rStyle w:val="NormalTok"/>
-              </w:rPr>
-              <w:t xml:space="preserve"> data_set,</w:t>
-            </w:r>
-            <w:r>
-              <w:br/>
-            </w:r>
-            <w:r>
-              <w:rPr>
-                <w:rStyle w:val="NormalTok"/>
-              </w:rPr>
-              <w:t xml:space="preserve">        </w:t>
-            </w:r>
-            <w:r>
-              <w:rPr>
-                <w:rStyle w:val="AttributeTok"/>
-              </w:rPr>
-              <w:t xml:space="preserve">prob =</w:t>
-            </w:r>
-            <w:r>
-              <w:rPr>
-                <w:rStyle w:val="NormalTok"/>
-              </w:rPr>
-              <w:t xml:space="preserve"> prob_grid,</w:t>
-            </w:r>
-            <w:r>
-              <w:br/>
-            </w:r>
-            <w:r>
-              <w:rPr>
-                <w:rStyle w:val="NormalTok"/>
-              </w:rPr>
-              <w:t xml:space="preserve">        </w:t>
-            </w:r>
-            <w:r>
-              <w:rPr>
-                <w:rStyle w:val="AttributeTok"/>
-              </w:rPr>
-              <w:t xml:space="preserve">distribution =</w:t>
-            </w:r>
-            <w:r>
-              <w:rPr>
-                <w:rStyle w:val="NormalTok"/>
-              </w:rPr>
-              <w:t xml:space="preserve"> </w:t>
-            </w:r>
-            <w:r>
-              <w:rPr>
-                <w:rStyle w:val="StringTok"/>
-              </w:rPr>
-              <w:t xml:space="preserve">"posterior"</w:t>
-            </w:r>
-            <w:r>
-              <w:rPr>
-                <w:rStyle w:val="NormalTok"/>
-              </w:rPr>
-              <w:t xml:space="preserve">,</w:t>
-            </w:r>
-            <w:r>
-              <w:br/>
-            </w:r>
-            <w:r>
-              <w:rPr>
-                <w:rStyle w:val="NormalTok"/>
-              </w:rPr>
-              <w:t xml:space="preserve">        </w:t>
-            </w:r>
-            <w:r>
-              <w:rPr>
-                <w:rStyle w:val="AttributeTok"/>
-              </w:rPr>
-              <w:t xml:space="preserve">density =</w:t>
-            </w:r>
-            <w:r>
-              <w:rPr>
-                <w:rStyle w:val="NormalTok"/>
-              </w:rPr>
-              <w:t xml:space="preserve"> stats</w:t>
-            </w:r>
-            <w:r>
-              <w:rPr>
-                <w:rStyle w:val="SpecialCharTok"/>
-              </w:rPr>
-              <w:t xml:space="preserve">::</w:t>
-            </w:r>
-            <w:r>
-              <w:rPr>
-                <w:rStyle w:val="FunctionTok"/>
-              </w:rPr>
-              <w:t xml:space="preserve">dbeta</w:t>
-            </w:r>
-            <w:r>
-              <w:rPr>
-                <w:rStyle w:val="NormalTok"/>
-              </w:rPr>
-              <w:t xml:space="preserve">(</w:t>
-            </w:r>
-            <w:r>
-              <w:br/>
-            </w:r>
-            <w:r>
-              <w:rPr>
-                <w:rStyle w:val="NormalTok"/>
-              </w:rPr>
-              <w:t xml:space="preserve">          prob_grid,</w:t>
-            </w:r>
-            <w:r>
-              <w:br/>
-            </w:r>
-            <w:r>
-              <w:rPr>
-                <w:rStyle w:val="NormalTok"/>
-              </w:rPr>
-              <w:t xml:space="preserve">          post_params[data_set, </w:t>
-            </w:r>
-            <w:r>
-              <w:rPr>
-                <w:rStyle w:val="StringTok"/>
-              </w:rPr>
-              <w:t xml:space="preserve">"a"</w:t>
-            </w:r>
-            <w:r>
-              <w:rPr>
-                <w:rStyle w:val="NormalTok"/>
-              </w:rPr>
-              <w:t xml:space="preserve">],</w:t>
-            </w:r>
-            <w:r>
-              <w:br/>
-            </w:r>
-            <w:r>
-              <w:rPr>
-                <w:rStyle w:val="NormalTok"/>
-              </w:rPr>
-              <w:t xml:space="preserve">          post_params[data_set, </w:t>
-            </w:r>
-            <w:r>
-              <w:rPr>
-                <w:rStyle w:val="StringTok"/>
-              </w:rPr>
-              <w:t xml:space="preserve">"b"</w:t>
-            </w:r>
-            <w:r>
-              <w:rPr>
-                <w:rStyle w:val="NormalTok"/>
-              </w:rPr>
-              <w:t xml:space="preserve">]</w:t>
-            </w:r>
-            <w:r>
-              <w:br/>
-            </w:r>
-            <w:r>
-              <w:rPr>
-                <w:rStyle w:val="NormalTok"/>
-              </w:rPr>
-              <w:t xml:space="preserve">        )</w:t>
-            </w:r>
-            <w:r>
-              <w:br/>
-            </w:r>
-            <w:r>
-              <w:rPr>
-                <w:rStyle w:val="NormalTok"/>
-              </w:rPr>
-              <w:t xml:space="preserve">      )</w:t>
-            </w:r>
-            <w:r>
-              <w:br/>
-            </w:r>
-            <w:r>
-              <w:rPr>
-                <w:rStyle w:val="NormalTok"/>
-              </w:rPr>
-              <w:t xml:space="preserve">    )</w:t>
-            </w:r>
-            <w:r>
-              <w:br/>
-            </w:r>
-            <w:r>
-              <w:rPr>
-                <w:rStyle w:val="NormalTok"/>
-              </w:rPr>
-              <w:t xml:space="preserve">  })</w:t>
-            </w:r>
-            <w:r>
-              <w:br/>
-            </w:r>
-            <w:r>
-              <w:rPr>
-                <w:rStyle w:val="NormalTok"/>
-              </w:rPr>
-              <w:t xml:space="preserve">)</w:t>
-            </w:r>
-            <w:r>
-              <w:br/>
-            </w:r>
-            <w:r>
-              <w:rPr>
-                <w:rStyle w:val="NormalTok"/>
-              </w:rPr>
-              <w:t xml:space="preserve">density_curves</w:t>
-            </w:r>
-            <w:r>
-              <w:rPr>
-                <w:rStyle w:val="SpecialCharTok"/>
-              </w:rPr>
-              <w:t xml:space="preserve">$</w:t>
-            </w:r>
-            <w:r>
-              <w:rPr>
-                <w:rStyle w:val="NormalTok"/>
-              </w:rPr>
-              <w:t xml:space="preserve">data_set </w:t>
-            </w:r>
-            <w:r>
-              <w:rPr>
-                <w:rStyle w:val="OtherTok"/>
-              </w:rPr>
-              <w:t xml:space="preserve">&lt;-</w:t>
-            </w:r>
-            <w:r>
-              <w:rPr>
-                <w:rStyle w:val="NormalTok"/>
-              </w:rPr>
-              <w:t xml:space="preserve"> </w:t>
-            </w:r>
-            <w:r>
-              <w:rPr>
-                <w:rStyle w:val="FunctionTok"/>
-              </w:rPr>
-              <w:t xml:space="preserve">factor</w:t>
-            </w:r>
-            <w:r>
-              <w:rPr>
-                <w:rStyle w:val="NormalTok"/>
-              </w:rPr>
-              <w:t xml:space="preserve">(</w:t>
-            </w:r>
-            <w:r>
-              <w:br/>
-            </w:r>
-            <w:r>
-              <w:rPr>
-                <w:rStyle w:val="NormalTok"/>
-              </w:rPr>
-              <w:t xml:space="preserve">  density_curves</w:t>
-            </w:r>
-            <w:r>
-              <w:rPr>
-                <w:rStyle w:val="SpecialCharTok"/>
-              </w:rPr>
-              <w:t xml:space="preserve">$</w:t>
-            </w:r>
-            <w:r>
-              <w:rPr>
-                <w:rStyle w:val="NormalTok"/>
-              </w:rPr>
-              <w:t xml:space="preserve">data_set,</w:t>
-            </w:r>
-            <w:r>
-              <w:br/>
-            </w:r>
-            <w:r>
-              <w:rPr>
-                <w:rStyle w:val="NormalTok"/>
-              </w:rPr>
-              <w:t xml:space="preserve">  </w:t>
-            </w:r>
-            <w:r>
-              <w:rPr>
-                <w:rStyle w:val="AttributeTok"/>
-              </w:rPr>
-              <w:t xml:space="preserve">levels =</w:t>
-            </w:r>
-            <w:r>
-              <w:rPr>
-                <w:rStyle w:val="NormalTok"/>
-              </w:rPr>
-              <w:t xml:space="preserve"> </w:t>
-            </w:r>
-            <w:r>
-              <w:rPr>
-                <w:rStyle w:val="FunctionTok"/>
-              </w:rPr>
-              <w:t xml:space="preserve">rownames</w:t>
-            </w:r>
-            <w:r>
-              <w:rPr>
-                <w:rStyle w:val="NormalTok"/>
-              </w:rPr>
-              <w:t xml:space="preserve">(post_params)</w:t>
-            </w:r>
-            <w:r>
-              <w:br/>
-            </w:r>
-            <w:r>
-              <w:rPr>
-                <w:rStyle w:val="NormalTok"/>
-              </w:rPr>
-              <w:t xml:space="preserve">)</w:t>
-            </w:r>
-            <w:r>
-              <w:br/>
-            </w:r>
-            <w:r>
-              <w:rPr>
-                <w:rStyle w:val="NormalTok"/>
-              </w:rPr>
-              <w:t xml:space="preserve">density_curves</w:t>
-            </w:r>
-            <w:r>
-              <w:rPr>
-                <w:rStyle w:val="SpecialCharTok"/>
-              </w:rPr>
-              <w:t xml:space="preserve">$</w:t>
-            </w:r>
-            <w:r>
-              <w:rPr>
-                <w:rStyle w:val="NormalTok"/>
-              </w:rPr>
-              <w:t xml:space="preserve">distribution </w:t>
-            </w:r>
-            <w:r>
-              <w:rPr>
-                <w:rStyle w:val="OtherTok"/>
-              </w:rPr>
-              <w:t xml:space="preserve">&lt;-</w:t>
-            </w:r>
-            <w:r>
-              <w:rPr>
-                <w:rStyle w:val="NormalTok"/>
-              </w:rPr>
-              <w:t xml:space="preserve"> </w:t>
-            </w:r>
-            <w:r>
-              <w:rPr>
-                <w:rStyle w:val="FunctionTok"/>
-              </w:rPr>
-              <w:t xml:space="preserve">factor</w:t>
-            </w:r>
-            <w:r>
-              <w:rPr>
-                <w:rStyle w:val="NormalTok"/>
-              </w:rPr>
-              <w:t xml:space="preserve">(</w:t>
-            </w:r>
-            <w:r>
-              <w:br/>
-            </w:r>
-            <w:r>
-              <w:rPr>
-                <w:rStyle w:val="NormalTok"/>
-              </w:rPr>
-              <w:t xml:space="preserve">  density_curves</w:t>
-            </w:r>
-            <w:r>
-              <w:rPr>
-                <w:rStyle w:val="SpecialCharTok"/>
-              </w:rPr>
-              <w:t xml:space="preserve">$</w:t>
-            </w:r>
-            <w:r>
-              <w:rPr>
-                <w:rStyle w:val="NormalTok"/>
-              </w:rPr>
-              <w:t xml:space="preserve">distribution,</w:t>
-            </w:r>
-            <w:r>
-              <w:br/>
-            </w:r>
-            <w:r>
-              <w:rPr>
-                <w:rStyle w:val="NormalTok"/>
-              </w:rPr>
-              <w:t xml:space="preserve">  </w:t>
-            </w:r>
-            <w:r>
-              <w:rPr>
-                <w:rStyle w:val="AttributeTok"/>
-              </w:rPr>
-              <w:t xml:space="preserve">levels =</w:t>
-            </w:r>
-            <w:r>
-              <w:rPr>
-                <w:rStyle w:val="NormalTok"/>
-              </w:rPr>
-              <w:t xml:space="preserve"> </w:t>
-            </w:r>
-            <w:r>
-              <w:rPr>
-                <w:rStyle w:val="FunctionTok"/>
-              </w:rPr>
-              <w:t xml:space="preserve">c</w:t>
-            </w:r>
-            <w:r>
-              <w:rPr>
-                <w:rStyle w:val="NormalTok"/>
-              </w:rPr>
-              <w:t xml:space="preserve">(</w:t>
-            </w:r>
-            <w:r>
-              <w:rPr>
-                <w:rStyle w:val="StringTok"/>
-              </w:rPr>
-              <w:t xml:space="preserve">"prior"</w:t>
-            </w:r>
-            <w:r>
-              <w:rPr>
-                <w:rStyle w:val="NormalTok"/>
-              </w:rPr>
-              <w:t xml:space="preserve">, </w:t>
-            </w:r>
-            <w:r>
-              <w:rPr>
-                <w:rStyle w:val="StringTok"/>
-              </w:rPr>
-              <w:t xml:space="preserve">"posterior"</w:t>
-            </w:r>
-            <w:r>
-              <w:rPr>
-                <w:rStyle w:val="NormalTok"/>
-              </w:rPr>
-              <w:t xml:space="preserve">)</w:t>
-            </w:r>
-            <w:r>
-              <w:br/>
-            </w:r>
-            <w:r>
-              <w:rPr>
-                <w:rStyle w:val="NormalTok"/>
-              </w:rPr>
-              <w:t xml:space="preserve">)</w:t>
-            </w:r>
-            <w:r>
-              <w:br/>
-            </w:r>
-            <w:r>
-              <w:br/>
-            </w:r>
-            <w:r>
-              <w:rPr>
-                <w:rStyle w:val="NormalTok"/>
-              </w:rPr>
-              <w:t xml:space="preserve">ggplot2</w:t>
-            </w:r>
-            <w:r>
-              <w:rPr>
-                <w:rStyle w:val="SpecialCharTok"/>
-              </w:rPr>
-              <w:t xml:space="preserve">::</w:t>
-            </w:r>
-            <w:r>
-              <w:rPr>
-                <w:rStyle w:val="FunctionTok"/>
-              </w:rPr>
-              <w:t xml:space="preserve">ggplot</w:t>
-            </w:r>
-            <w:r>
-              <w:rPr>
-                <w:rStyle w:val="NormalTok"/>
-              </w:rPr>
-              <w:t xml:space="preserve">(</w:t>
-            </w:r>
-            <w:r>
-              <w:br/>
-            </w:r>
-            <w:r>
-              <w:rPr>
-                <w:rStyle w:val="NormalTok"/>
-              </w:rPr>
-              <w:t xml:space="preserve">  density_curves,</w:t>
-            </w:r>
-            <w:r>
-              <w:br/>
-            </w:r>
-            <w:r>
-              <w:rPr>
-                <w:rStyle w:val="NormalTok"/>
-              </w:rPr>
-              <w:t xml:space="preserve">  ggplot2</w:t>
-            </w:r>
-            <w:r>
-              <w:rPr>
-                <w:rStyle w:val="SpecialCharTok"/>
-              </w:rPr>
-              <w:t xml:space="preserve">::</w:t>
-            </w:r>
-            <w:r>
-              <w:rPr>
-                <w:rStyle w:val="FunctionTok"/>
-              </w:rPr>
-              <w:t xml:space="preserve">aes</w:t>
-            </w:r>
-            <w:r>
-              <w:rPr>
-                <w:rStyle w:val="NormalTok"/>
-              </w:rPr>
-              <w:t xml:space="preserve">(prob, density, </w:t>
-            </w:r>
-            <w:r>
-              <w:rPr>
-                <w:rStyle w:val="AttributeTok"/>
-              </w:rPr>
-              <w:t xml:space="preserve">colour =</w:t>
-            </w:r>
-            <w:r>
-              <w:rPr>
-                <w:rStyle w:val="NormalTok"/>
-              </w:rPr>
-              <w:t xml:space="preserve"> distribution, </w:t>
-            </w:r>
-            <w:r>
-              <w:rPr>
-                <w:rStyle w:val="AttributeTok"/>
-              </w:rPr>
-              <w:t xml:space="preserve">linetype =</w:t>
-            </w:r>
-            <w:r>
-              <w:rPr>
-                <w:rStyle w:val="NormalTok"/>
-              </w:rPr>
-              <w:t xml:space="preserve"> distribution)</w:t>
-            </w:r>
-            <w:r>
-              <w:br/>
-            </w:r>
-            <w:r>
-              <w:rPr>
-                <w:rStyle w:val="NormalTok"/>
-              </w:rPr>
-              <w:t xml:space="preserve">) </w:t>
-            </w:r>
-            <w:r>
-              <w:rPr>
-                <w:rStyle w:val="SpecialCharTok"/>
-              </w:rPr>
-              <w:t xml:space="preserve">+</w:t>
-            </w:r>
-            <w:r>
-              <w:br/>
-            </w:r>
-            <w:r>
-              <w:rPr>
-                <w:rStyle w:val="NormalTok"/>
-              </w:rPr>
-              <w:t xml:space="preserve">  ggplot2</w:t>
-            </w:r>
-            <w:r>
-              <w:rPr>
-                <w:rStyle w:val="SpecialCharTok"/>
-              </w:rPr>
-              <w:t xml:space="preserve">::</w:t>
-            </w:r>
-            <w:r>
-              <w:rPr>
-                <w:rStyle w:val="FunctionTok"/>
-              </w:rPr>
-              <w:t xml:space="preserve">geom_line</w:t>
-            </w:r>
-            <w:r>
-              <w:rPr>
-                <w:rStyle w:val="NormalTok"/>
-              </w:rPr>
-              <w:t xml:space="preserve">(</w:t>
-            </w:r>
-            <w:r>
-              <w:rPr>
-                <w:rStyle w:val="AttributeTok"/>
-              </w:rPr>
-              <w:t xml:space="preserve">linewidth =</w:t>
-            </w:r>
-            <w:r>
-              <w:rPr>
-                <w:rStyle w:val="NormalTok"/>
-              </w:rPr>
-              <w:t xml:space="preserve"> </w:t>
-            </w:r>
-            <w:r>
-              <w:rPr>
-                <w:rStyle w:val="FloatTok"/>
-              </w:rPr>
-              <w:t xml:space="preserve">0.8</w:t>
-            </w:r>
-            <w:r>
-              <w:rPr>
-                <w:rStyle w:val="NormalTok"/>
-              </w:rPr>
-              <w:t xml:space="preserve">) </w:t>
-            </w:r>
-            <w:r>
-              <w:rPr>
-                <w:rStyle w:val="SpecialCharTok"/>
-              </w:rPr>
-              <w:t xml:space="preserve">+</w:t>
-            </w:r>
-            <w:r>
-              <w:br/>
-            </w:r>
-            <w:r>
-              <w:rPr>
-                <w:rStyle w:val="NormalTok"/>
-              </w:rPr>
-              <w:t xml:space="preserve">  ggplot2</w:t>
-            </w:r>
-            <w:r>
-              <w:rPr>
-                <w:rStyle w:val="SpecialCharTok"/>
-              </w:rPr>
-              <w:t xml:space="preserve">::</w:t>
-            </w:r>
-            <w:r>
-              <w:rPr>
-                <w:rStyle w:val="FunctionTok"/>
-              </w:rPr>
-              <w:t xml:space="preserve">geom_vline</w:t>
-            </w:r>
-            <w:r>
-              <w:rPr>
-                <w:rStyle w:val="NormalTok"/>
-              </w:rPr>
-              <w:t xml:space="preserve">(</w:t>
-            </w:r>
-            <w:r>
-              <w:br/>
-            </w:r>
-            <w:r>
-              <w:rPr>
-                <w:rStyle w:val="NormalTok"/>
-              </w:rPr>
-              <w:t xml:space="preserve">    </w:t>
-            </w:r>
-            <w:r>
-              <w:rPr>
-                <w:rStyle w:val="AttributeTok"/>
-              </w:rPr>
-              <w:t xml:space="preserve">data =</w:t>
-            </w:r>
-            <w:r>
-              <w:rPr>
-                <w:rStyle w:val="NormalTok"/>
-              </w:rPr>
-              <w:t xml:space="preserve"> </w:t>
-            </w:r>
-            <w:r>
-              <w:rPr>
-                <w:rStyle w:val="FunctionTok"/>
-              </w:rPr>
-              <w:t xml:space="preserve">data.frame</w:t>
+              <w:t xml:space="preserve">tibble</w:t>
             </w:r>
             <w:r>
               <w:rPr>
@@ -41029,13 +41050,19 @@
         <w:rPr>
           <w:rStyle w:val="NormalTok"/>
         </w:rPr>
-        <w:t xml:space="preserve"> </w:t>
+        <w:t xml:space="preserve"> dplyr</w:t>
+      </w:r>
+      <w:r>
+        <w:rPr>
+          <w:rStyle w:val="SpecialCharTok"/>
+        </w:rPr>
+        <w:t xml:space="preserve">::</w:t>
       </w:r>
       <w:r>
         <w:rPr>
           <w:rStyle w:val="FunctionTok"/>
         </w:rPr>
-        <w:t xml:space="preserve">do.call</w:t>
+        <w:t xml:space="preserve">bind_rows</w:t>
       </w:r>
       <w:r>
         <w:rPr>
@@ -41050,7 +41077,31 @@
         <w:rPr>
           <w:rStyle w:val="NormalTok"/>
         </w:rPr>
-        <w:t xml:space="preserve">  rbind,</w:t>
+        <w:t xml:space="preserve">  </w:t>
+      </w:r>
+      <w:r>
+        <w:rPr>
+          <w:rStyle w:val="FunctionTok"/>
+        </w:rPr>
+        <w:t xml:space="preserve">lapply</w:t>
+      </w:r>
+      <w:r>
+        <w:rPr>
+          <w:rStyle w:val="NormalTok"/>
+        </w:rPr>
+        <w:t xml:space="preserve">(</w:t>
+      </w:r>
+      <w:r>
+        <w:rPr>
+          <w:rStyle w:val="FunctionTok"/>
+        </w:rPr>
+        <w:t xml:space="preserve">names</w:t>
+      </w:r>
+      <w:r>
+        <w:rPr>
+          <w:rStyle w:val="NormalTok"/>
+        </w:rPr>
+        <w:t xml:space="preserve">(check_priors), \(prior_name) {</w:t>
       </w:r>
       <w:r>
         <w:br/>
@@ -41059,13 +41110,52 @@
         <w:rPr>
           <w:rStyle w:val="NormalTok"/>
         </w:rPr>
-        <w:t xml:space="preserve">  </w:t>
+        <w:t xml:space="preserve">    ab </w:t>
+      </w:r>
+      <w:r>
+        <w:rPr>
+          <w:rStyle w:val="OtherTok"/>
+        </w:rPr>
+        <w:t xml:space="preserve">&lt;-</w:t>
+      </w:r>
+      <w:r>
+        <w:rPr>
+          <w:rStyle w:val="NormalTok"/>
+        </w:rPr>
+        <w:t xml:space="preserve"> check_priors[[prior_name]]</w:t>
+      </w:r>
+      <w:r>
+        <w:br/>
+      </w:r>
+      <w:r>
+        <w:rPr>
+          <w:rStyle w:val="NormalTok"/>
+        </w:rPr>
+        <w:t xml:space="preserve">    prob_draws </w:t>
+      </w:r>
+      <w:r>
+        <w:rPr>
+          <w:rStyle w:val="OtherTok"/>
+        </w:rPr>
+        <w:t xml:space="preserve">&lt;-</w:t>
+      </w:r>
+      <w:r>
+        <w:rPr>
+          <w:rStyle w:val="NormalTok"/>
+        </w:rPr>
+        <w:t xml:space="preserve"> stats</w:t>
+      </w:r>
+      <w:r>
+        <w:rPr>
+          <w:rStyle w:val="SpecialCharTok"/>
+        </w:rPr>
+        <w:t xml:space="preserve">::</w:t>
       </w:r>
       <w:r>
         <w:rPr>
           <w:rStyle w:val="FunctionTok"/>
         </w:rPr>
-        <w:t xml:space="preserve">lapply</w:t>
+        <w:t xml:space="preserve">rbeta</w:t>
       </w:r>
       <w:r>
         <w:rPr>
@@ -41075,126 +41165,60 @@
       </w:r>
       <w:r>
         <w:rPr>
+          <w:rStyle w:val="DecValTok"/>
+        </w:rPr>
+        <w:t xml:space="preserve">4000</w:t>
+      </w:r>
+      <w:r>
+        <w:rPr>
+          <w:rStyle w:val="NormalTok"/>
+        </w:rPr>
+        <w:t xml:space="preserve">, ab[[</w:t>
+      </w:r>
+      <w:r>
+        <w:rPr>
+          <w:rStyle w:val="StringTok"/>
+        </w:rPr>
+        <w:t xml:space="preserve">"a"</w:t>
+      </w:r>
+      <w:r>
+        <w:rPr>
+          <w:rStyle w:val="NormalTok"/>
+        </w:rPr>
+        <w:t xml:space="preserve">]], ab[[</w:t>
+      </w:r>
+      <w:r>
+        <w:rPr>
+          <w:rStyle w:val="StringTok"/>
+        </w:rPr>
+        <w:t xml:space="preserve">"b"</w:t>
+      </w:r>
+      <w:r>
+        <w:rPr>
+          <w:rStyle w:val="NormalTok"/>
+        </w:rPr>
+        <w:t xml:space="preserve">]])</w:t>
+      </w:r>
+      <w:r>
+        <w:br/>
+      </w:r>
+      <w:r>
+        <w:rPr>
+          <w:rStyle w:val="NormalTok"/>
+        </w:rPr>
+        <w:t xml:space="preserve">    tibble</w:t>
+      </w:r>
+      <w:r>
+        <w:rPr>
+          <w:rStyle w:val="SpecialCharTok"/>
+        </w:rPr>
+        <w:t xml:space="preserve">::</w:t>
+      </w:r>
+      <w:r>
+        <w:rPr>
           <w:rStyle w:val="FunctionTok"/>
         </w:rPr>
-        <w:t xml:space="preserve">names</w:t>
-      </w:r>
-      <w:r>
-        <w:rPr>
-          <w:rStyle w:val="NormalTok"/>
-        </w:rPr>
-        <w:t xml:space="preserve">(check_priors), \(prior_name) {</w:t>
-      </w:r>
-      <w:r>
-        <w:br/>
-      </w:r>
-      <w:r>
-        <w:rPr>
-          <w:rStyle w:val="NormalTok"/>
-        </w:rPr>
-        <w:t xml:space="preserve">    ab </w:t>
-      </w:r>
-      <w:r>
-        <w:rPr>
-          <w:rStyle w:val="OtherTok"/>
-        </w:rPr>
-        <w:t xml:space="preserve">&lt;-</w:t>
-      </w:r>
-      <w:r>
-        <w:rPr>
-          <w:rStyle w:val="NormalTok"/>
-        </w:rPr>
-        <w:t xml:space="preserve"> check_priors[[prior_name]]</w:t>
-      </w:r>
-      <w:r>
-        <w:br/>
-      </w:r>
-      <w:r>
-        <w:rPr>
-          <w:rStyle w:val="NormalTok"/>
-        </w:rPr>
-        <w:t xml:space="preserve">    prob_draws </w:t>
-      </w:r>
-      <w:r>
-        <w:rPr>
-          <w:rStyle w:val="OtherTok"/>
-        </w:rPr>
-        <w:t xml:space="preserve">&lt;-</w:t>
-      </w:r>
-      <w:r>
-        <w:rPr>
-          <w:rStyle w:val="NormalTok"/>
-        </w:rPr>
-        <w:t xml:space="preserve"> stats</w:t>
-      </w:r>
-      <w:r>
-        <w:rPr>
-          <w:rStyle w:val="SpecialCharTok"/>
-        </w:rPr>
-        <w:t xml:space="preserve">::</w:t>
-      </w:r>
-      <w:r>
-        <w:rPr>
-          <w:rStyle w:val="FunctionTok"/>
-        </w:rPr>
-        <w:t xml:space="preserve">rbeta</w:t>
-      </w:r>
-      <w:r>
-        <w:rPr>
-          <w:rStyle w:val="NormalTok"/>
-        </w:rPr>
-        <w:t xml:space="preserve">(</w:t>
-      </w:r>
-      <w:r>
-        <w:rPr>
-          <w:rStyle w:val="DecValTok"/>
-        </w:rPr>
-        <w:t xml:space="preserve">4000</w:t>
-      </w:r>
-      <w:r>
-        <w:rPr>
-          <w:rStyle w:val="NormalTok"/>
-        </w:rPr>
-        <w:t xml:space="preserve">, ab[[</w:t>
-      </w:r>
-      <w:r>
-        <w:rPr>
-          <w:rStyle w:val="StringTok"/>
-        </w:rPr>
-        <w:t xml:space="preserve">"a"</w:t>
-      </w:r>
-      <w:r>
-        <w:rPr>
-          <w:rStyle w:val="NormalTok"/>
-        </w:rPr>
-        <w:t xml:space="preserve">]], ab[[</w:t>
-      </w:r>
-      <w:r>
-        <w:rPr>
-          <w:rStyle w:val="StringTok"/>
-        </w:rPr>
-        <w:t xml:space="preserve">"b"</w:t>
-      </w:r>
-      <w:r>
-        <w:rPr>
-          <w:rStyle w:val="NormalTok"/>
-        </w:rPr>
-        <w:t xml:space="preserve">]])</w:t>
-      </w:r>
-      <w:r>
-        <w:br/>
-      </w:r>
-      <w:r>
-        <w:rPr>
-          <w:rStyle w:val="NormalTok"/>
-        </w:rPr>
-        <w:t xml:space="preserve">    </w:t>
-      </w:r>
-      <w:r>
-        <w:rPr>
-          <w:rStyle w:val="FunctionTok"/>
-        </w:rPr>
-        <w:t xml:space="preserve">data.frame</w:t>
+        <w:t xml:space="preserve">tibble</w:t>
       </w:r>
       <w:r>
         <w:rPr>

</xml_diff>

<commit_message>
Deploying to gh-pages from @ Morrison-Lab/sds@8083b256e888da71f6f8b3a841c97218d4458d1c 🚀
</commit_message>
<xml_diff>
--- a/bayesian-inference-handout.docx
+++ b/bayesian-inference-handout.docx
@@ -15,7 +15,7 @@
         <w:pStyle w:val="Date"/>
       </w:pPr>
       <w:r>
-        <w:t xml:space="preserve">Last modified: 2026-10-12 23:11:59 (PDT)</w:t>
+        <w:t xml:space="preserve">Last modified: 2026-10-13 00:51:10 (PDT)</w:t>
       </w:r>
     </w:p>
     <w:p>
@@ -84,7 +84,7 @@
         <w:t xml:space="preserve">(Statistical Rethinking 2026, Lecture A01).</w:t>
       </w:r>
     </w:p>
-    <w:bookmarkStart w:id="18" w:name="sec-bayes-paradigms"/>
+    <w:bookmarkStart w:id="19" w:name="sec-bayes-paradigms"/>
     <w:p>
       <w:pPr>
         <w:pStyle w:val="Heading2"/>
@@ -141,7 +141,7 @@
         <w:t xml:space="preserve">take the frequentist view of parameters.</w:t>
       </w:r>
     </w:p>
-    <w:bookmarkStart w:id="12" w:name="def-frequentist-paradigm"/>
+    <w:bookmarkStart w:id="13" w:name="def-frequentist-paradigm"/>
     <w:p>
       <w:pPr>
         <w:pStyle w:val="BodyText"/>
@@ -225,8 +225,19 @@
         <w:t xml:space="preserve"> </w:t>
       </w:r>
       <w:r>
-        <w:t xml:space="preserve">is quantified by the sampling distribution</w:t>
-      </w:r>
+        <w:t xml:space="preserve">is quantified by the</w:t>
+      </w:r>
+      <w:r>
+        <w:t xml:space="preserve"> </w:t>
+      </w:r>
+      <w:hyperlink r:id="rId12">
+        <w:r>
+          <w:rPr>
+            <w:rStyle w:val="Hyperlink"/>
+          </w:rPr>
+          <w:t xml:space="preserve">sampling distribution</w:t>
+        </w:r>
+      </w:hyperlink>
       <w:r>
         <w:t xml:space="preserve"> </w:t>
       </w:r>
@@ -252,8 +263,8 @@
         <w:t xml:space="preserve">.</w:t>
       </w:r>
     </w:p>
-    <w:bookmarkEnd w:id="12"/>
-    <w:bookmarkStart w:id="13" w:name="def-bayesian-paradigm"/>
+    <w:bookmarkEnd w:id="13"/>
+    <w:bookmarkStart w:id="14" w:name="def-bayesian-paradigm"/>
     <w:p>
       <w:pPr>
         <w:pStyle w:val="BodyText"/>
@@ -323,8 +334,8 @@
         <w:t xml:space="preserve">.</w:t>
       </w:r>
     </w:p>
-    <w:bookmarkEnd w:id="13"/>
-    <w:bookmarkStart w:id="14" w:name="exm-paradigms"/>
+    <w:bookmarkEnd w:id="14"/>
+    <w:bookmarkStart w:id="15" w:name="exm-paradigms"/>
     <w:p>
       <w:pPr>
         <w:pStyle w:val="BodyText"/>
@@ -531,8 +542,8 @@
         <w:t xml:space="preserve">given the 55 successes.</w:t>
       </w:r>
     </w:p>
-    <w:bookmarkEnd w:id="14"/>
-    <w:bookmarkStart w:id="15" w:name="def-prior"/>
+    <w:bookmarkEnd w:id="15"/>
+    <w:bookmarkStart w:id="16" w:name="def-prior"/>
     <w:p>
       <w:pPr>
         <w:pStyle w:val="BodyText"/>
@@ -639,8 +650,8 @@
         <w:t xml:space="preserve">before the data are observed.</w:t>
       </w:r>
     </w:p>
-    <w:bookmarkEnd w:id="15"/>
-    <w:bookmarkStart w:id="16" w:name="exm-prior"/>
+    <w:bookmarkEnd w:id="16"/>
+    <w:bookmarkStart w:id="17" w:name="exm-prior"/>
     <w:p>
       <w:pPr>
         <w:pStyle w:val="BodyText"/>
@@ -939,8 +950,8 @@
         </m:oMath>
       </m:oMathPara>
     </w:p>
-    <w:bookmarkEnd w:id="16"/>
-    <w:bookmarkStart w:id="17" w:name="rem-two-paradigms"/>
+    <w:bookmarkEnd w:id="17"/>
+    <w:bookmarkStart w:id="18" w:name="rem-two-paradigms"/>
     <w:p>
       <w:pPr>
         <w:pStyle w:val="FirstParagraph"/>
@@ -1001,9 +1012,9 @@
         <w:t xml:space="preserve">and they call for different machinery.</w:t>
       </w:r>
     </w:p>
-    <w:bookmarkEnd w:id="17"/>
     <w:bookmarkEnd w:id="18"/>
-    <w:bookmarkStart w:id="71" w:name="sec-bayes-equation"/>
+    <w:bookmarkEnd w:id="19"/>
+    <w:bookmarkStart w:id="72" w:name="sec-bayes-equation"/>
     <w:p>
       <w:pPr>
         <w:pStyle w:val="Heading2"/>
@@ -1012,7 +1023,7 @@
         <w:t xml:space="preserve">2 Bayes’ theorem for parameters</w:t>
       </w:r>
     </w:p>
-    <w:bookmarkStart w:id="20" w:name="def-posterior"/>
+    <w:bookmarkStart w:id="21" w:name="def-posterior"/>
     <w:p>
       <w:pPr>
         <w:pStyle w:val="FirstParagraph"/>
@@ -1106,7 +1117,7 @@
       <w:r>
         <w:t xml:space="preserve"> </w:t>
       </w:r>
-      <w:hyperlink r:id="rId19">
+      <w:hyperlink r:id="rId20">
         <w:r>
           <w:rPr>
             <w:rStyle w:val="Hyperlink"/>
@@ -1220,8 +1231,8 @@
         <w:t xml:space="preserve">.</w:t>
       </w:r>
     </w:p>
-    <w:bookmarkEnd w:id="20"/>
-    <w:bookmarkStart w:id="21" w:name="exm-posterior"/>
+    <w:bookmarkEnd w:id="21"/>
+    <w:bookmarkStart w:id="22" w:name="exm-posterior"/>
     <w:p>
       <w:pPr>
         <w:pStyle w:val="BodyText"/>
@@ -1431,8 +1442,8 @@
         <w:t xml:space="preserve">.</w:t>
       </w:r>
     </w:p>
-    <w:bookmarkEnd w:id="21"/>
-    <w:bookmarkStart w:id="22" w:name="def-marginal-likelihood"/>
+    <w:bookmarkEnd w:id="22"/>
+    <w:bookmarkStart w:id="23" w:name="def-marginal-likelihood"/>
     <w:p>
       <w:pPr>
         <w:pStyle w:val="BodyText"/>
@@ -1781,8 +1792,8 @@
         <w:t xml:space="preserve">is discrete.</w:t>
       </w:r>
     </w:p>
-    <w:bookmarkEnd w:id="22"/>
-    <w:bookmarkStart w:id="24" w:name="thm-bayes-posterior"/>
+    <w:bookmarkEnd w:id="23"/>
+    <w:bookmarkStart w:id="25" w:name="thm-bayes-posterior"/>
     <w:p>
       <w:pPr>
         <w:pStyle w:val="BodyText"/>
@@ -1850,7 +1861,7 @@
       <w:pPr>
         <w:pStyle w:val="BodyText"/>
       </w:pPr>
-      <w:bookmarkStart w:id="23" w:name="eq-bayes-posterior"/>
+      <w:bookmarkStart w:id="24" w:name="eq-bayes-posterior"/>
       <m:oMathPara>
         <m:oMathParaPr>
           <m:jc m:val="center"/>
@@ -2023,9 +2034,9 @@
           </m:r>
         </m:oMath>
       </m:oMathPara>
-      <w:bookmarkEnd w:id="23"/>
+      <w:bookmarkEnd w:id="24"/>
     </w:p>
-    <w:bookmarkEnd w:id="24"/>
+    <w:bookmarkEnd w:id="25"/>
     <w:p>
       <w:pPr>
         <w:pStyle w:val="FirstParagraph"/>
@@ -2773,7 +2784,7 @@
         <w:t xml:space="preserve">.</w:t>
       </w:r>
     </w:p>
-    <w:bookmarkStart w:id="25" w:name="exm-marginal-likelihood"/>
+    <w:bookmarkStart w:id="26" w:name="exm-marginal-likelihood"/>
     <w:p>
       <w:pPr>
         <w:pStyle w:val="BodyText"/>
@@ -3564,8 +3575,8 @@
         <w:t xml:space="preserve">.</w:t>
       </w:r>
     </w:p>
-    <w:bookmarkEnd w:id="25"/>
-    <w:bookmarkStart w:id="29" w:name="exm-marginal-likelihood-uniform"/>
+    <w:bookmarkEnd w:id="26"/>
+    <w:bookmarkStart w:id="30" w:name="exm-marginal-likelihood-uniform"/>
     <w:p>
       <w:pPr>
         <w:pStyle w:val="BodyText"/>
@@ -3888,7 +3899,7 @@
       <w:pPr>
         <w:pStyle w:val="BodyText"/>
       </w:pPr>
-      <w:bookmarkStart w:id="26" w:name="eq-marginal-likelihood-uniform-exm"/>
+      <w:bookmarkStart w:id="27" w:name="eq-marginal-likelihood-uniform-exm"/>
       <m:oMathPara>
         <m:oMathParaPr>
           <m:jc m:val="center"/>
@@ -4422,7 +4433,7 @@
           </m:r>
         </m:oMath>
       </m:oMathPara>
-      <w:bookmarkEnd w:id="26"/>
+      <w:bookmarkEnd w:id="27"/>
     </w:p>
     <w:p>
       <w:pPr>
@@ -4497,7 +4508,7 @@
       <w:pPr>
         <w:pStyle w:val="BodyText"/>
       </w:pPr>
-      <w:bookmarkStart w:id="27" w:name="eq-marginal-likelihood-uniform-exm-2"/>
+      <w:bookmarkStart w:id="28" w:name="eq-marginal-likelihood-uniform-exm-2"/>
       <m:oMathPara>
         <m:oMathParaPr>
           <m:jc m:val="center"/>
@@ -4878,7 +4889,7 @@
           </m:r>
         </m:oMath>
       </m:oMathPara>
-      <w:bookmarkEnd w:id="27"/>
+      <w:bookmarkEnd w:id="28"/>
     </w:p>
     <w:p>
       <w:pPr>
@@ -4909,7 +4920,7 @@
       <w:pPr>
         <w:pStyle w:val="BodyText"/>
       </w:pPr>
-      <w:bookmarkStart w:id="28" w:name="eq-marginal-likelihood-uniform-exm-3"/>
+      <w:bookmarkStart w:id="29" w:name="eq-marginal-likelihood-uniform-exm-3"/>
       <m:oMathPara>
         <m:oMathParaPr>
           <m:jc m:val="center"/>
@@ -5498,7 +5509,7 @@
           </m:r>
         </m:oMath>
       </m:oMathPara>
-      <w:bookmarkEnd w:id="28"/>
+      <w:bookmarkEnd w:id="29"/>
     </w:p>
     <w:p>
       <w:pPr>
@@ -5528,8 +5539,8 @@
         <w:t xml:space="preserve">.</w:t>
       </w:r>
     </w:p>
-    <w:bookmarkEnd w:id="29"/>
-    <w:bookmarkStart w:id="31" w:name="cor-bayes-proportional"/>
+    <w:bookmarkEnd w:id="30"/>
+    <w:bookmarkStart w:id="32" w:name="cor-bayes-proportional"/>
     <w:p>
       <w:pPr>
         <w:pStyle w:val="BodyText"/>
@@ -5584,7 +5595,7 @@
       <w:pPr>
         <w:pStyle w:val="BodyText"/>
       </w:pPr>
-      <w:bookmarkStart w:id="30" w:name="eq-bayes-proportional"/>
+      <w:bookmarkStart w:id="31" w:name="eq-bayes-proportional"/>
       <m:oMathPara>
         <m:oMathParaPr>
           <m:jc m:val="center"/>
@@ -5804,9 +5815,9 @@
           </m:r>
         </m:oMath>
       </m:oMathPara>
-      <w:bookmarkEnd w:id="30"/>
+      <w:bookmarkEnd w:id="31"/>
     </w:p>
-    <w:bookmarkEnd w:id="31"/>
+    <w:bookmarkEnd w:id="32"/>
     <w:p>
       <w:pPr>
         <w:pStyle w:val="FirstParagraph"/>
@@ -5916,7 +5927,7 @@
       <w:r>
         <w:t xml:space="preserve"> </w:t>
       </w:r>
-      <w:hyperlink r:id="rId32">
+      <w:hyperlink r:id="rId33">
         <w:r>
           <w:rPr>
             <w:rStyle w:val="Hyperlink"/>
@@ -6001,7 +6012,7 @@
       <w:r>
         <w:t xml:space="preserve"> </w:t>
       </w:r>
-      <w:hyperlink r:id="rId33">
+      <w:hyperlink r:id="rId34">
         <w:r>
           <w:rPr>
             <w:rStyle w:val="Hyperlink"/>
@@ -6120,7 +6131,7 @@
         <w:t xml:space="preserve">.</w:t>
       </w:r>
     </w:p>
-    <w:bookmarkStart w:id="38" w:name="sec-bayes-normal-normal"/>
+    <w:bookmarkStart w:id="39" w:name="sec-bayes-normal-normal"/>
     <w:p>
       <w:pPr>
         <w:pStyle w:val="Heading3"/>
@@ -6129,7 +6140,7 @@
         <w:t xml:space="preserve">2.1 A Gaussian mean with a Gaussian prior</w:t>
       </w:r>
     </w:p>
-    <w:bookmarkStart w:id="37" w:name="exm-normal-normal"/>
+    <w:bookmarkStart w:id="38" w:name="exm-normal-normal"/>
     <w:p>
       <w:pPr>
         <w:pStyle w:val="FirstParagraph"/>
@@ -6458,7 +6469,7 @@
       <w:pPr>
         <w:pStyle w:val="BodyText"/>
       </w:pPr>
-      <w:bookmarkStart w:id="34" w:name="eq-normal-normal-exm"/>
+      <w:bookmarkStart w:id="35" w:name="eq-normal-normal-exm"/>
       <m:oMathPara>
         <m:oMathParaPr>
           <m:jc m:val="center"/>
@@ -9111,7 +9122,7 @@
           </m:r>
         </m:oMath>
       </m:oMathPara>
-      <w:bookmarkEnd w:id="34"/>
+      <w:bookmarkEnd w:id="35"/>
     </w:p>
     <w:p>
       <w:pPr>
@@ -9305,7 +9316,7 @@
       <w:pPr>
         <w:pStyle w:val="BodyText"/>
       </w:pPr>
-      <w:bookmarkStart w:id="35" w:name="eq-normal-normal-exm-2"/>
+      <w:bookmarkStart w:id="36" w:name="eq-normal-normal-exm-2"/>
       <m:oMathPara>
         <m:oMathParaPr>
           <m:jc m:val="center"/>
@@ -10964,7 +10975,7 @@
           </m:r>
         </m:oMath>
       </m:oMathPara>
-      <w:bookmarkEnd w:id="35"/>
+      <w:bookmarkEnd w:id="36"/>
     </w:p>
     <w:p>
       <w:pPr>
@@ -11051,7 +11062,7 @@
       <w:pPr>
         <w:pStyle w:val="BodyText"/>
       </w:pPr>
-      <w:bookmarkStart w:id="36" w:name="eq-normal-normal-exm-3"/>
+      <w:bookmarkStart w:id="37" w:name="eq-normal-normal-exm-3"/>
       <m:oMathPara>
         <m:oMathParaPr>
           <m:jc m:val="center"/>
@@ -11203,7 +11214,7 @@
           </m:r>
         </m:oMath>
       </m:oMathPara>
-      <w:bookmarkEnd w:id="36"/>
+      <w:bookmarkEnd w:id="37"/>
     </w:p>
     <w:p>
       <w:pPr>
@@ -11353,9 +11364,9 @@
         <w:t xml:space="preserve">.</w:t>
       </w:r>
     </w:p>
-    <w:bookmarkEnd w:id="37"/>
     <w:bookmarkEnd w:id="38"/>
-    <w:bookmarkStart w:id="50" w:name="sec-bayes-map"/>
+    <w:bookmarkEnd w:id="39"/>
+    <w:bookmarkStart w:id="51" w:name="sec-bayes-map"/>
     <w:p>
       <w:pPr>
         <w:pStyle w:val="Heading3"/>
@@ -11364,7 +11375,7 @@
         <w:t xml:space="preserve">2.2 The posterior mode</w:t>
       </w:r>
     </w:p>
-    <w:bookmarkStart w:id="40" w:name="def-map"/>
+    <w:bookmarkStart w:id="41" w:name="def-map"/>
     <w:p>
       <w:pPr>
         <w:pStyle w:val="FirstParagraph"/>
@@ -11525,7 +11536,7 @@
       <w:pPr>
         <w:pStyle w:val="BodyText"/>
       </w:pPr>
-      <w:bookmarkStart w:id="39" w:name="eq-map"/>
+      <w:bookmarkStart w:id="40" w:name="eq-map"/>
       <m:oMathPara>
         <m:oMathParaPr>
           <m:jc m:val="center"/>
@@ -11651,7 +11662,7 @@
           </m:r>
         </m:oMath>
       </m:oMathPara>
-      <w:bookmarkEnd w:id="39"/>
+      <w:bookmarkEnd w:id="40"/>
     </w:p>
     <w:p>
       <w:pPr>
@@ -11661,8 +11672,8 @@
         <w:t xml:space="preserve">The MAP estimate is the mode of the posterior distribution.</w:t>
       </w:r>
     </w:p>
-    <w:bookmarkEnd w:id="40"/>
-    <w:bookmarkStart w:id="42" w:name="exm-map-beta-bernoulli"/>
+    <w:bookmarkEnd w:id="41"/>
+    <w:bookmarkStart w:id="43" w:name="exm-map-beta-bernoulli"/>
     <w:p>
       <w:pPr>
         <w:pStyle w:val="BodyText"/>
@@ -11683,7 +11694,7 @@
       <w:r>
         <w:t xml:space="preserve"> </w:t>
       </w:r>
-      <w:hyperlink r:id="rId41">
+      <w:hyperlink r:id="rId42">
         <w:r>
           <w:rPr>
             <w:rStyle w:val="Hyperlink"/>
@@ -13388,8 +13399,8 @@
         <w:t xml:space="preserve">.</w:t>
       </w:r>
     </w:p>
-    <w:bookmarkEnd w:id="42"/>
-    <w:bookmarkStart w:id="44" w:name="cor-map-penalized"/>
+    <w:bookmarkEnd w:id="43"/>
+    <w:bookmarkStart w:id="45" w:name="cor-map-penalized"/>
     <w:p>
       <w:pPr>
         <w:pStyle w:val="BodyText"/>
@@ -13429,7 +13440,7 @@
       <w:pPr>
         <w:pStyle w:val="BodyText"/>
       </w:pPr>
-      <w:bookmarkStart w:id="43" w:name="eq-map-penalized"/>
+      <w:bookmarkStart w:id="44" w:name="eq-map-penalized"/>
       <m:oMathPara>
         <m:oMathParaPr>
           <m:jc m:val="center"/>
@@ -13641,7 +13652,7 @@
           </m:r>
         </m:oMath>
       </m:oMathPara>
-      <w:bookmarkEnd w:id="43"/>
+      <w:bookmarkEnd w:id="44"/>
     </w:p>
     <w:p>
       <w:pPr>
@@ -13714,7 +13725,7 @@
         <w:t xml:space="preserve">, is the penalty that the prior adds.</w:t>
       </w:r>
     </w:p>
-    <w:bookmarkEnd w:id="44"/>
+    <w:bookmarkEnd w:id="45"/>
     <w:p>
       <w:pPr>
         <w:pStyle w:val="BodyText"/>
@@ -14118,7 +14129,7 @@
         <w:t xml:space="preserve">Maximizing a function is the same as minimizing its negative.</w:t>
       </w:r>
     </w:p>
-    <w:bookmarkStart w:id="49" w:name="exm-map-normal-normal"/>
+    <w:bookmarkStart w:id="50" w:name="exm-map-normal-normal"/>
     <w:p>
       <w:pPr>
         <w:pStyle w:val="BodyText"/>
@@ -15100,7 +15111,7 @@
       <w:tr>
         <w:tc>
           <w:tcPr/>
-          <w:bookmarkStart w:id="48" w:name="fig-map-penalized"/>
+          <w:bookmarkStart w:id="49" w:name="fig-map-penalized"/>
           <w:p>
             <w:pPr>
               <w:pStyle w:val="SourceCode"/>
@@ -16265,18 +16276,18 @@
                 <wp:inline>
                   <wp:extent cx="4620126" cy="3696101"/>
                   <wp:effectExtent b="0" l="0" r="0" t="0"/>
-                  <wp:docPr descr="" title="" id="46" name="Picture"/>
+                  <wp:docPr descr="" title="" id="47" name="Picture"/>
                   <a:graphic>
                     <a:graphicData uri="http://schemas.openxmlformats.org/drawingml/2006/picture">
                       <pic:pic>
                         <pic:nvPicPr>
-                          <pic:cNvPr descr="bayesian-inference_files/figure-docx/unnamed-chunk-1-1.png" id="47" name="Picture"/>
+                          <pic:cNvPr descr="bayesian-inference_files/figure-docx/unnamed-chunk-1-1.png" id="48" name="Picture"/>
                           <pic:cNvPicPr>
                             <a:picLocks noChangeArrowheads="1" noChangeAspect="1"/>
                           </pic:cNvPicPr>
                         </pic:nvPicPr>
                         <pic:blipFill>
-                          <a:blip r:embed="rId45"/>
+                          <a:blip r:embed="rId46"/>
                           <a:stretch>
                             <a:fillRect/>
                           </a:stretch>
@@ -16322,13 +16333,13 @@
               <w:t xml:space="preserve">The dashed lines mark the sample mean (right) and the MAP estimate (left).</w:t>
             </w:r>
           </w:p>
-          <w:bookmarkEnd w:id="48"/>
+          <w:bookmarkEnd w:id="49"/>
         </w:tc>
       </w:tr>
     </w:tbl>
-    <w:bookmarkEnd w:id="49"/>
     <w:bookmarkEnd w:id="50"/>
-    <w:bookmarkStart w:id="65" w:name="sec-bayes-interval-interp"/>
+    <w:bookmarkEnd w:id="51"/>
+    <w:bookmarkStart w:id="66" w:name="sec-bayes-interval-interp"/>
     <w:p>
       <w:pPr>
         <w:pStyle w:val="Heading3"/>
@@ -16362,7 +16373,7 @@
       <w:r>
         <w:t xml:space="preserve"> </w:t>
       </w:r>
-      <w:hyperlink r:id="rId51">
+      <w:hyperlink r:id="rId52">
         <w:r>
           <w:rPr>
             <w:rStyle w:val="Hyperlink"/>
@@ -16461,7 +16472,7 @@
         <w:t xml:space="preserve">given the data actually observed.</w:t>
       </w:r>
     </w:p>
-    <w:bookmarkStart w:id="52" w:name="def-credible-interval"/>
+    <w:bookmarkStart w:id="53" w:name="def-credible-interval"/>
     <w:p>
       <w:pPr>
         <w:pStyle w:val="BodyText"/>
@@ -16853,7 +16864,7 @@
         </m:oMath>
       </m:oMathPara>
     </w:p>
-    <w:bookmarkEnd w:id="52"/>
+    <w:bookmarkEnd w:id="53"/>
     <w:p>
       <w:pPr>
         <w:pStyle w:val="FirstParagraph"/>
@@ -16940,7 +16951,7 @@
         <w:t xml:space="preserve">is the equal-tailed interval.</w:t>
       </w:r>
     </w:p>
-    <w:bookmarkStart w:id="53" w:name="def-equal-tailed-interval"/>
+    <w:bookmarkStart w:id="54" w:name="def-equal-tailed-interval"/>
     <w:p>
       <w:pPr>
         <w:pStyle w:val="BodyText"/>
@@ -17099,8 +17110,8 @@
         <w:t xml:space="preserve">.</w:t>
       </w:r>
     </w:p>
-    <w:bookmarkEnd w:id="53"/>
-    <w:bookmarkStart w:id="54" w:name="exm-equal-tailed-interval"/>
+    <w:bookmarkEnd w:id="54"/>
+    <w:bookmarkStart w:id="55" w:name="exm-equal-tailed-interval"/>
     <w:p>
       <w:pPr>
         <w:pStyle w:val="BodyText"/>
@@ -17387,8 +17398,8 @@
         <w:t xml:space="preserve">.</w:t>
       </w:r>
     </w:p>
-    <w:bookmarkEnd w:id="54"/>
-    <w:bookmarkStart w:id="59" w:name="exm-normal-credible-vs-confidence"/>
+    <w:bookmarkEnd w:id="55"/>
+    <w:bookmarkStart w:id="60" w:name="exm-normal-credible-vs-confidence"/>
     <w:p>
       <w:pPr>
         <w:pStyle w:val="BodyText"/>
@@ -18578,7 +18589,7 @@
       <w:tr>
         <w:tc>
           <w:tcPr/>
-          <w:bookmarkStart w:id="58" w:name="fig-normal-prior-lik-post"/>
+          <w:bookmarkStart w:id="59" w:name="fig-normal-prior-lik-post"/>
           <w:p>
             <w:pPr>
               <w:pStyle w:val="SourceCode"/>
@@ -19377,18 +19388,18 @@
                 <wp:inline>
                   <wp:extent cx="4620126" cy="3696101"/>
                   <wp:effectExtent b="0" l="0" r="0" t="0"/>
-                  <wp:docPr descr="" title="" id="56" name="Picture"/>
+                  <wp:docPr descr="" title="" id="57" name="Picture"/>
                   <a:graphic>
                     <a:graphicData uri="http://schemas.openxmlformats.org/drawingml/2006/picture">
                       <pic:pic>
                         <pic:nvPicPr>
-                          <pic:cNvPr descr="bayesian-inference_files/figure-docx/unnamed-chunk-2-1.png" id="57" name="Picture"/>
+                          <pic:cNvPr descr="bayesian-inference_files/figure-docx/unnamed-chunk-2-1.png" id="58" name="Picture"/>
                           <pic:cNvPicPr>
                             <a:picLocks noChangeArrowheads="1" noChangeAspect="1"/>
                           </pic:cNvPicPr>
                         </pic:nvPicPr>
                         <pic:blipFill>
-                          <a:blip r:embed="rId55"/>
+                          <a:blip r:embed="rId56"/>
                           <a:stretch>
                             <a:fillRect/>
                           </a:stretch>
@@ -19510,7 +19521,7 @@
               <w:t xml:space="preserve">.</w:t>
             </w:r>
           </w:p>
-          <w:bookmarkEnd w:id="58"/>
+          <w:bookmarkEnd w:id="59"/>
         </w:tc>
       </w:tr>
     </w:tbl>
@@ -19766,8 +19777,8 @@
         <w:t xml:space="preserve">since both are fixed.</w:t>
       </w:r>
     </w:p>
-    <w:bookmarkEnd w:id="59"/>
-    <w:bookmarkStart w:id="64" w:name="exm-discrete-prior"/>
+    <w:bookmarkEnd w:id="60"/>
+    <w:bookmarkStart w:id="65" w:name="exm-discrete-prior"/>
     <w:p>
       <w:pPr>
         <w:pStyle w:val="BodyText"/>
@@ -22691,7 +22702,7 @@
       <w:tr>
         <w:tc>
           <w:tcPr/>
-          <w:bookmarkStart w:id="63" w:name="fig-discrete-prior"/>
+          <w:bookmarkStart w:id="64" w:name="fig-discrete-prior"/>
           <w:p>
             <w:pPr>
               <w:pStyle w:val="Compact"/>
@@ -22702,18 +22713,18 @@
                 <wp:inline>
                   <wp:extent cx="4620126" cy="3696101"/>
                   <wp:effectExtent b="0" l="0" r="0" t="0"/>
-                  <wp:docPr descr="" title="" id="61" name="Picture"/>
+                  <wp:docPr descr="" title="" id="62" name="Picture"/>
                   <a:graphic>
                     <a:graphicData uri="http://schemas.openxmlformats.org/drawingml/2006/picture">
                       <pic:pic>
                         <pic:nvPicPr>
-                          <pic:cNvPr descr="bayesian-inference_files/figure-docx/fig-discrete-prior-1.png" id="62" name="Picture"/>
+                          <pic:cNvPr descr="bayesian-inference_files/figure-docx/fig-discrete-prior-1.png" id="63" name="Picture"/>
                           <pic:cNvPicPr>
                             <a:picLocks noChangeArrowheads="1" noChangeAspect="1"/>
                           </pic:cNvPicPr>
                         </pic:nvPicPr>
                         <pic:blipFill>
-                          <a:blip r:embed="rId60"/>
+                          <a:blip r:embed="rId61"/>
                           <a:stretch>
                             <a:fillRect/>
                           </a:stretch>
@@ -22753,7 +22764,7 @@
               <w:t xml:space="preserve">Figure 3: Prior and posterior probabilities on the grid of values of the success probability, after 8 successes in 10 trials.</w:t>
             </w:r>
           </w:p>
-          <w:bookmarkEnd w:id="63"/>
+          <w:bookmarkEnd w:id="64"/>
         </w:tc>
       </w:tr>
     </w:tbl>
@@ -24222,9 +24233,9 @@
         <w:t xml:space="preserve">here its posterior probability is 0.9866, not 0.95.</w:t>
       </w:r>
     </w:p>
-    <w:bookmarkEnd w:id="64"/>
     <w:bookmarkEnd w:id="65"/>
-    <w:bookmarkStart w:id="70" w:name="sec-bayes-parameter-space"/>
+    <w:bookmarkEnd w:id="66"/>
+    <w:bookmarkStart w:id="71" w:name="sec-bayes-parameter-space"/>
     <w:p>
       <w:pPr>
         <w:pStyle w:val="Heading3"/>
@@ -24233,7 +24244,7 @@
         <w:t xml:space="preserve">2.4 The parameter space</w:t>
       </w:r>
     </w:p>
-    <w:bookmarkStart w:id="66" w:name="def-parameter-space"/>
+    <w:bookmarkStart w:id="67" w:name="def-parameter-space"/>
     <w:p>
       <w:pPr>
         <w:pStyle w:val="FirstParagraph"/>
@@ -24299,7 +24310,7 @@
         <w:t xml:space="preserve">can take.</w:t>
       </w:r>
     </w:p>
-    <w:bookmarkEnd w:id="66"/>
+    <w:bookmarkEnd w:id="67"/>
     <w:p>
       <w:pPr>
         <w:pStyle w:val="BodyText"/>
@@ -24343,7 +24354,7 @@
         <w:t xml:space="preserve">and the prior has to respect it.</w:t>
       </w:r>
     </w:p>
-    <w:bookmarkStart w:id="67" w:name="exm-parameter-space"/>
+    <w:bookmarkStart w:id="68" w:name="exm-parameter-space"/>
     <w:p>
       <w:pPr>
         <w:pStyle w:val="BodyText"/>
@@ -24602,8 +24613,8 @@
         <w:t xml:space="preserve">.</w:t>
       </w:r>
     </w:p>
-    <w:bookmarkEnd w:id="67"/>
-    <w:bookmarkStart w:id="68" w:name="cor-prior-support"/>
+    <w:bookmarkEnd w:id="68"/>
+    <w:bookmarkStart w:id="69" w:name="cor-prior-support"/>
     <w:p>
       <w:pPr>
         <w:pStyle w:val="FirstParagraph"/>
@@ -24807,7 +24818,7 @@
         <w:t xml:space="preserve">.</w:t>
       </w:r>
     </w:p>
-    <w:bookmarkEnd w:id="68"/>
+    <w:bookmarkEnd w:id="69"/>
     <w:p>
       <w:pPr>
         <w:pStyle w:val="BodyText"/>
@@ -24932,7 +24943,7 @@
         <w:t xml:space="preserve">.</w:t>
       </w:r>
     </w:p>
-    <w:bookmarkStart w:id="69" w:name="exm-prior-support"/>
+    <w:bookmarkStart w:id="70" w:name="exm-prior-support"/>
     <w:p>
       <w:pPr>
         <w:pStyle w:val="BodyText"/>
@@ -25067,10 +25078,10 @@
         <w:t xml:space="preserve">and one that no amount of data can correct.</w:t>
       </w:r>
     </w:p>
-    <w:bookmarkEnd w:id="69"/>
     <w:bookmarkEnd w:id="70"/>
     <w:bookmarkEnd w:id="71"/>
-    <w:bookmarkStart w:id="102" w:name="sec-bayes-priors"/>
+    <w:bookmarkEnd w:id="72"/>
+    <w:bookmarkStart w:id="103" w:name="sec-bayes-priors"/>
     <w:p>
       <w:pPr>
         <w:pStyle w:val="Heading2"/>
@@ -25145,7 +25156,7 @@
         <w:t xml:space="preserve">.</w:t>
       </w:r>
     </w:p>
-    <w:bookmarkStart w:id="85" w:name="sec-bayes-conjugate"/>
+    <w:bookmarkStart w:id="86" w:name="sec-bayes-conjugate"/>
     <w:p>
       <w:pPr>
         <w:pStyle w:val="Heading3"/>
@@ -25154,7 +25165,7 @@
         <w:t xml:space="preserve">3.1 Conjugate priors</w:t>
       </w:r>
     </w:p>
-    <w:bookmarkStart w:id="72" w:name="def-conjugate-prior"/>
+    <w:bookmarkStart w:id="73" w:name="def-conjugate-prior"/>
     <w:p>
       <w:pPr>
         <w:pStyle w:val="FirstParagraph"/>
@@ -25218,7 +25229,7 @@
         <w:t xml:space="preserve">is also in the family.</w:t>
       </w:r>
     </w:p>
-    <w:bookmarkEnd w:id="72"/>
+    <w:bookmarkEnd w:id="73"/>
     <w:p>
       <w:pPr>
         <w:pStyle w:val="BodyText"/>
@@ -25267,7 +25278,7 @@
       <w:r>
         <w:t xml:space="preserve"> </w:t>
       </w:r>
-      <w:hyperlink r:id="rId73">
+      <w:hyperlink r:id="rId74">
         <w:r>
           <w:rPr>
             <w:rStyle w:val="Hyperlink"/>
@@ -25284,7 +25295,7 @@
         <w:t xml:space="preserve">(Statistical Rethinking 2026, Lecture A02).</w:t>
       </w:r>
     </w:p>
-    <w:bookmarkStart w:id="74" w:name="exm-beta-bernoulli"/>
+    <w:bookmarkStart w:id="75" w:name="exm-beta-bernoulli"/>
     <w:p>
       <w:pPr>
         <w:pStyle w:val="BodyText"/>
@@ -27379,8 +27390,8 @@
         <w:t xml:space="preserve">or does not.</w:t>
       </w:r>
     </w:p>
-    <w:bookmarkEnd w:id="74"/>
-    <w:bookmarkStart w:id="84" w:name="exm-prior-posterior-figure"/>
+    <w:bookmarkEnd w:id="75"/>
+    <w:bookmarkStart w:id="85" w:name="exm-prior-posterior-figure"/>
     <w:p>
       <w:pPr>
         <w:pStyle w:val="BodyText"/>
@@ -27657,7 +27668,7 @@
       <w:r>
         <w:t xml:space="preserve"> </w:t>
       </w:r>
-      <w:hyperlink r:id="rId75">
+      <w:hyperlink r:id="rId76">
         <w:r>
           <w:rPr>
             <w:rStyle w:val="VerbatimChar"/>
@@ -27677,7 +27688,7 @@
       <w:r>
         <w:t xml:space="preserve"> </w:t>
       </w:r>
-      <w:hyperlink r:id="rId76">
+      <w:hyperlink r:id="rId77">
         <w:r>
           <w:rPr>
             <w:rStyle w:val="Hyperlink"/>
@@ -29642,7 +29653,7 @@
       <w:tr>
         <w:tc>
           <w:tcPr/>
-          <w:bookmarkStart w:id="83" w:name="fig-prior-posterior"/>
+          <w:bookmarkStart w:id="84" w:name="fig-prior-posterior"/>
           <w:p>
             <w:pPr>
               <w:pStyle w:val="Heading4"/>
@@ -31086,18 +31097,18 @@
                 <wp:inline>
                   <wp:extent cx="4620126" cy="3696101"/>
                   <wp:effectExtent b="0" l="0" r="0" t="0"/>
-                  <wp:docPr descr="" title="" id="78" name="Picture"/>
+                  <wp:docPr descr="" title="" id="79" name="Picture"/>
                   <a:graphic>
                     <a:graphicData uri="http://schemas.openxmlformats.org/drawingml/2006/picture">
                       <pic:pic>
                         <pic:nvPicPr>
-                          <pic:cNvPr descr="bayesian-inference_files/figure-docx/prior-posterior-plot-1.png" id="79" name="Picture"/>
+                          <pic:cNvPr descr="bayesian-inference_files/figure-docx/prior-posterior-plot-1.png" id="80" name="Picture"/>
                           <pic:cNvPicPr>
                             <a:picLocks noChangeArrowheads="1" noChangeAspect="1"/>
                           </pic:cNvPicPr>
                         </pic:nvPicPr>
                         <pic:blipFill>
-                          <a:blip r:embed="rId77"/>
+                          <a:blip r:embed="rId78"/>
                           <a:stretch>
                             <a:fillRect/>
                           </a:stretch>
@@ -31790,18 +31801,18 @@
                 <wp:inline>
                   <wp:extent cx="5334000" cy="2333625"/>
                   <wp:effectExtent b="0" l="0" r="0" t="0"/>
-                  <wp:docPr descr="" title="" id="81" name="Picture"/>
+                  <wp:docPr descr="" title="" id="82" name="Picture"/>
                   <a:graphic>
                     <a:graphicData uri="http://schemas.openxmlformats.org/drawingml/2006/picture">
                       <pic:pic>
                         <pic:nvPicPr>
-                          <pic:cNvPr descr="bayesian-inference_files/figure-docx/prior-posterior-plot-py-1.png" id="82" name="Picture"/>
+                          <pic:cNvPr descr="bayesian-inference_files/figure-docx/prior-posterior-plot-py-1.png" id="83" name="Picture"/>
                           <pic:cNvPicPr>
                             <a:picLocks noChangeArrowheads="1" noChangeAspect="1"/>
                           </pic:cNvPicPr>
                         </pic:nvPicPr>
                         <pic:blipFill>
-                          <a:blip r:embed="rId80"/>
+                          <a:blip r:embed="rId81"/>
                           <a:stretch>
                             <a:fillRect/>
                           </a:stretch>
@@ -31982,7 +31993,7 @@
               <w:t xml:space="preserve">is unknown.</w:t>
             </w:r>
           </w:p>
-          <w:bookmarkEnd w:id="83"/>
+          <w:bookmarkEnd w:id="84"/>
         </w:tc>
       </w:tr>
     </w:tbl>
@@ -32260,9 +32271,9 @@
         <w:t xml:space="preserve">is the narrower of the two.</w:t>
       </w:r>
     </w:p>
-    <w:bookmarkEnd w:id="84"/>
     <w:bookmarkEnd w:id="85"/>
-    <w:bookmarkStart w:id="97" w:name="sec-bayes-informativeness"/>
+    <w:bookmarkEnd w:id="86"/>
+    <w:bookmarkStart w:id="98" w:name="sec-bayes-informativeness"/>
     <w:p>
       <w:pPr>
         <w:pStyle w:val="Heading3"/>
@@ -32296,7 +32307,7 @@
         <w:t xml:space="preserve">.</w:t>
       </w:r>
     </w:p>
-    <w:bookmarkStart w:id="86" w:name="def-informative-prior"/>
+    <w:bookmarkStart w:id="87" w:name="def-informative-prior"/>
     <w:p>
       <w:pPr>
         <w:pStyle w:val="BodyText"/>
@@ -32360,8 +32371,8 @@
         <w:t xml:space="preserve">such as previous studies, biological limits, or expert judgment.</w:t>
       </w:r>
     </w:p>
-    <w:bookmarkEnd w:id="86"/>
-    <w:bookmarkStart w:id="87" w:name="rem-informative-prior-pull"/>
+    <w:bookmarkEnd w:id="87"/>
+    <w:bookmarkStart w:id="88" w:name="rem-informative-prior-pull"/>
     <w:p>
       <w:pPr>
         <w:pStyle w:val="BodyText"/>
@@ -32386,8 +32397,8 @@
         <w:t xml:space="preserve">most strongly when the data are sparse.</w:t>
       </w:r>
     </w:p>
-    <w:bookmarkEnd w:id="87"/>
-    <w:bookmarkStart w:id="88" w:name="def-weakly-informative-prior"/>
+    <w:bookmarkEnd w:id="88"/>
+    <w:bookmarkStart w:id="89" w:name="def-weakly-informative-prior"/>
     <w:p>
       <w:pPr>
         <w:pStyle w:val="BodyText"/>
@@ -32462,8 +32473,8 @@
         <w:t xml:space="preserve">across the range of scientifically plausible values.</w:t>
       </w:r>
     </w:p>
-    <w:bookmarkEnd w:id="88"/>
-    <w:bookmarkStart w:id="89" w:name="def-flat-prior"/>
+    <w:bookmarkEnd w:id="89"/>
+    <w:bookmarkStart w:id="90" w:name="def-flat-prior"/>
     <w:p>
       <w:pPr>
         <w:pStyle w:val="BodyText"/>
@@ -32620,8 +32631,8 @@
         <w:t xml:space="preserve">.</w:t>
       </w:r>
     </w:p>
-    <w:bookmarkEnd w:id="89"/>
-    <w:bookmarkStart w:id="90" w:name="def-improper-prior"/>
+    <w:bookmarkEnd w:id="90"/>
+    <w:bookmarkStart w:id="91" w:name="def-improper-prior"/>
     <w:p>
       <w:pPr>
         <w:pStyle w:val="BodyText"/>
@@ -32703,8 +32714,8 @@
         <w:t xml:space="preserve">so that it is not a probability density.</w:t>
       </w:r>
     </w:p>
-    <w:bookmarkEnd w:id="90"/>
-    <w:bookmarkStart w:id="91" w:name="exm-prior-spectrum"/>
+    <w:bookmarkEnd w:id="91"/>
+    <w:bookmarkStart w:id="92" w:name="exm-prior-spectrum"/>
     <w:p>
       <w:pPr>
         <w:pStyle w:val="BodyText"/>
@@ -33700,8 +33711,8 @@
         <w:t xml:space="preserve">.</w:t>
       </w:r>
     </w:p>
-    <w:bookmarkEnd w:id="91"/>
-    <w:bookmarkStart w:id="92" w:name="exm-flat-prior-reparam"/>
+    <w:bookmarkEnd w:id="92"/>
+    <w:bookmarkStart w:id="93" w:name="exm-flat-prior-reparam"/>
     <w:p>
       <w:pPr>
         <w:pStyle w:val="BodyText"/>
@@ -35123,8 +35134,8 @@
         <w:t xml:space="preserve">therefore depends on the parameterization.</w:t>
       </w:r>
     </w:p>
-    <w:bookmarkEnd w:id="92"/>
-    <w:bookmarkStart w:id="94" w:name="cor-flat-prior-posterior"/>
+    <w:bookmarkEnd w:id="93"/>
+    <w:bookmarkStart w:id="95" w:name="cor-flat-prior-posterior"/>
     <w:p>
       <w:pPr>
         <w:pStyle w:val="BodyText"/>
@@ -35317,7 +35328,7 @@
       <w:r>
         <w:t xml:space="preserve"> </w:t>
       </w:r>
-      <w:hyperlink r:id="rId33">
+      <w:hyperlink r:id="rId34">
         <w:r>
           <w:rPr>
             <w:rStyle w:val="Hyperlink"/>
@@ -35357,7 +35368,7 @@
       <w:r>
         <w:t xml:space="preserve"> </w:t>
       </w:r>
-      <w:hyperlink r:id="rId93">
+      <w:hyperlink r:id="rId94">
         <w:r>
           <w:rPr>
             <w:rStyle w:val="Hyperlink"/>
@@ -35369,7 +35380,7 @@
         <w:t xml:space="preserve">.</w:t>
       </w:r>
     </w:p>
-    <w:bookmarkEnd w:id="94"/>
+    <w:bookmarkEnd w:id="95"/>
     <w:p>
       <w:pPr>
         <w:pStyle w:val="BodyText"/>
@@ -35566,7 +35577,7 @@
         <w:t xml:space="preserve">Multiplying a function by a positive constant does not change where it is maximized.</w:t>
       </w:r>
     </w:p>
-    <w:bookmarkStart w:id="95" w:name="rem-flat-prior-improper"/>
+    <w:bookmarkStart w:id="96" w:name="rem-flat-prior-improper"/>
     <w:p>
       <w:pPr>
         <w:pStyle w:val="BodyText"/>
@@ -35715,8 +35726,8 @@
         <w:t xml:space="preserve">the posterior is again proportional to the likelihood.</w:t>
       </w:r>
     </w:p>
-    <w:bookmarkEnd w:id="95"/>
-    <w:bookmarkStart w:id="96" w:name="exm-flat-prior-posterior"/>
+    <w:bookmarkEnd w:id="96"/>
+    <w:bookmarkStart w:id="97" w:name="exm-flat-prior-posterior"/>
     <w:p>
       <w:pPr>
         <w:pStyle w:val="BodyText"/>
@@ -36219,9 +36230,9 @@
         <w:t xml:space="preserve">and so its mode, but a mean depends on the whole distribution.</w:t>
       </w:r>
     </w:p>
-    <w:bookmarkEnd w:id="96"/>
     <w:bookmarkEnd w:id="97"/>
-    <w:bookmarkStart w:id="101" w:name="sec-bayes-skeptical"/>
+    <w:bookmarkEnd w:id="98"/>
+    <w:bookmarkStart w:id="102" w:name="sec-bayes-skeptical"/>
     <w:p>
       <w:pPr>
         <w:pStyle w:val="Heading3"/>
@@ -36230,7 +36241,7 @@
         <w:t xml:space="preserve">3.3 A skeptical prior</w:t>
       </w:r>
     </w:p>
-    <w:bookmarkStart w:id="98" w:name="def-skeptical-prior"/>
+    <w:bookmarkStart w:id="99" w:name="def-skeptical-prior"/>
     <w:p>
       <w:pPr>
         <w:pStyle w:val="FirstParagraph"/>
@@ -36297,8 +36308,8 @@
         <w:t xml:space="preserve">.</w:t>
       </w:r>
     </w:p>
-    <w:bookmarkEnd w:id="98"/>
-    <w:bookmarkStart w:id="99" w:name="rem-skeptical-prior-meaning"/>
+    <w:bookmarkEnd w:id="99"/>
+    <w:bookmarkStart w:id="100" w:name="rem-skeptical-prior-meaning"/>
     <w:p>
       <w:pPr>
         <w:pStyle w:val="BodyText"/>
@@ -36323,8 +36334,8 @@
         <w:t xml:space="preserve">to overturn a default of no effect.</w:t>
       </w:r>
     </w:p>
-    <w:bookmarkEnd w:id="99"/>
-    <w:bookmarkStart w:id="100" w:name="exm-skeptical-prior"/>
+    <w:bookmarkEnd w:id="100"/>
+    <w:bookmarkStart w:id="101" w:name="exm-skeptical-prior"/>
     <w:p>
       <w:pPr>
         <w:pStyle w:val="BodyText"/>
@@ -38640,10 +38651,10 @@
         <w:t xml:space="preserve">.</w:t>
       </w:r>
     </w:p>
-    <w:bookmarkEnd w:id="100"/>
     <w:bookmarkEnd w:id="101"/>
     <w:bookmarkEnd w:id="102"/>
-    <w:bookmarkStart w:id="131" w:name="sec-bayes-predictive-checks"/>
+    <w:bookmarkEnd w:id="103"/>
+    <w:bookmarkStart w:id="132" w:name="sec-bayes-predictive-checks"/>
     <w:p>
       <w:pPr>
         <w:pStyle w:val="Heading2"/>
@@ -38707,7 +38718,7 @@
       <w:r>
         <w:t xml:space="preserve"> </w:t>
       </w:r>
-      <w:hyperlink r:id="rId103">
+      <w:hyperlink r:id="rId104">
         <w:r>
           <w:rPr>
             <w:rStyle w:val="Hyperlink"/>
@@ -38724,7 +38735,7 @@
         <w:t xml:space="preserve">(Statistical Rethinking 2026, Lecture A03).</w:t>
       </w:r>
     </w:p>
-    <w:bookmarkStart w:id="104" w:name="def-prior-predictive"/>
+    <w:bookmarkStart w:id="105" w:name="def-prior-predictive"/>
     <w:p>
       <w:pPr>
         <w:pStyle w:val="BodyText"/>
@@ -39060,8 +39071,8 @@
         <w:t xml:space="preserve">.</w:t>
       </w:r>
     </w:p>
-    <w:bookmarkEnd w:id="104"/>
-    <w:bookmarkStart w:id="105" w:name="exm-prior-predictive"/>
+    <w:bookmarkEnd w:id="105"/>
+    <w:bookmarkStart w:id="106" w:name="exm-prior-predictive"/>
     <w:p>
       <w:pPr>
         <w:pStyle w:val="BodyText"/>
@@ -40959,8 +40970,8 @@
         <w:t xml:space="preserve">#&gt; {'smallest': np.float64(0.005263157894736842), 'largest': np.float64(0.005263157894736846), 'one_over_n_plus_1': 0.005263157894736842}</w:t>
       </w:r>
     </w:p>
-    <w:bookmarkEnd w:id="105"/>
-    <w:bookmarkStart w:id="106" w:name="def-posterior-predictive"/>
+    <w:bookmarkEnd w:id="106"/>
+    <w:bookmarkStart w:id="107" w:name="def-posterior-predictive"/>
     <w:p>
       <w:pPr>
         <w:pStyle w:val="FirstParagraph"/>
@@ -41626,8 +41637,8 @@
         <w:t xml:space="preserve">gives the posterior predictive distribution of replicated data.</w:t>
       </w:r>
     </w:p>
-    <w:bookmarkEnd w:id="106"/>
-    <w:bookmarkStart w:id="107" w:name="exm-posterior-predictive"/>
+    <w:bookmarkEnd w:id="107"/>
+    <w:bookmarkStart w:id="108" w:name="exm-posterior-predictive"/>
     <w:p>
       <w:pPr>
         <w:pStyle w:val="BodyText"/>
@@ -43272,8 +43283,8 @@
         <w:t xml:space="preserve">#&gt; {'simulated': np.float64(0.3929), 'exact': np.float64(0.39267015706806285)}</w:t>
       </w:r>
     </w:p>
-    <w:bookmarkEnd w:id="107"/>
-    <w:bookmarkStart w:id="108" w:name="def-test-quantity"/>
+    <w:bookmarkEnd w:id="108"/>
+    <w:bookmarkStart w:id="109" w:name="def-test-quantity"/>
     <w:p>
       <w:pPr>
         <w:pStyle w:val="FirstParagraph"/>
@@ -43353,8 +43364,8 @@
         <w:t xml:space="preserve">.</w:t>
       </w:r>
     </w:p>
-    <w:bookmarkEnd w:id="108"/>
-    <w:bookmarkStart w:id="109" w:name="exm-test-quantity"/>
+    <w:bookmarkEnd w:id="109"/>
+    <w:bookmarkStart w:id="110" w:name="exm-test-quantity"/>
     <w:p>
       <w:pPr>
         <w:pStyle w:val="BodyText"/>
@@ -44710,8 +44721,8 @@
         <w:t xml:space="preserve">#&gt; {'T1': np.int64(74), 'T2': np.float64(0.36256218905472637)}</w:t>
       </w:r>
     </w:p>
-    <w:bookmarkEnd w:id="109"/>
-    <w:bookmarkStart w:id="110" w:name="def-prior-predictive-check"/>
+    <w:bookmarkEnd w:id="110"/>
+    <w:bookmarkStart w:id="111" w:name="def-prior-predictive-check"/>
     <w:p>
       <w:pPr>
         <w:pStyle w:val="FirstParagraph"/>
@@ -44870,8 +44881,8 @@
         <w:t xml:space="preserve">.</w:t>
       </w:r>
     </w:p>
-    <w:bookmarkEnd w:id="110"/>
-    <w:bookmarkStart w:id="118" w:name="exm-prior-predictive-check"/>
+    <w:bookmarkEnd w:id="111"/>
+    <w:bookmarkStart w:id="119" w:name="exm-prior-predictive-check"/>
     <w:p>
       <w:pPr>
         <w:pStyle w:val="BodyText"/>
@@ -46564,7 +46575,7 @@
       <w:tr>
         <w:tc>
           <w:tcPr/>
-          <w:bookmarkStart w:id="117" w:name="fig-prior-predictive-check"/>
+          <w:bookmarkStart w:id="118" w:name="fig-prior-predictive-check"/>
           <w:p>
             <w:pPr>
               <w:pStyle w:val="Heading4"/>
@@ -46919,18 +46930,18 @@
                 <wp:inline>
                   <wp:extent cx="4620126" cy="3696101"/>
                   <wp:effectExtent b="0" l="0" r="0" t="0"/>
-                  <wp:docPr descr="" title="" id="112" name="Picture"/>
+                  <wp:docPr descr="" title="" id="113" name="Picture"/>
                   <a:graphic>
                     <a:graphicData uri="http://schemas.openxmlformats.org/drawingml/2006/picture">
                       <pic:pic>
                         <pic:nvPicPr>
-                          <pic:cNvPr descr="bayesian-inference_files/figure-docx/prior-predictive-check-plot-1.png" id="113" name="Picture"/>
+                          <pic:cNvPr descr="bayesian-inference_files/figure-docx/prior-predictive-check-plot-1.png" id="114" name="Picture"/>
                           <pic:cNvPicPr>
                             <a:picLocks noChangeArrowheads="1" noChangeAspect="1"/>
                           </pic:cNvPicPr>
                         </pic:nvPicPr>
                         <pic:blipFill>
-                          <a:blip r:embed="rId111"/>
+                          <a:blip r:embed="rId112"/>
                           <a:stretch>
                             <a:fillRect/>
                           </a:stretch>
@@ -47398,18 +47409,18 @@
                 <wp:inline>
                   <wp:extent cx="5334000" cy="2333625"/>
                   <wp:effectExtent b="0" l="0" r="0" t="0"/>
-                  <wp:docPr descr="" title="" id="115" name="Picture"/>
+                  <wp:docPr descr="" title="" id="116" name="Picture"/>
                   <a:graphic>
                     <a:graphicData uri="http://schemas.openxmlformats.org/drawingml/2006/picture">
                       <pic:pic>
                         <pic:nvPicPr>
-                          <pic:cNvPr descr="bayesian-inference_files/figure-docx/prior-predictive-check-plot-py-1.png" id="116" name="Picture"/>
+                          <pic:cNvPr descr="bayesian-inference_files/figure-docx/prior-predictive-check-plot-py-1.png" id="117" name="Picture"/>
                           <pic:cNvPicPr>
                             <a:picLocks noChangeArrowheads="1" noChangeAspect="1"/>
                           </pic:cNvPicPr>
                         </pic:nvPicPr>
                         <pic:blipFill>
-                          <a:blip r:embed="rId114"/>
+                          <a:blip r:embed="rId115"/>
                           <a:stretch>
                             <a:fillRect/>
                           </a:stretch>
@@ -47482,7 +47493,7 @@
               <w:t xml:space="preserve">The dashed line is the observed count, 74.</w:t>
             </w:r>
           </w:p>
-          <w:bookmarkEnd w:id="117"/>
+          <w:bookmarkEnd w:id="118"/>
         </w:tc>
       </w:tr>
     </w:tbl>
@@ -47593,8 +47604,8 @@
         <w:t xml:space="preserve">before trusting a posterior built on it.</w:t>
       </w:r>
     </w:p>
-    <w:bookmarkEnd w:id="118"/>
-    <w:bookmarkStart w:id="119" w:name="def-posterior-predictive-check"/>
+    <w:bookmarkEnd w:id="119"/>
+    <w:bookmarkStart w:id="120" w:name="def-posterior-predictive-check"/>
     <w:p>
       <w:pPr>
         <w:pStyle w:val="BodyText"/>
@@ -47837,8 +47848,8 @@
         <w:t xml:space="preserve">.</w:t>
       </w:r>
     </w:p>
-    <w:bookmarkEnd w:id="119"/>
-    <w:bookmarkStart w:id="127" w:name="exm-posterior-predictive-check"/>
+    <w:bookmarkEnd w:id="120"/>
+    <w:bookmarkStart w:id="128" w:name="exm-posterior-predictive-check"/>
     <w:p>
       <w:pPr>
         <w:pStyle w:val="BodyText"/>
@@ -49926,7 +49937,7 @@
       <w:tr>
         <w:tc>
           <w:tcPr/>
-          <w:bookmarkStart w:id="126" w:name="fig-posterior-predictive-check"/>
+          <w:bookmarkStart w:id="127" w:name="fig-posterior-predictive-check"/>
           <w:p>
             <w:pPr>
               <w:pStyle w:val="Heading4"/>
@@ -50326,18 +50337,18 @@
                 <wp:inline>
                   <wp:extent cx="4620126" cy="3696101"/>
                   <wp:effectExtent b="0" l="0" r="0" t="0"/>
-                  <wp:docPr descr="" title="" id="121" name="Picture"/>
+                  <wp:docPr descr="" title="" id="122" name="Picture"/>
                   <a:graphic>
                     <a:graphicData uri="http://schemas.openxmlformats.org/drawingml/2006/picture">
                       <pic:pic>
                         <pic:nvPicPr>
-                          <pic:cNvPr descr="bayesian-inference_files/figure-docx/posterior-predictive-check-plot-1.png" id="122" name="Picture"/>
+                          <pic:cNvPr descr="bayesian-inference_files/figure-docx/posterior-predictive-check-plot-1.png" id="123" name="Picture"/>
                           <pic:cNvPicPr>
                             <a:picLocks noChangeArrowheads="1" noChangeAspect="1"/>
                           </pic:cNvPicPr>
                         </pic:nvPicPr>
                         <pic:blipFill>
-                          <a:blip r:embed="rId120"/>
+                          <a:blip r:embed="rId121"/>
                           <a:stretch>
                             <a:fillRect/>
                           </a:stretch>
@@ -50724,18 +50735,18 @@
                 <wp:inline>
                   <wp:extent cx="5334000" cy="2333625"/>
                   <wp:effectExtent b="0" l="0" r="0" t="0"/>
-                  <wp:docPr descr="" title="" id="124" name="Picture"/>
+                  <wp:docPr descr="" title="" id="125" name="Picture"/>
                   <a:graphic>
                     <a:graphicData uri="http://schemas.openxmlformats.org/drawingml/2006/picture">
                       <pic:pic>
                         <pic:nvPicPr>
-                          <pic:cNvPr descr="bayesian-inference_files/figure-docx/posterior-predictive-check-plot-py-1.png" id="125" name="Picture"/>
+                          <pic:cNvPr descr="bayesian-inference_files/figure-docx/posterior-predictive-check-plot-py-1.png" id="126" name="Picture"/>
                           <pic:cNvPicPr>
                             <a:picLocks noChangeArrowheads="1" noChangeAspect="1"/>
                           </pic:cNvPicPr>
                         </pic:nvPicPr>
                         <pic:blipFill>
-                          <a:blip r:embed="rId123"/>
+                          <a:blip r:embed="rId124"/>
                           <a:stretch>
                             <a:fillRect/>
                           </a:stretch>
@@ -50863,7 +50874,7 @@
               <w:t xml:space="preserve">data.</w:t>
             </w:r>
           </w:p>
-          <w:bookmarkEnd w:id="126"/>
+          <w:bookmarkEnd w:id="127"/>
         </w:tc>
       </w:tr>
     </w:tbl>
@@ -50925,8 +50936,8 @@
         <w:t xml:space="preserve">for everyone cannot reproduce that.</w:t>
       </w:r>
     </w:p>
-    <w:bookmarkEnd w:id="127"/>
-    <w:bookmarkStart w:id="128" w:name="def-ppp-value"/>
+    <w:bookmarkEnd w:id="128"/>
+    <w:bookmarkStart w:id="129" w:name="def-ppp-value"/>
     <w:p>
       <w:pPr>
         <w:pStyle w:val="BodyText"/>
@@ -51316,8 +51327,8 @@
         <w:t xml:space="preserve">A value near 0 or 1 means the observed data are unusual under the model.</w:t>
       </w:r>
     </w:p>
-    <w:bookmarkEnd w:id="128"/>
-    <w:bookmarkStart w:id="130" w:name="exm-ppp-value"/>
+    <w:bookmarkEnd w:id="129"/>
+    <w:bookmarkStart w:id="131" w:name="exm-ppp-value"/>
     <w:p>
       <w:pPr>
         <w:pStyle w:val="BodyText"/>
@@ -51672,7 +51683,7 @@
       <w:r>
         <w:t xml:space="preserve"> </w:t>
       </w:r>
-      <w:hyperlink r:id="rId129">
+      <w:hyperlink r:id="rId130">
         <w:r>
           <w:rPr>
             <w:rStyle w:val="Hyperlink"/>
@@ -51687,9 +51698,9 @@
         <w:t xml:space="preserve">fitted on the companion page.</w:t>
       </w:r>
     </w:p>
-    <w:bookmarkEnd w:id="130"/>
     <w:bookmarkEnd w:id="131"/>
-    <w:bookmarkStart w:id="139" w:name="sec-bayes-hierarchies"/>
+    <w:bookmarkEnd w:id="132"/>
+    <w:bookmarkStart w:id="140" w:name="sec-bayes-hierarchies"/>
     <w:p>
       <w:pPr>
         <w:pStyle w:val="Heading2"/>
@@ -51698,7 +51709,7 @@
         <w:t xml:space="preserve">5 Distributions and hierarchies</w:t>
       </w:r>
     </w:p>
-    <w:bookmarkStart w:id="132" w:name="def-hierarchical-model"/>
+    <w:bookmarkStart w:id="133" w:name="def-hierarchical-model"/>
     <w:p>
       <w:pPr>
         <w:pStyle w:val="FirstParagraph"/>
@@ -51770,8 +51781,8 @@
         <w:t xml:space="preserve">.</w:t>
       </w:r>
     </w:p>
-    <w:bookmarkEnd w:id="132"/>
-    <w:bookmarkStart w:id="133" w:name="rem-hierarchical-model-structure"/>
+    <w:bookmarkEnd w:id="133"/>
+    <w:bookmarkStart w:id="134" w:name="rem-hierarchical-model-structure"/>
     <w:p>
       <w:pPr>
         <w:pStyle w:val="BodyText"/>
@@ -51827,8 +51838,8 @@
         <w:t xml:space="preserve">).</w:t>
       </w:r>
     </w:p>
-    <w:bookmarkEnd w:id="133"/>
-    <w:bookmarkStart w:id="134" w:name="def-hyperparameter"/>
+    <w:bookmarkEnd w:id="134"/>
+    <w:bookmarkStart w:id="135" w:name="def-hyperparameter"/>
     <w:p>
       <w:pPr>
         <w:pStyle w:val="BodyText"/>
@@ -51889,8 +51900,8 @@
         <w:t xml:space="preserve">of the distribution of the group-level parameters.</w:t>
       </w:r>
     </w:p>
-    <w:bookmarkEnd w:id="134"/>
-    <w:bookmarkStart w:id="135" w:name="def-hyperprior"/>
+    <w:bookmarkEnd w:id="135"/>
+    <w:bookmarkStart w:id="136" w:name="def-hyperprior"/>
     <w:p>
       <w:pPr>
         <w:pStyle w:val="BodyText"/>
@@ -51965,8 +51976,8 @@
         <w:t xml:space="preserve">.</w:t>
       </w:r>
     </w:p>
-    <w:bookmarkEnd w:id="135"/>
-    <w:bookmarkStart w:id="136" w:name="exm-two-level-normal"/>
+    <w:bookmarkEnd w:id="136"/>
+    <w:bookmarkStart w:id="137" w:name="exm-two-level-normal"/>
     <w:p>
       <w:pPr>
         <w:pStyle w:val="BodyText"/>
@@ -52470,7 +52481,7 @@
         <w:t xml:space="preserve">.</w:t>
       </w:r>
     </w:p>
-    <w:bookmarkEnd w:id="136"/>
+    <w:bookmarkEnd w:id="137"/>
     <w:p>
       <w:pPr>
         <w:pStyle w:val="BodyText"/>
@@ -52603,7 +52614,7 @@
       <w:r>
         <w:t xml:space="preserve"> </w:t>
       </w:r>
-      <w:hyperlink r:id="rId137">
+      <w:hyperlink r:id="rId138">
         <w:r>
           <w:rPr>
             <w:rStyle w:val="Hyperlink"/>
@@ -52685,7 +52696,7 @@
       <w:r>
         <w:t xml:space="preserve"> </w:t>
       </w:r>
-      <w:hyperlink r:id="rId138">
+      <w:hyperlink r:id="rId139">
         <w:r>
           <w:rPr>
             <w:rStyle w:val="Hyperlink"/>
@@ -52702,8 +52713,8 @@
         <w:t xml:space="preserve">(Statistical Rethinking 2026, Lecture B01).</w:t>
       </w:r>
     </w:p>
-    <w:bookmarkEnd w:id="139"/>
-    <w:bookmarkStart w:id="154" w:name="sec-bayes-resources"/>
+    <w:bookmarkEnd w:id="140"/>
+    <w:bookmarkStart w:id="155" w:name="sec-bayes-resources"/>
     <w:p>
       <w:pPr>
         <w:pStyle w:val="Heading2"/>
@@ -52720,39 +52731,13 @@
         <w:t xml:space="preserve">The following resources cover Bayesian inference in more depth.</w:t>
       </w:r>
     </w:p>
-    <w:bookmarkStart w:id="148" w:name="uc-davis-courses"/>
+    <w:bookmarkStart w:id="149" w:name="uc-davis-courses"/>
     <w:p>
       <w:pPr>
         <w:pStyle w:val="Heading3"/>
       </w:pPr>
       <w:r>
         <w:t xml:space="preserve">6.1 UC Davis courses</w:t>
-      </w:r>
-    </w:p>
-    <w:p>
-      <w:pPr>
-        <w:pStyle w:val="Compact"/>
-        <w:numPr>
-          <w:ilvl w:val="0"/>
-          <w:numId w:val="1007"/>
-        </w:numPr>
-      </w:pPr>
-      <w:hyperlink r:id="rId140">
-        <w:r>
-          <w:rPr>
-            <w:rStyle w:val="Hyperlink"/>
-          </w:rPr>
-          <w:t xml:space="preserve">STA 015C</w:t>
-        </w:r>
-      </w:hyperlink>
-      <w:r>
-        <w:t xml:space="preserve">:</w:t>
-      </w:r>
-      <w:r>
-        <w:t xml:space="preserve"> </w:t>
-      </w:r>
-      <w:r>
-        <w:t xml:space="preserve">“Introduction to Statistical Data Science III”</w:t>
       </w:r>
     </w:p>
     <w:p>
@@ -52768,7 +52753,7 @@
           <w:rPr>
             <w:rStyle w:val="Hyperlink"/>
           </w:rPr>
-          <w:t xml:space="preserve">STA 035C</w:t>
+          <w:t xml:space="preserve">STA 015C</w:t>
         </w:r>
       </w:hyperlink>
       <w:r>
@@ -52778,7 +52763,7 @@
         <w:t xml:space="preserve"> </w:t>
       </w:r>
       <w:r>
-        <w:t xml:space="preserve">“Statistical Data Science III”</w:t>
+        <w:t xml:space="preserve">“Introduction to Statistical Data Science III”</w:t>
       </w:r>
     </w:p>
     <w:p>
@@ -52794,7 +52779,7 @@
           <w:rPr>
             <w:rStyle w:val="Hyperlink"/>
           </w:rPr>
-          <w:t xml:space="preserve">STA 145</w:t>
+          <w:t xml:space="preserve">STA 035C</w:t>
         </w:r>
       </w:hyperlink>
       <w:r>
@@ -52804,7 +52789,7 @@
         <w:t xml:space="preserve"> </w:t>
       </w:r>
       <w:r>
-        <w:t xml:space="preserve">“Bayesian Statistical Inference”</w:t>
+        <w:t xml:space="preserve">“Statistical Data Science III”</w:t>
       </w:r>
     </w:p>
     <w:p>
@@ -52820,7 +52805,7 @@
           <w:rPr>
             <w:rStyle w:val="Hyperlink"/>
           </w:rPr>
-          <w:t xml:space="preserve">ECL 234</w:t>
+          <w:t xml:space="preserve">STA 145</w:t>
         </w:r>
       </w:hyperlink>
       <w:r>
@@ -52830,7 +52815,7 @@
         <w:t xml:space="preserve"> </w:t>
       </w:r>
       <w:r>
-        <w:t xml:space="preserve">“Bayesian Models - A Statistical Primer”</w:t>
+        <w:t xml:space="preserve">“Bayesian Statistical Inference”</w:t>
       </w:r>
     </w:p>
     <w:p>
@@ -52846,7 +52831,7 @@
           <w:rPr>
             <w:rStyle w:val="Hyperlink"/>
           </w:rPr>
-          <w:t xml:space="preserve">PLS 207</w:t>
+          <w:t xml:space="preserve">ECL 234</w:t>
         </w:r>
       </w:hyperlink>
       <w:r>
@@ -52856,7 +52841,7 @@
         <w:t xml:space="preserve"> </w:t>
       </w:r>
       <w:r>
-        <w:t xml:space="preserve">“Applied Statistical Modeling for the Environmental Sciences”</w:t>
+        <w:t xml:space="preserve">“Bayesian Models - A Statistical Primer”</w:t>
       </w:r>
     </w:p>
     <w:p>
@@ -52872,7 +52857,7 @@
           <w:rPr>
             <w:rStyle w:val="Hyperlink"/>
           </w:rPr>
-          <w:t xml:space="preserve">PSC 205H</w:t>
+          <w:t xml:space="preserve">PLS 207</w:t>
         </w:r>
       </w:hyperlink>
       <w:r>
@@ -52882,7 +52867,7 @@
         <w:t xml:space="preserve"> </w:t>
       </w:r>
       <w:r>
-        <w:t xml:space="preserve">“Applied Bayesian Statistics for Social Scientists”</w:t>
+        <w:t xml:space="preserve">“Applied Statistical Modeling for the Environmental Sciences”</w:t>
       </w:r>
     </w:p>
     <w:p>
@@ -52898,7 +52883,7 @@
           <w:rPr>
             <w:rStyle w:val="Hyperlink"/>
           </w:rPr>
-          <w:t xml:space="preserve">POL 280</w:t>
+          <w:t xml:space="preserve">PSC 205H</w:t>
         </w:r>
       </w:hyperlink>
       <w:r>
@@ -52908,7 +52893,7 @@
         <w:t xml:space="preserve"> </w:t>
       </w:r>
       <w:r>
-        <w:t xml:space="preserve">“Bayesian Methods: for Social &amp; Behavioral Sciences”</w:t>
+        <w:t xml:space="preserve">“Applied Bayesian Statistics for Social Scientists”</w:t>
       </w:r>
     </w:p>
     <w:p>
@@ -52924,6 +52909,32 @@
           <w:rPr>
             <w:rStyle w:val="Hyperlink"/>
           </w:rPr>
+          <w:t xml:space="preserve">POL 280</w:t>
+        </w:r>
+      </w:hyperlink>
+      <w:r>
+        <w:t xml:space="preserve">:</w:t>
+      </w:r>
+      <w:r>
+        <w:t xml:space="preserve"> </w:t>
+      </w:r>
+      <w:r>
+        <w:t xml:space="preserve">“Bayesian Methods: for Social &amp; Behavioral Sciences”</w:t>
+      </w:r>
+    </w:p>
+    <w:p>
+      <w:pPr>
+        <w:pStyle w:val="Compact"/>
+        <w:numPr>
+          <w:ilvl w:val="0"/>
+          <w:numId w:val="1007"/>
+        </w:numPr>
+      </w:pPr>
+      <w:hyperlink r:id="rId148">
+        <w:r>
+          <w:rPr>
+            <w:rStyle w:val="Hyperlink"/>
+          </w:rPr>
           <w:t xml:space="preserve">BAX 442</w:t>
         </w:r>
       </w:hyperlink>
@@ -52937,8 +52948,8 @@
         <w:t xml:space="preserve">“Advanced Statistics”</w:t>
       </w:r>
     </w:p>
-    <w:bookmarkEnd w:id="148"/>
-    <w:bookmarkStart w:id="153" w:name="books"/>
+    <w:bookmarkEnd w:id="149"/>
+    <w:bookmarkStart w:id="154" w:name="books"/>
     <w:p>
       <w:pPr>
         <w:pStyle w:val="Heading3"/>
@@ -53000,7 +53011,7 @@
       <w:r>
         <w:t xml:space="preserve"> </w:t>
       </w:r>
-      <w:hyperlink r:id="rId143">
+      <w:hyperlink r:id="rId144">
         <w:r>
           <w:rPr>
             <w:rStyle w:val="Hyperlink"/>
@@ -53029,7 +53040,7 @@
       <w:r>
         <w:t xml:space="preserve"> </w:t>
       </w:r>
-      <w:hyperlink r:id="rId149">
+      <w:hyperlink r:id="rId150">
         <w:r>
           <w:rPr>
             <w:rStyle w:val="Hyperlink"/>
@@ -53049,7 +53060,7 @@
       <w:r>
         <w:t xml:space="preserve"> </w:t>
       </w:r>
-      <w:hyperlink r:id="rId150">
+      <w:hyperlink r:id="rId151">
         <w:r>
           <w:rPr>
             <w:rStyle w:val="Hyperlink"/>
@@ -53069,7 +53080,7 @@
       <w:r>
         <w:t xml:space="preserve"> </w:t>
       </w:r>
-      <w:hyperlink r:id="rId151">
+      <w:hyperlink r:id="rId152">
         <w:r>
           <w:rPr>
             <w:rStyle w:val="Hyperlink"/>
@@ -53089,7 +53100,7 @@
       <w:r>
         <w:t xml:space="preserve"> </w:t>
       </w:r>
-      <w:hyperlink r:id="rId152">
+      <w:hyperlink r:id="rId153">
         <w:r>
           <w:rPr>
             <w:rStyle w:val="Hyperlink"/>
@@ -53163,7 +53174,7 @@
       <w:r>
         <w:t xml:space="preserve"> </w:t>
       </w:r>
-      <w:hyperlink r:id="rId144">
+      <w:hyperlink r:id="rId145">
         <w:r>
           <w:rPr>
             <w:rStyle w:val="Hyperlink"/>
@@ -53172,9 +53183,9 @@
         </w:r>
       </w:hyperlink>
     </w:p>
-    <w:bookmarkEnd w:id="153"/>
     <w:bookmarkEnd w:id="154"/>
-    <w:bookmarkStart w:id="176" w:name="references"/>
+    <w:bookmarkEnd w:id="155"/>
+    <w:bookmarkStart w:id="177" w:name="references"/>
     <w:p>
       <w:pPr>
         <w:pStyle w:val="Heading2"/>
@@ -53183,8 +53194,8 @@
         <w:t xml:space="preserve">References</w:t>
       </w:r>
     </w:p>
-    <w:bookmarkStart w:id="175" w:name="refs"/>
-    <w:bookmarkStart w:id="156" w:name="ref-aragon2018population"/>
+    <w:bookmarkStart w:id="176" w:name="refs"/>
+    <w:bookmarkStart w:id="157" w:name="ref-aragon2018population"/>
     <w:p>
       <w:pPr>
         <w:pStyle w:val="Bibliography"/>
@@ -53236,7 +53247,7 @@
       <w:r>
         <w:t xml:space="preserve"> </w:t>
       </w:r>
-      <w:hyperlink r:id="rId155">
+      <w:hyperlink r:id="rId156">
         <w:r>
           <w:rPr>
             <w:rStyle w:val="Hyperlink"/>
@@ -53248,8 +53259,8 @@
         <w:t xml:space="preserve">.</w:t>
       </w:r>
     </w:p>
-    <w:bookmarkEnd w:id="156"/>
-    <w:bookmarkStart w:id="158" w:name="ref-CaseBerg01"/>
+    <w:bookmarkEnd w:id="157"/>
+    <w:bookmarkStart w:id="159" w:name="ref-CaseBerg01"/>
     <w:p>
       <w:pPr>
         <w:pStyle w:val="Bibliography"/>
@@ -53273,7 +53284,7 @@
       <w:r>
         <w:t xml:space="preserve"> </w:t>
       </w:r>
-      <w:hyperlink r:id="rId157">
+      <w:hyperlink r:id="rId158">
         <w:r>
           <w:rPr>
             <w:rStyle w:val="Hyperlink"/>
@@ -53285,8 +53296,8 @@
         <w:t xml:space="preserve">.</w:t>
       </w:r>
     </w:p>
-    <w:bookmarkEnd w:id="158"/>
-    <w:bookmarkStart w:id="160" w:name="ref-CowlesMaryKathryn2013ABSW"/>
+    <w:bookmarkEnd w:id="159"/>
+    <w:bookmarkStart w:id="161" w:name="ref-CowlesMaryKathryn2013ABSW"/>
     <w:p>
       <w:pPr>
         <w:pStyle w:val="Bibliography"/>
@@ -53366,7 +53377,7 @@
       <w:r>
         <w:t xml:space="preserve"> </w:t>
       </w:r>
-      <w:hyperlink r:id="rId159">
+      <w:hyperlink r:id="rId160">
         <w:r>
           <w:rPr>
             <w:rStyle w:val="Hyperlink"/>
@@ -53378,8 +53389,8 @@
         <w:t xml:space="preserve">.</w:t>
       </w:r>
     </w:p>
-    <w:bookmarkEnd w:id="160"/>
-    <w:bookmarkStart w:id="162" w:name="ref-dobson4e"/>
+    <w:bookmarkEnd w:id="161"/>
+    <w:bookmarkStart w:id="163" w:name="ref-dobson4e"/>
     <w:p>
       <w:pPr>
         <w:pStyle w:val="Bibliography"/>
@@ -53403,7 +53414,7 @@
       <w:r>
         <w:t xml:space="preserve"> </w:t>
       </w:r>
-      <w:hyperlink r:id="rId161">
+      <w:hyperlink r:id="rId162">
         <w:r>
           <w:rPr>
             <w:rStyle w:val="Hyperlink"/>
@@ -53415,8 +53426,8 @@
         <w:t xml:space="preserve">.</w:t>
       </w:r>
     </w:p>
-    <w:bookmarkEnd w:id="162"/>
-    <w:bookmarkStart w:id="164" w:name="ref-gelman2013bda"/>
+    <w:bookmarkEnd w:id="163"/>
+    <w:bookmarkStart w:id="165" w:name="ref-gelman2013bda"/>
     <w:p>
       <w:pPr>
         <w:pStyle w:val="Bibliography"/>
@@ -53440,7 +53451,7 @@
       <w:r>
         <w:t xml:space="preserve"> </w:t>
       </w:r>
-      <w:hyperlink r:id="rId163">
+      <w:hyperlink r:id="rId164">
         <w:r>
           <w:rPr>
             <w:rStyle w:val="Hyperlink"/>
@@ -53452,8 +53463,8 @@
         <w:t xml:space="preserve">.</w:t>
       </w:r>
     </w:p>
-    <w:bookmarkEnd w:id="164"/>
-    <w:bookmarkStart w:id="165" w:name="ref-HobbsN.Thompson2015Bmas"/>
+    <w:bookmarkEnd w:id="165"/>
+    <w:bookmarkStart w:id="166" w:name="ref-HobbsN.Thompson2015Bmas"/>
     <w:p>
       <w:pPr>
         <w:pStyle w:val="Bibliography"/>
@@ -53475,8 +53486,8 @@
         <w:t xml:space="preserve">. STU - Student edition. Princeton University Press.</w:t>
       </w:r>
     </w:p>
-    <w:bookmarkEnd w:id="165"/>
-    <w:bookmarkStart w:id="166" w:name="ref-hosmer1989applied"/>
+    <w:bookmarkEnd w:id="166"/>
+    <w:bookmarkStart w:id="167" w:name="ref-hosmer1989applied"/>
     <w:p>
       <w:pPr>
         <w:pStyle w:val="Bibliography"/>
@@ -53498,8 +53509,8 @@
         <w:t xml:space="preserve">. Wiley.</w:t>
       </w:r>
     </w:p>
-    <w:bookmarkEnd w:id="166"/>
-    <w:bookmarkStart w:id="168" w:name="ref-kery-bayes-pop"/>
+    <w:bookmarkEnd w:id="167"/>
+    <w:bookmarkStart w:id="169" w:name="ref-kery-bayes-pop"/>
     <w:p>
       <w:pPr>
         <w:pStyle w:val="Bibliography"/>
@@ -53551,7 +53562,7 @@
       <w:r>
         <w:t xml:space="preserve"> </w:t>
       </w:r>
-      <w:hyperlink r:id="rId167">
+      <w:hyperlink r:id="rId168">
         <w:r>
           <w:rPr>
             <w:rStyle w:val="Hyperlink"/>
@@ -53563,8 +53574,8 @@
         <w:t xml:space="preserve">.</w:t>
       </w:r>
     </w:p>
-    <w:bookmarkEnd w:id="168"/>
-    <w:bookmarkStart w:id="169" w:name="ref-korner.bayes.ecology"/>
+    <w:bookmarkEnd w:id="169"/>
+    <w:bookmarkStart w:id="170" w:name="ref-korner.bayes.ecology"/>
     <w:p>
       <w:pPr>
         <w:pStyle w:val="Bibliography"/>
@@ -53642,8 +53653,8 @@
         <w:t xml:space="preserve">. 1st ed. Academic Press.</w:t>
       </w:r>
     </w:p>
-    <w:bookmarkEnd w:id="169"/>
-    <w:bookmarkStart w:id="170" w:name="ref-statrethink2e"/>
+    <w:bookmarkEnd w:id="170"/>
+    <w:bookmarkStart w:id="171" w:name="ref-statrethink2e"/>
     <w:p>
       <w:pPr>
         <w:pStyle w:val="Bibliography"/>
@@ -53735,8 +53746,8 @@
         <w:t xml:space="preserve">. Second edition. Chapman &amp; Hall/CRC Texts in Statistical Science Series. CRC Press.</w:t>
       </w:r>
     </w:p>
-    <w:bookmarkEnd w:id="170"/>
-    <w:bookmarkStart w:id="172" w:name="ref-rossbayes"/>
+    <w:bookmarkEnd w:id="171"/>
+    <w:bookmarkStart w:id="173" w:name="ref-rossbayes"/>
     <w:p>
       <w:pPr>
         <w:pStyle w:val="Bibliography"/>
@@ -53760,7 +53771,7 @@
       <w:r>
         <w:t xml:space="preserve"> </w:t>
       </w:r>
-      <w:hyperlink r:id="rId171">
+      <w:hyperlink r:id="rId172">
         <w:r>
           <w:rPr>
             <w:rStyle w:val="Hyperlink"/>
@@ -53772,8 +53783,8 @@
         <w:t xml:space="preserve">.</w:t>
       </w:r>
     </w:p>
-    <w:bookmarkEnd w:id="172"/>
-    <w:bookmarkStart w:id="174" w:name="ref-venables2002modern"/>
+    <w:bookmarkEnd w:id="173"/>
+    <w:bookmarkStart w:id="175" w:name="ref-venables2002modern"/>
     <w:p>
       <w:pPr>
         <w:pStyle w:val="Bibliography"/>
@@ -53811,7 +53822,7 @@
       <w:r>
         <w:t xml:space="preserve"> </w:t>
       </w:r>
-      <w:hyperlink r:id="rId173">
+      <w:hyperlink r:id="rId174">
         <w:r>
           <w:rPr>
             <w:rStyle w:val="Hyperlink"/>
@@ -53823,9 +53834,9 @@
         <w:t xml:space="preserve">.</w:t>
       </w:r>
     </w:p>
-    <w:bookmarkEnd w:id="174"/>
     <w:bookmarkEnd w:id="175"/>
     <w:bookmarkEnd w:id="176"/>
+    <w:bookmarkEnd w:id="177"/>
     <w:sectPr>
       <w:footnotePr>
         <w:numRestart w:val="eachSect"/>

</xml_diff>

<commit_message>
Deploying to gh-pages from @ Morrison-Lab/sds@eb5c1ce2f1c6354bfe4d23165ca70c505c1decfa 🚀
</commit_message>
<xml_diff>
--- a/bayesian-inference-handout.docx
+++ b/bayesian-inference-handout.docx
@@ -15,7 +15,7 @@
         <w:pStyle w:val="Date"/>
       </w:pPr>
       <w:r>
-        <w:t xml:space="preserve">Last modified: 2026-10-13 22:24:25 (PDT)</w:t>
+        <w:t xml:space="preserve">Last modified: 2026-10-13 22:36:40 (PDT)</w:t>
       </w:r>
     </w:p>
     <w:p>
@@ -1014,7 +1014,7 @@
     </w:p>
     <w:bookmarkEnd w:id="18"/>
     <w:bookmarkEnd w:id="19"/>
-    <w:bookmarkStart w:id="72" w:name="sec-bayes-equation"/>
+    <w:bookmarkStart w:id="73" w:name="sec-bayes-equation"/>
     <w:p>
       <w:pPr>
         <w:pStyle w:val="Heading2"/>
@@ -11366,7 +11366,7 @@
     </w:p>
     <w:bookmarkEnd w:id="38"/>
     <w:bookmarkEnd w:id="39"/>
-    <w:bookmarkStart w:id="51" w:name="sec-bayes-map"/>
+    <w:bookmarkStart w:id="52" w:name="sec-bayes-map"/>
     <w:p>
       <w:pPr>
         <w:pStyle w:val="Heading3"/>
@@ -11664,19 +11664,11 @@
       </m:oMathPara>
       <w:bookmarkEnd w:id="40"/>
     </w:p>
-    <w:p>
-      <w:pPr>
-        <w:pStyle w:val="FirstParagraph"/>
-      </w:pPr>
-      <w:r>
-        <w:t xml:space="preserve">The MAP estimate is the mode of the posterior distribution.</w:t>
-      </w:r>
-    </w:p>
     <w:bookmarkEnd w:id="41"/>
     <w:bookmarkStart w:id="43" w:name="exm-map-beta-bernoulli"/>
     <w:p>
       <w:pPr>
-        <w:pStyle w:val="BodyText"/>
+        <w:pStyle w:val="FirstParagraph"/>
       </w:pPr>
       <w:r>
         <w:rPr>
@@ -13400,7 +13392,27 @@
       </w:r>
     </w:p>
     <w:bookmarkEnd w:id="43"/>
-    <w:bookmarkStart w:id="45" w:name="cor-map-penalized"/>
+    <w:bookmarkStart w:id="44" w:name="rem-map-posterior-mode"/>
+    <w:p>
+      <w:pPr>
+        <w:pStyle w:val="BodyText"/>
+      </w:pPr>
+      <w:r>
+        <w:rPr>
+          <w:i/>
+          <w:iCs/>
+        </w:rPr>
+        <w:t xml:space="preserve">Remark 2</w:t>
+      </w:r>
+      <w:r>
+        <w:t xml:space="preserve"> (The MAP estimate is the posterior mode). </w:t>
+      </w:r>
+      <w:r>
+        <w:t xml:space="preserve">The MAP estimate is the mode of the posterior distribution.</w:t>
+      </w:r>
+    </w:p>
+    <w:bookmarkEnd w:id="44"/>
+    <w:bookmarkStart w:id="46" w:name="cor-map-penalized"/>
     <w:p>
       <w:pPr>
         <w:pStyle w:val="BodyText"/>
@@ -13440,7 +13452,7 @@
       <w:pPr>
         <w:pStyle w:val="BodyText"/>
       </w:pPr>
-      <w:bookmarkStart w:id="44" w:name="eq-map-penalized"/>
+      <w:bookmarkStart w:id="45" w:name="eq-map-penalized"/>
       <m:oMathPara>
         <m:oMathParaPr>
           <m:jc m:val="center"/>
@@ -13652,7 +13664,7 @@
           </m:r>
         </m:oMath>
       </m:oMathPara>
-      <w:bookmarkEnd w:id="44"/>
+      <w:bookmarkEnd w:id="45"/>
     </w:p>
     <w:p>
       <w:pPr>
@@ -13725,7 +13737,7 @@
         <w:t xml:space="preserve">, is the penalty that the prior adds.</w:t>
       </w:r>
     </w:p>
-    <w:bookmarkEnd w:id="45"/>
+    <w:bookmarkEnd w:id="46"/>
     <w:p>
       <w:pPr>
         <w:pStyle w:val="BodyText"/>
@@ -14129,7 +14141,7 @@
         <w:t xml:space="preserve">Maximizing a function is the same as minimizing its negative.</w:t>
       </w:r>
     </w:p>
-    <w:bookmarkStart w:id="50" w:name="exm-map-normal-normal"/>
+    <w:bookmarkStart w:id="51" w:name="exm-map-normal-normal"/>
     <w:p>
       <w:pPr>
         <w:pStyle w:val="BodyText"/>
@@ -15111,7 +15123,7 @@
       <w:tr>
         <w:tc>
           <w:tcPr/>
-          <w:bookmarkStart w:id="49" w:name="fig-map-penalized"/>
+          <w:bookmarkStart w:id="50" w:name="fig-map-penalized"/>
           <w:p>
             <w:pPr>
               <w:pStyle w:val="SourceCode"/>
@@ -16276,18 +16288,18 @@
                 <wp:inline>
                   <wp:extent cx="4620126" cy="3696101"/>
                   <wp:effectExtent b="0" l="0" r="0" t="0"/>
-                  <wp:docPr descr="" title="" id="47" name="Picture"/>
+                  <wp:docPr descr="" title="" id="48" name="Picture"/>
                   <a:graphic>
                     <a:graphicData uri="http://schemas.openxmlformats.org/drawingml/2006/picture">
                       <pic:pic>
                         <pic:nvPicPr>
-                          <pic:cNvPr descr="bayesian-inference_files/figure-docx/unnamed-chunk-1-1.png" id="48" name="Picture"/>
+                          <pic:cNvPr descr="bayesian-inference_files/figure-docx/unnamed-chunk-1-1.png" id="49" name="Picture"/>
                           <pic:cNvPicPr>
                             <a:picLocks noChangeArrowheads="1" noChangeAspect="1"/>
                           </pic:cNvPicPr>
                         </pic:nvPicPr>
                         <pic:blipFill>
-                          <a:blip r:embed="rId46"/>
+                          <a:blip r:embed="rId47"/>
                           <a:stretch>
                             <a:fillRect/>
                           </a:stretch>
@@ -16333,13 +16345,13 @@
               <w:t xml:space="preserve">The dashed lines mark the sample mean (right) and the MAP estimate (left).</w:t>
             </w:r>
           </w:p>
-          <w:bookmarkEnd w:id="49"/>
+          <w:bookmarkEnd w:id="50"/>
         </w:tc>
       </w:tr>
     </w:tbl>
-    <w:bookmarkEnd w:id="50"/>
     <w:bookmarkEnd w:id="51"/>
-    <w:bookmarkStart w:id="66" w:name="sec-bayes-interval-interp"/>
+    <w:bookmarkEnd w:id="52"/>
+    <w:bookmarkStart w:id="67" w:name="sec-bayes-interval-interp"/>
     <w:p>
       <w:pPr>
         <w:pStyle w:val="Heading3"/>
@@ -16373,7 +16385,7 @@
       <w:r>
         <w:t xml:space="preserve"> </w:t>
       </w:r>
-      <w:hyperlink r:id="rId52">
+      <w:hyperlink r:id="rId53">
         <w:r>
           <w:rPr>
             <w:rStyle w:val="Hyperlink"/>
@@ -16472,7 +16484,7 @@
         <w:t xml:space="preserve">given the data actually observed.</w:t>
       </w:r>
     </w:p>
-    <w:bookmarkStart w:id="53" w:name="def-credible-interval"/>
+    <w:bookmarkStart w:id="54" w:name="def-credible-interval"/>
     <w:p>
       <w:pPr>
         <w:pStyle w:val="BodyText"/>
@@ -16864,7 +16876,7 @@
         </m:oMath>
       </m:oMathPara>
     </w:p>
-    <w:bookmarkEnd w:id="53"/>
+    <w:bookmarkEnd w:id="54"/>
     <w:p>
       <w:pPr>
         <w:pStyle w:val="FirstParagraph"/>
@@ -16951,7 +16963,7 @@
         <w:t xml:space="preserve">is the equal-tailed interval.</w:t>
       </w:r>
     </w:p>
-    <w:bookmarkStart w:id="54" w:name="def-equal-tailed-interval"/>
+    <w:bookmarkStart w:id="55" w:name="def-equal-tailed-interval"/>
     <w:p>
       <w:pPr>
         <w:pStyle w:val="BodyText"/>
@@ -17110,8 +17122,8 @@
         <w:t xml:space="preserve">.</w:t>
       </w:r>
     </w:p>
-    <w:bookmarkEnd w:id="54"/>
-    <w:bookmarkStart w:id="55" w:name="exm-equal-tailed-interval"/>
+    <w:bookmarkEnd w:id="55"/>
+    <w:bookmarkStart w:id="56" w:name="exm-equal-tailed-interval"/>
     <w:p>
       <w:pPr>
         <w:pStyle w:val="BodyText"/>
@@ -17398,8 +17410,8 @@
         <w:t xml:space="preserve">.</w:t>
       </w:r>
     </w:p>
-    <w:bookmarkEnd w:id="55"/>
-    <w:bookmarkStart w:id="60" w:name="exm-normal-credible-vs-confidence"/>
+    <w:bookmarkEnd w:id="56"/>
+    <w:bookmarkStart w:id="61" w:name="exm-normal-credible-vs-confidence"/>
     <w:p>
       <w:pPr>
         <w:pStyle w:val="BodyText"/>
@@ -18589,7 +18601,7 @@
       <w:tr>
         <w:tc>
           <w:tcPr/>
-          <w:bookmarkStart w:id="59" w:name="fig-normal-prior-lik-post"/>
+          <w:bookmarkStart w:id="60" w:name="fig-normal-prior-lik-post"/>
           <w:p>
             <w:pPr>
               <w:pStyle w:val="SourceCode"/>
@@ -19388,18 +19400,18 @@
                 <wp:inline>
                   <wp:extent cx="4620126" cy="3696101"/>
                   <wp:effectExtent b="0" l="0" r="0" t="0"/>
-                  <wp:docPr descr="" title="" id="57" name="Picture"/>
+                  <wp:docPr descr="" title="" id="58" name="Picture"/>
                   <a:graphic>
                     <a:graphicData uri="http://schemas.openxmlformats.org/drawingml/2006/picture">
                       <pic:pic>
                         <pic:nvPicPr>
-                          <pic:cNvPr descr="bayesian-inference_files/figure-docx/unnamed-chunk-2-1.png" id="58" name="Picture"/>
+                          <pic:cNvPr descr="bayesian-inference_files/figure-docx/unnamed-chunk-2-1.png" id="59" name="Picture"/>
                           <pic:cNvPicPr>
                             <a:picLocks noChangeArrowheads="1" noChangeAspect="1"/>
                           </pic:cNvPicPr>
                         </pic:nvPicPr>
                         <pic:blipFill>
-                          <a:blip r:embed="rId56"/>
+                          <a:blip r:embed="rId57"/>
                           <a:stretch>
                             <a:fillRect/>
                           </a:stretch>
@@ -19521,7 +19533,7 @@
               <w:t xml:space="preserve">.</w:t>
             </w:r>
           </w:p>
-          <w:bookmarkEnd w:id="59"/>
+          <w:bookmarkEnd w:id="60"/>
         </w:tc>
       </w:tr>
     </w:tbl>
@@ -19777,8 +19789,8 @@
         <w:t xml:space="preserve">since both are fixed.</w:t>
       </w:r>
     </w:p>
-    <w:bookmarkEnd w:id="60"/>
-    <w:bookmarkStart w:id="65" w:name="exm-discrete-prior"/>
+    <w:bookmarkEnd w:id="61"/>
+    <w:bookmarkStart w:id="66" w:name="exm-discrete-prior"/>
     <w:p>
       <w:pPr>
         <w:pStyle w:val="BodyText"/>
@@ -22702,7 +22714,7 @@
       <w:tr>
         <w:tc>
           <w:tcPr/>
-          <w:bookmarkStart w:id="64" w:name="fig-discrete-prior"/>
+          <w:bookmarkStart w:id="65" w:name="fig-discrete-prior"/>
           <w:p>
             <w:pPr>
               <w:pStyle w:val="Compact"/>
@@ -22713,18 +22725,18 @@
                 <wp:inline>
                   <wp:extent cx="4620126" cy="3696101"/>
                   <wp:effectExtent b="0" l="0" r="0" t="0"/>
-                  <wp:docPr descr="" title="" id="62" name="Picture"/>
+                  <wp:docPr descr="" title="" id="63" name="Picture"/>
                   <a:graphic>
                     <a:graphicData uri="http://schemas.openxmlformats.org/drawingml/2006/picture">
                       <pic:pic>
                         <pic:nvPicPr>
-                          <pic:cNvPr descr="bayesian-inference_files/figure-docx/fig-discrete-prior-1.png" id="63" name="Picture"/>
+                          <pic:cNvPr descr="bayesian-inference_files/figure-docx/fig-discrete-prior-1.png" id="64" name="Picture"/>
                           <pic:cNvPicPr>
                             <a:picLocks noChangeArrowheads="1" noChangeAspect="1"/>
                           </pic:cNvPicPr>
                         </pic:nvPicPr>
                         <pic:blipFill>
-                          <a:blip r:embed="rId61"/>
+                          <a:blip r:embed="rId62"/>
                           <a:stretch>
                             <a:fillRect/>
                           </a:stretch>
@@ -22764,7 +22776,7 @@
               <w:t xml:space="preserve">Figure 3: Prior and posterior probabilities on the grid of values of the success probability, after 8 successes in 10 trials.</w:t>
             </w:r>
           </w:p>
-          <w:bookmarkEnd w:id="64"/>
+          <w:bookmarkEnd w:id="65"/>
         </w:tc>
       </w:tr>
     </w:tbl>
@@ -24233,9 +24245,9 @@
         <w:t xml:space="preserve">here its posterior probability is 0.9866, not 0.95.</w:t>
       </w:r>
     </w:p>
-    <w:bookmarkEnd w:id="65"/>
     <w:bookmarkEnd w:id="66"/>
-    <w:bookmarkStart w:id="71" w:name="sec-bayes-parameter-space"/>
+    <w:bookmarkEnd w:id="67"/>
+    <w:bookmarkStart w:id="72" w:name="sec-bayes-parameter-space"/>
     <w:p>
       <w:pPr>
         <w:pStyle w:val="Heading3"/>
@@ -24244,7 +24256,7 @@
         <w:t xml:space="preserve">2.4 The parameter space</w:t>
       </w:r>
     </w:p>
-    <w:bookmarkStart w:id="67" w:name="def-parameter-space"/>
+    <w:bookmarkStart w:id="68" w:name="def-parameter-space"/>
     <w:p>
       <w:pPr>
         <w:pStyle w:val="FirstParagraph"/>
@@ -24310,7 +24322,7 @@
         <w:t xml:space="preserve">can take.</w:t>
       </w:r>
     </w:p>
-    <w:bookmarkEnd w:id="67"/>
+    <w:bookmarkEnd w:id="68"/>
     <w:p>
       <w:pPr>
         <w:pStyle w:val="BodyText"/>
@@ -24354,7 +24366,7 @@
         <w:t xml:space="preserve">and the prior has to respect it.</w:t>
       </w:r>
     </w:p>
-    <w:bookmarkStart w:id="68" w:name="exm-parameter-space"/>
+    <w:bookmarkStart w:id="69" w:name="exm-parameter-space"/>
     <w:p>
       <w:pPr>
         <w:pStyle w:val="BodyText"/>
@@ -24613,8 +24625,8 @@
         <w:t xml:space="preserve">.</w:t>
       </w:r>
     </w:p>
-    <w:bookmarkEnd w:id="68"/>
-    <w:bookmarkStart w:id="69" w:name="cor-prior-support"/>
+    <w:bookmarkEnd w:id="69"/>
+    <w:bookmarkStart w:id="70" w:name="cor-prior-support"/>
     <w:p>
       <w:pPr>
         <w:pStyle w:val="FirstParagraph"/>
@@ -24818,7 +24830,7 @@
         <w:t xml:space="preserve">.</w:t>
       </w:r>
     </w:p>
-    <w:bookmarkEnd w:id="69"/>
+    <w:bookmarkEnd w:id="70"/>
     <w:p>
       <w:pPr>
         <w:pStyle w:val="BodyText"/>
@@ -24943,7 +24955,7 @@
         <w:t xml:space="preserve">.</w:t>
       </w:r>
     </w:p>
-    <w:bookmarkStart w:id="70" w:name="exm-prior-support"/>
+    <w:bookmarkStart w:id="71" w:name="exm-prior-support"/>
     <w:p>
       <w:pPr>
         <w:pStyle w:val="BodyText"/>
@@ -25078,10 +25090,10 @@
         <w:t xml:space="preserve">and one that no amount of data can correct.</w:t>
       </w:r>
     </w:p>
-    <w:bookmarkEnd w:id="70"/>
     <w:bookmarkEnd w:id="71"/>
     <w:bookmarkEnd w:id="72"/>
-    <w:bookmarkStart w:id="103" w:name="sec-bayes-priors"/>
+    <w:bookmarkEnd w:id="73"/>
+    <w:bookmarkStart w:id="104" w:name="sec-bayes-priors"/>
     <w:p>
       <w:pPr>
         <w:pStyle w:val="Heading2"/>
@@ -25156,7 +25168,7 @@
         <w:t xml:space="preserve">.</w:t>
       </w:r>
     </w:p>
-    <w:bookmarkStart w:id="86" w:name="sec-bayes-conjugate"/>
+    <w:bookmarkStart w:id="87" w:name="sec-bayes-conjugate"/>
     <w:p>
       <w:pPr>
         <w:pStyle w:val="Heading3"/>
@@ -25165,7 +25177,7 @@
         <w:t xml:space="preserve">3.1 Conjugate priors</w:t>
       </w:r>
     </w:p>
-    <w:bookmarkStart w:id="73" w:name="def-conjugate-prior"/>
+    <w:bookmarkStart w:id="74" w:name="def-conjugate-prior"/>
     <w:p>
       <w:pPr>
         <w:pStyle w:val="FirstParagraph"/>
@@ -25229,7 +25241,7 @@
         <w:t xml:space="preserve">is also in the family.</w:t>
       </w:r>
     </w:p>
-    <w:bookmarkEnd w:id="73"/>
+    <w:bookmarkEnd w:id="74"/>
     <w:p>
       <w:pPr>
         <w:pStyle w:val="BodyText"/>
@@ -25278,7 +25290,7 @@
       <w:r>
         <w:t xml:space="preserve"> </w:t>
       </w:r>
-      <w:hyperlink r:id="rId74">
+      <w:hyperlink r:id="rId75">
         <w:r>
           <w:rPr>
             <w:rStyle w:val="Hyperlink"/>
@@ -25295,7 +25307,7 @@
         <w:t xml:space="preserve">(Statistical Rethinking 2026, Lecture A02).</w:t>
       </w:r>
     </w:p>
-    <w:bookmarkStart w:id="75" w:name="exm-beta-bernoulli"/>
+    <w:bookmarkStart w:id="76" w:name="exm-beta-bernoulli"/>
     <w:p>
       <w:pPr>
         <w:pStyle w:val="BodyText"/>
@@ -27390,8 +27402,8 @@
         <w:t xml:space="preserve">or does not.</w:t>
       </w:r>
     </w:p>
-    <w:bookmarkEnd w:id="75"/>
-    <w:bookmarkStart w:id="85" w:name="exm-prior-posterior-figure"/>
+    <w:bookmarkEnd w:id="76"/>
+    <w:bookmarkStart w:id="86" w:name="exm-prior-posterior-figure"/>
     <w:p>
       <w:pPr>
         <w:pStyle w:val="BodyText"/>
@@ -27668,7 +27680,7 @@
       <w:r>
         <w:t xml:space="preserve"> </w:t>
       </w:r>
-      <w:hyperlink r:id="rId76">
+      <w:hyperlink r:id="rId77">
         <w:r>
           <w:rPr>
             <w:rStyle w:val="VerbatimChar"/>
@@ -27688,7 +27700,7 @@
       <w:r>
         <w:t xml:space="preserve"> </w:t>
       </w:r>
-      <w:hyperlink r:id="rId77">
+      <w:hyperlink r:id="rId78">
         <w:r>
           <w:rPr>
             <w:rStyle w:val="Hyperlink"/>
@@ -29653,7 +29665,7 @@
       <w:tr>
         <w:tc>
           <w:tcPr/>
-          <w:bookmarkStart w:id="84" w:name="fig-prior-posterior"/>
+          <w:bookmarkStart w:id="85" w:name="fig-prior-posterior"/>
           <w:p>
             <w:pPr>
               <w:pStyle w:val="Heading4"/>
@@ -31097,18 +31109,18 @@
                 <wp:inline>
                   <wp:extent cx="4620126" cy="3696101"/>
                   <wp:effectExtent b="0" l="0" r="0" t="0"/>
-                  <wp:docPr descr="" title="" id="79" name="Picture"/>
+                  <wp:docPr descr="" title="" id="80" name="Picture"/>
                   <a:graphic>
                     <a:graphicData uri="http://schemas.openxmlformats.org/drawingml/2006/picture">
                       <pic:pic>
                         <pic:nvPicPr>
-                          <pic:cNvPr descr="bayesian-inference_files/figure-docx/prior-posterior-plot-1.png" id="80" name="Picture"/>
+                          <pic:cNvPr descr="bayesian-inference_files/figure-docx/prior-posterior-plot-1.png" id="81" name="Picture"/>
                           <pic:cNvPicPr>
                             <a:picLocks noChangeArrowheads="1" noChangeAspect="1"/>
                           </pic:cNvPicPr>
                         </pic:nvPicPr>
                         <pic:blipFill>
-                          <a:blip r:embed="rId78"/>
+                          <a:blip r:embed="rId79"/>
                           <a:stretch>
                             <a:fillRect/>
                           </a:stretch>
@@ -31801,18 +31813,18 @@
                 <wp:inline>
                   <wp:extent cx="5334000" cy="2333625"/>
                   <wp:effectExtent b="0" l="0" r="0" t="0"/>
-                  <wp:docPr descr="" title="" id="82" name="Picture"/>
+                  <wp:docPr descr="" title="" id="83" name="Picture"/>
                   <a:graphic>
                     <a:graphicData uri="http://schemas.openxmlformats.org/drawingml/2006/picture">
                       <pic:pic>
                         <pic:nvPicPr>
-                          <pic:cNvPr descr="bayesian-inference_files/figure-docx/prior-posterior-plot-py-1.png" id="83" name="Picture"/>
+                          <pic:cNvPr descr="bayesian-inference_files/figure-docx/prior-posterior-plot-py-1.png" id="84" name="Picture"/>
                           <pic:cNvPicPr>
                             <a:picLocks noChangeArrowheads="1" noChangeAspect="1"/>
                           </pic:cNvPicPr>
                         </pic:nvPicPr>
                         <pic:blipFill>
-                          <a:blip r:embed="rId81"/>
+                          <a:blip r:embed="rId82"/>
                           <a:stretch>
                             <a:fillRect/>
                           </a:stretch>
@@ -31993,7 +32005,7 @@
               <w:t xml:space="preserve">is unknown.</w:t>
             </w:r>
           </w:p>
-          <w:bookmarkEnd w:id="84"/>
+          <w:bookmarkEnd w:id="85"/>
         </w:tc>
       </w:tr>
     </w:tbl>
@@ -32271,9 +32283,9 @@
         <w:t xml:space="preserve">is the narrower of the two.</w:t>
       </w:r>
     </w:p>
-    <w:bookmarkEnd w:id="85"/>
     <w:bookmarkEnd w:id="86"/>
-    <w:bookmarkStart w:id="98" w:name="sec-bayes-informativeness"/>
+    <w:bookmarkEnd w:id="87"/>
+    <w:bookmarkStart w:id="99" w:name="sec-bayes-informativeness"/>
     <w:p>
       <w:pPr>
         <w:pStyle w:val="Heading3"/>
@@ -32307,7 +32319,7 @@
         <w:t xml:space="preserve">.</w:t>
       </w:r>
     </w:p>
-    <w:bookmarkStart w:id="87" w:name="def-informative-prior"/>
+    <w:bookmarkStart w:id="88" w:name="def-informative-prior"/>
     <w:p>
       <w:pPr>
         <w:pStyle w:val="BodyText"/>
@@ -32371,8 +32383,8 @@
         <w:t xml:space="preserve">such as previous studies, biological limits, or expert judgment.</w:t>
       </w:r>
     </w:p>
-    <w:bookmarkEnd w:id="87"/>
-    <w:bookmarkStart w:id="88" w:name="rem-informative-prior-pull"/>
+    <w:bookmarkEnd w:id="88"/>
+    <w:bookmarkStart w:id="89" w:name="rem-informative-prior-pull"/>
     <w:p>
       <w:pPr>
         <w:pStyle w:val="BodyText"/>
@@ -32382,7 +32394,7 @@
           <w:i/>
           <w:iCs/>
         </w:rPr>
-        <w:t xml:space="preserve">Remark 2</w:t>
+        <w:t xml:space="preserve">Remark 3</w:t>
       </w:r>
       <w:r>
         <w:t xml:space="preserve"> (An informative prior pulls the posterior). </w:t>
@@ -32397,8 +32409,8 @@
         <w:t xml:space="preserve">most strongly when the data are sparse.</w:t>
       </w:r>
     </w:p>
-    <w:bookmarkEnd w:id="88"/>
-    <w:bookmarkStart w:id="89" w:name="def-weakly-informative-prior"/>
+    <w:bookmarkEnd w:id="89"/>
+    <w:bookmarkStart w:id="90" w:name="def-weakly-informative-prior"/>
     <w:p>
       <w:pPr>
         <w:pStyle w:val="BodyText"/>
@@ -32473,8 +32485,8 @@
         <w:t xml:space="preserve">across the range of scientifically plausible values.</w:t>
       </w:r>
     </w:p>
-    <w:bookmarkEnd w:id="89"/>
-    <w:bookmarkStart w:id="90" w:name="def-flat-prior"/>
+    <w:bookmarkEnd w:id="90"/>
+    <w:bookmarkStart w:id="91" w:name="def-flat-prior"/>
     <w:p>
       <w:pPr>
         <w:pStyle w:val="BodyText"/>
@@ -32631,8 +32643,8 @@
         <w:t xml:space="preserve">.</w:t>
       </w:r>
     </w:p>
-    <w:bookmarkEnd w:id="90"/>
-    <w:bookmarkStart w:id="91" w:name="def-improper-prior"/>
+    <w:bookmarkEnd w:id="91"/>
+    <w:bookmarkStart w:id="92" w:name="def-improper-prior"/>
     <w:p>
       <w:pPr>
         <w:pStyle w:val="BodyText"/>
@@ -32714,8 +32726,8 @@
         <w:t xml:space="preserve">so that it is not a probability density.</w:t>
       </w:r>
     </w:p>
-    <w:bookmarkEnd w:id="91"/>
-    <w:bookmarkStart w:id="92" w:name="exm-prior-spectrum"/>
+    <w:bookmarkEnd w:id="92"/>
+    <w:bookmarkStart w:id="93" w:name="exm-prior-spectrum"/>
     <w:p>
       <w:pPr>
         <w:pStyle w:val="BodyText"/>
@@ -33711,8 +33723,8 @@
         <w:t xml:space="preserve">.</w:t>
       </w:r>
     </w:p>
-    <w:bookmarkEnd w:id="92"/>
-    <w:bookmarkStart w:id="93" w:name="exm-flat-prior-reparam"/>
+    <w:bookmarkEnd w:id="93"/>
+    <w:bookmarkStart w:id="94" w:name="exm-flat-prior-reparam"/>
     <w:p>
       <w:pPr>
         <w:pStyle w:val="BodyText"/>
@@ -35134,8 +35146,8 @@
         <w:t xml:space="preserve">therefore depends on the parameterization.</w:t>
       </w:r>
     </w:p>
-    <w:bookmarkEnd w:id="93"/>
-    <w:bookmarkStart w:id="95" w:name="cor-flat-prior-posterior"/>
+    <w:bookmarkEnd w:id="94"/>
+    <w:bookmarkStart w:id="96" w:name="cor-flat-prior-posterior"/>
     <w:p>
       <w:pPr>
         <w:pStyle w:val="BodyText"/>
@@ -35368,7 +35380,7 @@
       <w:r>
         <w:t xml:space="preserve"> </w:t>
       </w:r>
-      <w:hyperlink r:id="rId94">
+      <w:hyperlink r:id="rId95">
         <w:r>
           <w:rPr>
             <w:rStyle w:val="Hyperlink"/>
@@ -35380,7 +35392,7 @@
         <w:t xml:space="preserve">.</w:t>
       </w:r>
     </w:p>
-    <w:bookmarkEnd w:id="95"/>
+    <w:bookmarkEnd w:id="96"/>
     <w:p>
       <w:pPr>
         <w:pStyle w:val="BodyText"/>
@@ -35577,7 +35589,7 @@
         <w:t xml:space="preserve">Multiplying a function by a positive constant does not change where it is maximized.</w:t>
       </w:r>
     </w:p>
-    <w:bookmarkStart w:id="96" w:name="rem-flat-prior-improper"/>
+    <w:bookmarkStart w:id="97" w:name="rem-flat-prior-improper"/>
     <w:p>
       <w:pPr>
         <w:pStyle w:val="BodyText"/>
@@ -35587,7 +35599,7 @@
           <w:i/>
           <w:iCs/>
         </w:rPr>
-        <w:t xml:space="preserve">Remark 3</w:t>
+        <w:t xml:space="preserve">Remark 4</w:t>
       </w:r>
       <w:r>
         <w:t xml:space="preserve"> (Flat priors can be improper). </w:t>
@@ -35726,8 +35738,8 @@
         <w:t xml:space="preserve">the posterior is again proportional to the likelihood.</w:t>
       </w:r>
     </w:p>
-    <w:bookmarkEnd w:id="96"/>
-    <w:bookmarkStart w:id="97" w:name="exm-flat-prior-posterior"/>
+    <w:bookmarkEnd w:id="97"/>
+    <w:bookmarkStart w:id="98" w:name="exm-flat-prior-posterior"/>
     <w:p>
       <w:pPr>
         <w:pStyle w:val="BodyText"/>
@@ -36230,9 +36242,9 @@
         <w:t xml:space="preserve">and so its mode, but a mean depends on the whole distribution.</w:t>
       </w:r>
     </w:p>
-    <w:bookmarkEnd w:id="97"/>
     <w:bookmarkEnd w:id="98"/>
-    <w:bookmarkStart w:id="102" w:name="sec-bayes-skeptical"/>
+    <w:bookmarkEnd w:id="99"/>
+    <w:bookmarkStart w:id="103" w:name="sec-bayes-skeptical"/>
     <w:p>
       <w:pPr>
         <w:pStyle w:val="Heading3"/>
@@ -36241,7 +36253,7 @@
         <w:t xml:space="preserve">3.3 A skeptical prior</w:t>
       </w:r>
     </w:p>
-    <w:bookmarkStart w:id="99" w:name="def-skeptical-prior"/>
+    <w:bookmarkStart w:id="100" w:name="def-skeptical-prior"/>
     <w:p>
       <w:pPr>
         <w:pStyle w:val="FirstParagraph"/>
@@ -36308,8 +36320,8 @@
         <w:t xml:space="preserve">.</w:t>
       </w:r>
     </w:p>
-    <w:bookmarkEnd w:id="99"/>
-    <w:bookmarkStart w:id="100" w:name="rem-skeptical-prior-meaning"/>
+    <w:bookmarkEnd w:id="100"/>
+    <w:bookmarkStart w:id="101" w:name="rem-skeptical-prior-meaning"/>
     <w:p>
       <w:pPr>
         <w:pStyle w:val="BodyText"/>
@@ -36319,7 +36331,7 @@
           <w:i/>
           <w:iCs/>
         </w:rPr>
-        <w:t xml:space="preserve">Remark 4</w:t>
+        <w:t xml:space="preserve">Remark 5</w:t>
       </w:r>
       <w:r>
         <w:t xml:space="preserve"> (What a skeptical prior asks). </w:t>
@@ -36334,8 +36346,8 @@
         <w:t xml:space="preserve">to overturn a default of no effect.</w:t>
       </w:r>
     </w:p>
-    <w:bookmarkEnd w:id="100"/>
-    <w:bookmarkStart w:id="101" w:name="exm-skeptical-prior"/>
+    <w:bookmarkEnd w:id="101"/>
+    <w:bookmarkStart w:id="102" w:name="exm-skeptical-prior"/>
     <w:p>
       <w:pPr>
         <w:pStyle w:val="BodyText"/>
@@ -38651,10 +38663,10 @@
         <w:t xml:space="preserve">.</w:t>
       </w:r>
     </w:p>
-    <w:bookmarkEnd w:id="101"/>
     <w:bookmarkEnd w:id="102"/>
     <w:bookmarkEnd w:id="103"/>
-    <w:bookmarkStart w:id="132" w:name="sec-bayes-predictive-checks"/>
+    <w:bookmarkEnd w:id="104"/>
+    <w:bookmarkStart w:id="135" w:name="sec-bayes-predictive-checks"/>
     <w:p>
       <w:pPr>
         <w:pStyle w:val="Heading2"/>
@@ -38718,7 +38730,7 @@
       <w:r>
         <w:t xml:space="preserve"> </w:t>
       </w:r>
-      <w:hyperlink r:id="rId104">
+      <w:hyperlink r:id="rId105">
         <w:r>
           <w:rPr>
             <w:rStyle w:val="Hyperlink"/>
@@ -38735,7 +38747,7 @@
         <w:t xml:space="preserve">(Statistical Rethinking 2026, Lecture A03).</w:t>
       </w:r>
     </w:p>
-    <w:bookmarkStart w:id="105" w:name="def-prior-predictive"/>
+    <w:bookmarkStart w:id="106" w:name="def-prior-predictive"/>
     <w:p>
       <w:pPr>
         <w:pStyle w:val="BodyText"/>
@@ -38903,7 +38915,16 @@
         <w:t xml:space="preserve"> </w:t>
       </w:r>
       <w:r>
-        <w:t xml:space="preserve">before any data are observed:</w:t>
+        <w:t xml:space="preserve">before any data are observed</w:t>
+      </w:r>
+      <w:r>
+        <w:t xml:space="preserve"> </w:t>
+      </w:r>
+      <w:r>
+        <w:t xml:space="preserve">(Gelman et al. 2013, sec. 1.3, p. 7, eq. 1.3)</w:t>
+      </w:r>
+      <w:r>
+        <w:t xml:space="preserve">:</w:t>
       </w:r>
     </w:p>
     <w:p>
@@ -39034,48 +39055,11 @@
         </m:oMath>
       </m:oMathPara>
     </w:p>
+    <w:bookmarkEnd w:id="106"/>
+    <w:bookmarkStart w:id="107" w:name="exm-prior-predictive"/>
     <w:p>
       <w:pPr>
         <w:pStyle w:val="FirstParagraph"/>
-      </w:pPr>
-      <w:r>
-        <w:t xml:space="preserve">It is the</w:t>
-      </w:r>
-      <w:r>
-        <w:t xml:space="preserve"> </w:t>
-      </w:r>
-      <w:hyperlink w:anchor="def-marginal-likelihood">
-        <w:r>
-          <w:rPr>
-            <w:rStyle w:val="Hyperlink"/>
-          </w:rPr>
-          <w:t xml:space="preserve">marginal likelihood</w:t>
-        </w:r>
-      </w:hyperlink>
-      <w:r>
-        <w:t xml:space="preserve">,</w:t>
-      </w:r>
-      <w:r>
-        <w:t xml:space="preserve"> </w:t>
-      </w:r>
-      <w:r>
-        <w:t xml:space="preserve">read as a distribution over possible data sets</w:t>
-      </w:r>
-      <w:r>
-        <w:t xml:space="preserve"> </w:t>
-      </w:r>
-      <w:r>
-        <w:t xml:space="preserve">(Gelman et al. 2013, sec. 1.3, p. 7, eq. 1.3)</w:t>
-      </w:r>
-      <w:r>
-        <w:t xml:space="preserve">.</w:t>
-      </w:r>
-    </w:p>
-    <w:bookmarkEnd w:id="105"/>
-    <w:bookmarkStart w:id="106" w:name="exm-prior-predictive"/>
-    <w:p>
-      <w:pPr>
-        <w:pStyle w:val="BodyText"/>
       </w:pPr>
       <w:r>
         <w:rPr>
@@ -40970,11 +40954,71 @@
         <w:t xml:space="preserve">#&gt; {'smallest': np.float64(0.005263157894736842), 'largest': np.float64(0.005263157894736846), 'one_over_n_plus_1': 0.005263157894736842}</w:t>
       </w:r>
     </w:p>
-    <w:bookmarkEnd w:id="106"/>
-    <w:bookmarkStart w:id="107" w:name="def-posterior-predictive"/>
+    <w:bookmarkEnd w:id="107"/>
+    <w:bookmarkStart w:id="108" w:name="rem-prior-predictive-marginal-likelihood"/>
     <w:p>
       <w:pPr>
         <w:pStyle w:val="FirstParagraph"/>
+      </w:pPr>
+      <w:r>
+        <w:rPr>
+          <w:i/>
+          <w:iCs/>
+        </w:rPr>
+        <w:t xml:space="preserve">Remark 6</w:t>
+      </w:r>
+      <w:r>
+        <w:t xml:space="preserve"> (The prior predictive distribution and the marginal likelihood). </w:t>
+      </w:r>
+      <w:r>
+        <w:t xml:space="preserve">The prior predictive distribution (</w:t>
+      </w:r>
+      <w:hyperlink w:anchor="def-prior-predictive">
+        <w:r>
+          <w:rPr>
+            <w:rStyle w:val="Hyperlink"/>
+          </w:rPr>
+          <w:t xml:space="preserve">Definition 16</w:t>
+        </w:r>
+      </w:hyperlink>
+      <w:r>
+        <w:t xml:space="preserve">) is the</w:t>
+      </w:r>
+      <w:r>
+        <w:t xml:space="preserve"> </w:t>
+      </w:r>
+      <w:hyperlink w:anchor="def-marginal-likelihood">
+        <w:r>
+          <w:rPr>
+            <w:rStyle w:val="Hyperlink"/>
+          </w:rPr>
+          <w:t xml:space="preserve">marginal likelihood</w:t>
+        </w:r>
+      </w:hyperlink>
+      <w:r>
+        <w:t xml:space="preserve">,</w:t>
+      </w:r>
+      <w:r>
+        <w:t xml:space="preserve"> </w:t>
+      </w:r>
+      <w:r>
+        <w:t xml:space="preserve">read as a distribution over possible data sets</w:t>
+      </w:r>
+      <w:r>
+        <w:t xml:space="preserve"> </w:t>
+      </w:r>
+      <w:r>
+        <w:t xml:space="preserve">(Gelman et al. 2013, sec. 1.3, p. 7, eq. 1.3)</w:t>
+      </w:r>
+      <w:r>
+        <w:t xml:space="preserve">.</w:t>
+      </w:r>
+    </w:p>
+    <w:bookmarkEnd w:id="108"/>
+    <w:bookmarkStart w:id="109" w:name="def-posterior-predictive"/>
+    <w:p>
+      <w:pPr>
+        <w:pStyle w:val="BodyText"/>
       </w:pPr>
       <w:r>
         <w:rPr>
@@ -41637,8 +41681,8 @@
         <w:t xml:space="preserve">gives the posterior predictive distribution of replicated data.</w:t>
       </w:r>
     </w:p>
-    <w:bookmarkEnd w:id="107"/>
-    <w:bookmarkStart w:id="108" w:name="exm-posterior-predictive"/>
+    <w:bookmarkEnd w:id="109"/>
+    <w:bookmarkStart w:id="110" w:name="exm-posterior-predictive"/>
     <w:p>
       <w:pPr>
         <w:pStyle w:val="BodyText"/>
@@ -43283,8 +43327,8 @@
         <w:t xml:space="preserve">#&gt; {'simulated': np.float64(0.3929), 'exact': np.float64(0.39267015706806285)}</w:t>
       </w:r>
     </w:p>
-    <w:bookmarkEnd w:id="108"/>
-    <w:bookmarkStart w:id="109" w:name="def-test-quantity"/>
+    <w:bookmarkEnd w:id="110"/>
+    <w:bookmarkStart w:id="111" w:name="def-test-quantity"/>
     <w:p>
       <w:pPr>
         <w:pStyle w:val="FirstParagraph"/>
@@ -43364,8 +43408,8 @@
         <w:t xml:space="preserve">.</w:t>
       </w:r>
     </w:p>
-    <w:bookmarkEnd w:id="109"/>
-    <w:bookmarkStart w:id="110" w:name="exm-test-quantity"/>
+    <w:bookmarkEnd w:id="111"/>
+    <w:bookmarkStart w:id="112" w:name="exm-test-quantity"/>
     <w:p>
       <w:pPr>
         <w:pStyle w:val="BodyText"/>
@@ -44721,8 +44765,8 @@
         <w:t xml:space="preserve">#&gt; {'T1': np.int64(74), 'T2': np.float64(0.36256218905472637)}</w:t>
       </w:r>
     </w:p>
-    <w:bookmarkEnd w:id="110"/>
-    <w:bookmarkStart w:id="111" w:name="def-prior-predictive-check"/>
+    <w:bookmarkEnd w:id="112"/>
+    <w:bookmarkStart w:id="113" w:name="def-prior-predictive-check"/>
     <w:p>
       <w:pPr>
         <w:pStyle w:val="FirstParagraph"/>
@@ -44881,8 +44925,8 @@
         <w:t xml:space="preserve">.</w:t>
       </w:r>
     </w:p>
-    <w:bookmarkEnd w:id="111"/>
-    <w:bookmarkStart w:id="119" w:name="exm-prior-predictive-check"/>
+    <w:bookmarkEnd w:id="113"/>
+    <w:bookmarkStart w:id="121" w:name="exm-prior-predictive-check"/>
     <w:p>
       <w:pPr>
         <w:pStyle w:val="BodyText"/>
@@ -46575,7 +46619,7 @@
       <w:tr>
         <w:tc>
           <w:tcPr/>
-          <w:bookmarkStart w:id="118" w:name="fig-prior-predictive-check"/>
+          <w:bookmarkStart w:id="120" w:name="fig-prior-predictive-check"/>
           <w:p>
             <w:pPr>
               <w:pStyle w:val="Heading4"/>
@@ -46930,18 +46974,18 @@
                 <wp:inline>
                   <wp:extent cx="4620126" cy="3696101"/>
                   <wp:effectExtent b="0" l="0" r="0" t="0"/>
-                  <wp:docPr descr="" title="" id="113" name="Picture"/>
+                  <wp:docPr descr="" title="" id="115" name="Picture"/>
                   <a:graphic>
                     <a:graphicData uri="http://schemas.openxmlformats.org/drawingml/2006/picture">
                       <pic:pic>
                         <pic:nvPicPr>
-                          <pic:cNvPr descr="bayesian-inference_files/figure-docx/prior-predictive-check-plot-1.png" id="114" name="Picture"/>
+                          <pic:cNvPr descr="bayesian-inference_files/figure-docx/prior-predictive-check-plot-1.png" id="116" name="Picture"/>
                           <pic:cNvPicPr>
                             <a:picLocks noChangeArrowheads="1" noChangeAspect="1"/>
                           </pic:cNvPicPr>
                         </pic:nvPicPr>
                         <pic:blipFill>
-                          <a:blip r:embed="rId112"/>
+                          <a:blip r:embed="rId114"/>
                           <a:stretch>
                             <a:fillRect/>
                           </a:stretch>
@@ -47409,18 +47453,18 @@
                 <wp:inline>
                   <wp:extent cx="5334000" cy="2333625"/>
                   <wp:effectExtent b="0" l="0" r="0" t="0"/>
-                  <wp:docPr descr="" title="" id="116" name="Picture"/>
+                  <wp:docPr descr="" title="" id="118" name="Picture"/>
                   <a:graphic>
                     <a:graphicData uri="http://schemas.openxmlformats.org/drawingml/2006/picture">
                       <pic:pic>
                         <pic:nvPicPr>
-                          <pic:cNvPr descr="bayesian-inference_files/figure-docx/prior-predictive-check-plot-py-1.png" id="117" name="Picture"/>
+                          <pic:cNvPr descr="bayesian-inference_files/figure-docx/prior-predictive-check-plot-py-1.png" id="119" name="Picture"/>
                           <pic:cNvPicPr>
                             <a:picLocks noChangeArrowheads="1" noChangeAspect="1"/>
                           </pic:cNvPicPr>
                         </pic:nvPicPr>
                         <pic:blipFill>
-                          <a:blip r:embed="rId115"/>
+                          <a:blip r:embed="rId117"/>
                           <a:stretch>
                             <a:fillRect/>
                           </a:stretch>
@@ -47493,7 +47537,7 @@
               <w:t xml:space="preserve">The dashed line is the observed count, 74.</w:t>
             </w:r>
           </w:p>
-          <w:bookmarkEnd w:id="118"/>
+          <w:bookmarkEnd w:id="120"/>
         </w:tc>
       </w:tr>
     </w:tbl>
@@ -47604,8 +47648,8 @@
         <w:t xml:space="preserve">before trusting a posterior built on it.</w:t>
       </w:r>
     </w:p>
-    <w:bookmarkEnd w:id="119"/>
-    <w:bookmarkStart w:id="120" w:name="def-posterior-predictive-check"/>
+    <w:bookmarkEnd w:id="121"/>
+    <w:bookmarkStart w:id="122" w:name="def-posterior-predictive-check"/>
     <w:p>
       <w:pPr>
         <w:pStyle w:val="BodyText"/>
@@ -47848,8 +47892,8 @@
         <w:t xml:space="preserve">.</w:t>
       </w:r>
     </w:p>
-    <w:bookmarkEnd w:id="120"/>
-    <w:bookmarkStart w:id="128" w:name="exm-posterior-predictive-check"/>
+    <w:bookmarkEnd w:id="122"/>
+    <w:bookmarkStart w:id="130" w:name="exm-posterior-predictive-check"/>
     <w:p>
       <w:pPr>
         <w:pStyle w:val="BodyText"/>
@@ -49937,7 +49981,7 @@
       <w:tr>
         <w:tc>
           <w:tcPr/>
-          <w:bookmarkStart w:id="127" w:name="fig-posterior-predictive-check"/>
+          <w:bookmarkStart w:id="129" w:name="fig-posterior-predictive-check"/>
           <w:p>
             <w:pPr>
               <w:pStyle w:val="Heading4"/>
@@ -50337,18 +50381,18 @@
                 <wp:inline>
                   <wp:extent cx="4620126" cy="3696101"/>
                   <wp:effectExtent b="0" l="0" r="0" t="0"/>
-                  <wp:docPr descr="" title="" id="122" name="Picture"/>
+                  <wp:docPr descr="" title="" id="124" name="Picture"/>
                   <a:graphic>
                     <a:graphicData uri="http://schemas.openxmlformats.org/drawingml/2006/picture">
                       <pic:pic>
                         <pic:nvPicPr>
-                          <pic:cNvPr descr="bayesian-inference_files/figure-docx/posterior-predictive-check-plot-1.png" id="123" name="Picture"/>
+                          <pic:cNvPr descr="bayesian-inference_files/figure-docx/posterior-predictive-check-plot-1.png" id="125" name="Picture"/>
                           <pic:cNvPicPr>
                             <a:picLocks noChangeArrowheads="1" noChangeAspect="1"/>
                           </pic:cNvPicPr>
                         </pic:nvPicPr>
                         <pic:blipFill>
-                          <a:blip r:embed="rId121"/>
+                          <a:blip r:embed="rId123"/>
                           <a:stretch>
                             <a:fillRect/>
                           </a:stretch>
@@ -50735,18 +50779,18 @@
                 <wp:inline>
                   <wp:extent cx="5334000" cy="2333625"/>
                   <wp:effectExtent b="0" l="0" r="0" t="0"/>
-                  <wp:docPr descr="" title="" id="125" name="Picture"/>
+                  <wp:docPr descr="" title="" id="127" name="Picture"/>
                   <a:graphic>
                     <a:graphicData uri="http://schemas.openxmlformats.org/drawingml/2006/picture">
                       <pic:pic>
                         <pic:nvPicPr>
-                          <pic:cNvPr descr="bayesian-inference_files/figure-docx/posterior-predictive-check-plot-py-1.png" id="126" name="Picture"/>
+                          <pic:cNvPr descr="bayesian-inference_files/figure-docx/posterior-predictive-check-plot-py-1.png" id="128" name="Picture"/>
                           <pic:cNvPicPr>
                             <a:picLocks noChangeArrowheads="1" noChangeAspect="1"/>
                           </pic:cNvPicPr>
                         </pic:nvPicPr>
                         <pic:blipFill>
-                          <a:blip r:embed="rId124"/>
+                          <a:blip r:embed="rId126"/>
                           <a:stretch>
                             <a:fillRect/>
                           </a:stretch>
@@ -50874,7 +50918,7 @@
               <w:t xml:space="preserve">data.</w:t>
             </w:r>
           </w:p>
-          <w:bookmarkEnd w:id="127"/>
+          <w:bookmarkEnd w:id="129"/>
         </w:tc>
       </w:tr>
     </w:tbl>
@@ -50936,8 +50980,8 @@
         <w:t xml:space="preserve">for everyone cannot reproduce that.</w:t>
       </w:r>
     </w:p>
-    <w:bookmarkEnd w:id="128"/>
-    <w:bookmarkStart w:id="129" w:name="def-ppp-value"/>
+    <w:bookmarkEnd w:id="130"/>
+    <w:bookmarkStart w:id="131" w:name="def-ppp-value"/>
     <w:p>
       <w:pPr>
         <w:pStyle w:val="BodyText"/>
@@ -51271,25 +51315,283 @@
       <w:r>
         <w:t xml:space="preserve">.</w:t>
       </w:r>
-      <w:r>
-        <w:t xml:space="preserve"> </w:t>
-      </w:r>
-      <w:r>
-        <w:t xml:space="preserve">With simulations from a</w:t>
-      </w:r>
-      <w:r>
-        <w:t xml:space="preserve"> </w:t>
-      </w:r>
-      <w:hyperlink w:anchor="def-posterior-predictive-check">
+    </w:p>
+    <w:bookmarkEnd w:id="131"/>
+    <w:bookmarkStart w:id="133" w:name="exm-ppp-value"/>
+    <w:p>
+      <w:pPr>
+        <w:pStyle w:val="BodyText"/>
+      </w:pPr>
+      <w:r>
+        <w:rPr>
+          <w:b/>
+          <w:bCs/>
+        </w:rPr>
+        <w:t xml:space="preserve">Example 25 (Posterior predictive p-values for the race spread)</w:t>
+      </w:r>
+      <w:r>
+        <w:t xml:space="preserve"> </w:t>
+      </w:r>
+      <w:r>
+        <w:t xml:space="preserve">From the simulations of</w:t>
+      </w:r>
+      <w:r>
+        <w:t xml:space="preserve"> </w:t>
+      </w:r>
+      <w:hyperlink w:anchor="exm-posterior-predictive-check">
         <w:r>
           <w:rPr>
             <w:rStyle w:val="Hyperlink"/>
           </w:rPr>
-          <w:t xml:space="preserve">posterior predictive check</w:t>
+          <w:t xml:space="preserve">Example 24</w:t>
         </w:r>
       </w:hyperlink>
       <w:r>
-        <w:t xml:space="preserve">,</w:t>
+        <w:t xml:space="preserve">:</w:t>
+      </w:r>
+    </w:p>
+    <w:p>
+      <w:pPr>
+        <w:pStyle w:val="Heading4"/>
+      </w:pPr>
+      <w:r>
+        <w:t xml:space="preserve">R</w:t>
+      </w:r>
+    </w:p>
+    <w:p>
+      <w:pPr>
+        <w:pStyle w:val="SourceCode"/>
+      </w:pPr>
+      <w:r>
+        <w:rPr>
+          <w:rStyle w:val="NormalTok"/>
+        </w:rPr>
+        <w:t xml:space="preserve">ppp_values </w:t>
+      </w:r>
+      <w:r>
+        <w:rPr>
+          <w:rStyle w:val="OtherTok"/>
+        </w:rPr>
+        <w:t xml:space="preserve">&lt;-</w:t>
+      </w:r>
+      <w:r>
+        <w:rPr>
+          <w:rStyle w:val="NormalTok"/>
+        </w:rPr>
+        <w:t xml:space="preserve"> </w:t>
+      </w:r>
+      <w:r>
+        <w:rPr>
+          <w:rStyle w:val="FunctionTok"/>
+        </w:rPr>
+        <w:t xml:space="preserve">tapply</w:t>
+      </w:r>
+      <w:r>
+        <w:rPr>
+          <w:rStyle w:val="NormalTok"/>
+        </w:rPr>
+        <w:t xml:space="preserve">(</w:t>
+      </w:r>
+      <w:r>
+        <w:br/>
+      </w:r>
+      <w:r>
+        <w:rPr>
+          <w:rStyle w:val="NormalTok"/>
+        </w:rPr>
+        <w:t xml:space="preserve">  ppc_draws</w:t>
+      </w:r>
+      <w:r>
+        <w:rPr>
+          <w:rStyle w:val="SpecialCharTok"/>
+        </w:rPr>
+        <w:t xml:space="preserve">$</w:t>
+      </w:r>
+      <w:r>
+        <w:rPr>
+          <w:rStyle w:val="NormalTok"/>
+        </w:rPr>
+        <w:t xml:space="preserve">t_rep </w:t>
+      </w:r>
+      <w:r>
+        <w:rPr>
+          <w:rStyle w:val="SpecialCharTok"/>
+        </w:rPr>
+        <w:t xml:space="preserve">&gt;=</w:t>
+      </w:r>
+      <w:r>
+        <w:rPr>
+          <w:rStyle w:val="NormalTok"/>
+        </w:rPr>
+        <w:t xml:space="preserve"> ppc_draws</w:t>
+      </w:r>
+      <w:r>
+        <w:rPr>
+          <w:rStyle w:val="SpecialCharTok"/>
+        </w:rPr>
+        <w:t xml:space="preserve">$</w:t>
+      </w:r>
+      <w:r>
+        <w:rPr>
+          <w:rStyle w:val="NormalTok"/>
+        </w:rPr>
+        <w:t xml:space="preserve">t_obs,</w:t>
+      </w:r>
+      <w:r>
+        <w:br/>
+      </w:r>
+      <w:r>
+        <w:rPr>
+          <w:rStyle w:val="NormalTok"/>
+        </w:rPr>
+        <w:t xml:space="preserve">  ppc_draws</w:t>
+      </w:r>
+      <w:r>
+        <w:rPr>
+          <w:rStyle w:val="SpecialCharTok"/>
+        </w:rPr>
+        <w:t xml:space="preserve">$</w:t>
+      </w:r>
+      <w:r>
+        <w:rPr>
+          <w:rStyle w:val="NormalTok"/>
+        </w:rPr>
+        <w:t xml:space="preserve">data_set,</w:t>
+      </w:r>
+      <w:r>
+        <w:br/>
+      </w:r>
+      <w:r>
+        <w:rPr>
+          <w:rStyle w:val="NormalTok"/>
+        </w:rPr>
+        <w:t xml:space="preserve">  mean</w:t>
+      </w:r>
+      <w:r>
+        <w:br/>
+      </w:r>
+      <w:r>
+        <w:rPr>
+          <w:rStyle w:val="NormalTok"/>
+        </w:rPr>
+        <w:t xml:space="preserve">)</w:t>
+      </w:r>
+      <w:r>
+        <w:br/>
+      </w:r>
+      <w:r>
+        <w:rPr>
+          <w:rStyle w:val="NormalTok"/>
+        </w:rPr>
+        <w:t xml:space="preserve">ppp_values</w:t>
+      </w:r>
+      <w:r>
+        <w:br/>
+      </w:r>
+      <w:r>
+        <w:rPr>
+          <w:rStyle w:val="CommentTok"/>
+        </w:rPr>
+        <w:t xml:space="preserve">#&gt;      simulated real (birthwt) </w:t>
+      </w:r>
+      <w:r>
+        <w:br/>
+      </w:r>
+      <w:r>
+        <w:rPr>
+          <w:rStyle w:val="CommentTok"/>
+        </w:rPr>
+        <w:t xml:space="preserve">#&gt;        0.36725        0.00150</w:t>
+      </w:r>
+    </w:p>
+    <w:p>
+      <w:pPr>
+        <w:pStyle w:val="Heading4"/>
+      </w:pPr>
+      <w:r>
+        <w:t xml:space="preserve">Python</w:t>
+      </w:r>
+    </w:p>
+    <w:p>
+      <w:pPr>
+        <w:pStyle w:val="SourceCode"/>
+      </w:pPr>
+      <w:r>
+        <w:rPr>
+          <w:rStyle w:val="NormalTok"/>
+        </w:rPr>
+        <w:t xml:space="preserve">{name: (t_rep </w:t>
+      </w:r>
+      <w:r>
+        <w:rPr>
+          <w:rStyle w:val="OperatorTok"/>
+        </w:rPr>
+        <w:t xml:space="preserve">&gt;=</w:t>
+      </w:r>
+      <w:r>
+        <w:rPr>
+          <w:rStyle w:val="NormalTok"/>
+        </w:rPr>
+        <w:t xml:space="preserve"> t_obs).mean() </w:t>
+      </w:r>
+      <w:r>
+        <w:rPr>
+          <w:rStyle w:val="ControlFlowTok"/>
+        </w:rPr>
+        <w:t xml:space="preserve">for</w:t>
+      </w:r>
+      <w:r>
+        <w:rPr>
+          <w:rStyle w:val="NormalTok"/>
+        </w:rPr>
+        <w:t xml:space="preserve"> name, (t_rep, t_obs) </w:t>
+      </w:r>
+      <w:r>
+        <w:rPr>
+          <w:rStyle w:val="KeywordTok"/>
+        </w:rPr>
+        <w:t xml:space="preserve">in</w:t>
+      </w:r>
+      <w:r>
+        <w:rPr>
+          <w:rStyle w:val="NormalTok"/>
+        </w:rPr>
+        <w:t xml:space="preserve"> ppc_draws.items()}</w:t>
+      </w:r>
+      <w:r>
+        <w:br/>
+      </w:r>
+      <w:r>
+        <w:rPr>
+          <w:rStyle w:val="CommentTok"/>
+        </w:rPr>
+        <w:t xml:space="preserve">#&gt; {'simulated': np.float64(0.3545), 'real (birthwt)': np.float64(0.00125)}</w:t>
+      </w:r>
+    </w:p>
+    <w:p>
+      <w:pPr>
+        <w:pStyle w:val="FirstParagraph"/>
+      </w:pPr>
+      <w:r>
+        <w:t xml:space="preserve">R and Python draw different random numbers,</w:t>
+      </w:r>
+      <w:r>
+        <w:t xml:space="preserve"> </w:t>
+      </w:r>
+      <w:r>
+        <w:t xml:space="preserve">so their p-values differ a little;</w:t>
+      </w:r>
+      <w:r>
+        <w:t xml:space="preserve"> </w:t>
+      </w:r>
+      <w:r>
+        <w:t xml:space="preserve">the text uses the R results.</w:t>
+      </w:r>
+      <w:r>
+        <w:t xml:space="preserve"> </w:t>
+      </w:r>
+      <w:r>
+        <w:t xml:space="preserve">For the simulated data,</w:t>
       </w:r>
       <w:r>
         <w:t xml:space="preserve"> </w:t>
@@ -51312,297 +51614,19 @@
         <w:t xml:space="preserve"> </w:t>
       </w:r>
       <w:r>
-        <w:t xml:space="preserve">is estimated by the proportion of replicated values</w:t>
-      </w:r>
-      <w:r>
-        <w:t xml:space="preserve"> </w:t>
-      </w:r>
-      <w:r>
-        <w:t xml:space="preserve">at least as large as the observed value.</w:t>
-      </w:r>
-      <w:r>
-        <w:t xml:space="preserve"> </w:t>
-      </w:r>
-      <w:r>
-        <w:t xml:space="preserve">A value near 0 or 1 means the observed data are unusual under the model.</w:t>
-      </w:r>
-    </w:p>
-    <w:bookmarkEnd w:id="129"/>
-    <w:bookmarkStart w:id="131" w:name="exm-ppp-value"/>
-    <w:p>
-      <w:pPr>
-        <w:pStyle w:val="BodyText"/>
-      </w:pPr>
-      <w:r>
-        <w:rPr>
-          <w:b/>
-          <w:bCs/>
-        </w:rPr>
-        <w:t xml:space="preserve">Example 25 (Posterior predictive p-values for the race spread)</w:t>
-      </w:r>
-      <w:r>
-        <w:t xml:space="preserve"> </w:t>
-      </w:r>
-      <w:r>
-        <w:t xml:space="preserve">From the simulations of</w:t>
-      </w:r>
-      <w:r>
-        <w:t xml:space="preserve"> </w:t>
-      </w:r>
-      <w:hyperlink w:anchor="exm-posterior-predictive-check">
-        <w:r>
-          <w:rPr>
-            <w:rStyle w:val="Hyperlink"/>
-          </w:rPr>
-          <w:t xml:space="preserve">Example 24</w:t>
-        </w:r>
-      </w:hyperlink>
-      <w:r>
-        <w:t xml:space="preserve">:</w:t>
-      </w:r>
-    </w:p>
-    <w:p>
-      <w:pPr>
-        <w:pStyle w:val="Heading4"/>
-      </w:pPr>
-      <w:r>
-        <w:t xml:space="preserve">R</w:t>
-      </w:r>
-    </w:p>
-    <w:p>
-      <w:pPr>
-        <w:pStyle w:val="SourceCode"/>
-      </w:pPr>
-      <w:r>
-        <w:rPr>
-          <w:rStyle w:val="NormalTok"/>
-        </w:rPr>
-        <w:t xml:space="preserve">ppp_values </w:t>
-      </w:r>
-      <w:r>
-        <w:rPr>
-          <w:rStyle w:val="OtherTok"/>
-        </w:rPr>
-        <w:t xml:space="preserve">&lt;-</w:t>
-      </w:r>
-      <w:r>
-        <w:rPr>
-          <w:rStyle w:val="NormalTok"/>
-        </w:rPr>
-        <w:t xml:space="preserve"> </w:t>
-      </w:r>
-      <w:r>
-        <w:rPr>
-          <w:rStyle w:val="FunctionTok"/>
-        </w:rPr>
-        <w:t xml:space="preserve">tapply</w:t>
-      </w:r>
-      <w:r>
-        <w:rPr>
-          <w:rStyle w:val="NormalTok"/>
-        </w:rPr>
-        <w:t xml:space="preserve">(</w:t>
-      </w:r>
-      <w:r>
-        <w:br/>
-      </w:r>
-      <w:r>
-        <w:rPr>
-          <w:rStyle w:val="NormalTok"/>
-        </w:rPr>
-        <w:t xml:space="preserve">  ppc_draws</w:t>
-      </w:r>
-      <w:r>
-        <w:rPr>
-          <w:rStyle w:val="SpecialCharTok"/>
-        </w:rPr>
-        <w:t xml:space="preserve">$</w:t>
-      </w:r>
-      <w:r>
-        <w:rPr>
-          <w:rStyle w:val="NormalTok"/>
-        </w:rPr>
-        <w:t xml:space="preserve">t_rep </w:t>
-      </w:r>
-      <w:r>
-        <w:rPr>
-          <w:rStyle w:val="SpecialCharTok"/>
-        </w:rPr>
-        <w:t xml:space="preserve">&gt;=</w:t>
-      </w:r>
-      <w:r>
-        <w:rPr>
-          <w:rStyle w:val="NormalTok"/>
-        </w:rPr>
-        <w:t xml:space="preserve"> ppc_draws</w:t>
-      </w:r>
-      <w:r>
-        <w:rPr>
-          <w:rStyle w:val="SpecialCharTok"/>
-        </w:rPr>
-        <w:t xml:space="preserve">$</w:t>
-      </w:r>
-      <w:r>
-        <w:rPr>
-          <w:rStyle w:val="NormalTok"/>
-        </w:rPr>
-        <w:t xml:space="preserve">t_obs,</w:t>
-      </w:r>
-      <w:r>
-        <w:br/>
-      </w:r>
-      <w:r>
-        <w:rPr>
-          <w:rStyle w:val="NormalTok"/>
-        </w:rPr>
-        <w:t xml:space="preserve">  ppc_draws</w:t>
-      </w:r>
-      <w:r>
-        <w:rPr>
-          <w:rStyle w:val="SpecialCharTok"/>
-        </w:rPr>
-        <w:t xml:space="preserve">$</w:t>
-      </w:r>
-      <w:r>
-        <w:rPr>
-          <w:rStyle w:val="NormalTok"/>
-        </w:rPr>
-        <w:t xml:space="preserve">data_set,</w:t>
-      </w:r>
-      <w:r>
-        <w:br/>
-      </w:r>
-      <w:r>
-        <w:rPr>
-          <w:rStyle w:val="NormalTok"/>
-        </w:rPr>
-        <w:t xml:space="preserve">  mean</w:t>
-      </w:r>
-      <w:r>
-        <w:br/>
-      </w:r>
-      <w:r>
-        <w:rPr>
-          <w:rStyle w:val="NormalTok"/>
-        </w:rPr>
-        <w:t xml:space="preserve">)</w:t>
-      </w:r>
-      <w:r>
-        <w:br/>
-      </w:r>
-      <w:r>
-        <w:rPr>
-          <w:rStyle w:val="NormalTok"/>
-        </w:rPr>
-        <w:t xml:space="preserve">ppp_values</w:t>
-      </w:r>
-      <w:r>
-        <w:br/>
-      </w:r>
-      <w:r>
-        <w:rPr>
-          <w:rStyle w:val="CommentTok"/>
-        </w:rPr>
-        <w:t xml:space="preserve">#&gt;      simulated real (birthwt) </w:t>
-      </w:r>
-      <w:r>
-        <w:br/>
-      </w:r>
-      <w:r>
-        <w:rPr>
-          <w:rStyle w:val="CommentTok"/>
-        </w:rPr>
-        <w:t xml:space="preserve">#&gt;        0.36725        0.00150</w:t>
-      </w:r>
-    </w:p>
-    <w:p>
-      <w:pPr>
-        <w:pStyle w:val="Heading4"/>
-      </w:pPr>
-      <w:r>
-        <w:t xml:space="preserve">Python</w:t>
-      </w:r>
-    </w:p>
-    <w:p>
-      <w:pPr>
-        <w:pStyle w:val="SourceCode"/>
-      </w:pPr>
-      <w:r>
-        <w:rPr>
-          <w:rStyle w:val="NormalTok"/>
-        </w:rPr>
-        <w:t xml:space="preserve">{name: (t_rep </w:t>
-      </w:r>
-      <w:r>
-        <w:rPr>
-          <w:rStyle w:val="OperatorTok"/>
-        </w:rPr>
-        <w:t xml:space="preserve">&gt;=</w:t>
-      </w:r>
-      <w:r>
-        <w:rPr>
-          <w:rStyle w:val="NormalTok"/>
-        </w:rPr>
-        <w:t xml:space="preserve"> t_obs).mean() </w:t>
-      </w:r>
-      <w:r>
-        <w:rPr>
-          <w:rStyle w:val="ControlFlowTok"/>
-        </w:rPr>
-        <w:t xml:space="preserve">for</w:t>
-      </w:r>
-      <w:r>
-        <w:rPr>
-          <w:rStyle w:val="NormalTok"/>
-        </w:rPr>
-        <w:t xml:space="preserve"> name, (t_rep, t_obs) </w:t>
-      </w:r>
-      <w:r>
-        <w:rPr>
-          <w:rStyle w:val="KeywordTok"/>
-        </w:rPr>
-        <w:t xml:space="preserve">in</w:t>
-      </w:r>
-      <w:r>
-        <w:rPr>
-          <w:rStyle w:val="NormalTok"/>
-        </w:rPr>
-        <w:t xml:space="preserve"> ppc_draws.items()}</w:t>
-      </w:r>
-      <w:r>
-        <w:br/>
-      </w:r>
-      <w:r>
-        <w:rPr>
-          <w:rStyle w:val="CommentTok"/>
-        </w:rPr>
-        <w:t xml:space="preserve">#&gt; {'simulated': np.float64(0.3545), 'real (birthwt)': np.float64(0.00125)}</w:t>
-      </w:r>
-    </w:p>
-    <w:p>
-      <w:pPr>
-        <w:pStyle w:val="FirstParagraph"/>
-      </w:pPr>
-      <w:r>
-        <w:t xml:space="preserve">R and Python draw different random numbers,</w:t>
-      </w:r>
-      <w:r>
-        <w:t xml:space="preserve"> </w:t>
-      </w:r>
-      <w:r>
-        <w:t xml:space="preserve">so their p-values differ a little;</w:t>
-      </w:r>
-      <w:r>
-        <w:t xml:space="preserve"> </w:t>
-      </w:r>
-      <w:r>
-        <w:t xml:space="preserve">the text uses the R results.</w:t>
-      </w:r>
-      <w:r>
-        <w:t xml:space="preserve"> </w:t>
-      </w:r>
-      <w:r>
-        <w:t xml:space="preserve">For the simulated data,</w:t>
+        <w:t xml:space="preserve">is 0.367,</w:t>
+      </w:r>
+      <w:r>
+        <w:t xml:space="preserve"> </w:t>
+      </w:r>
+      <w:r>
+        <w:t xml:space="preserve">so the model passes this check.</w:t>
+      </w:r>
+      <w:r>
+        <w:t xml:space="preserve"> </w:t>
+      </w:r>
+      <w:r>
+        <w:t xml:space="preserve">For the real data,</w:t>
       </w:r>
       <w:r>
         <w:t xml:space="preserve"> </w:t>
@@ -51625,19 +51649,76 @@
         <w:t xml:space="preserve"> </w:t>
       </w:r>
       <w:r>
-        <w:t xml:space="preserve">is 0.367,</w:t>
-      </w:r>
-      <w:r>
-        <w:t xml:space="preserve"> </w:t>
-      </w:r>
-      <w:r>
-        <w:t xml:space="preserve">so the model passes this check.</w:t>
-      </w:r>
-      <w:r>
-        <w:t xml:space="preserve"> </w:t>
-      </w:r>
-      <w:r>
-        <w:t xml:space="preserve">For the real data,</w:t>
+        <w:t xml:space="preserve">is 0.002,</w:t>
+      </w:r>
+      <w:r>
+        <w:t xml:space="preserve"> </w:t>
+      </w:r>
+      <w:r>
+        <w:t xml:space="preserve">so the model fails it.</w:t>
+      </w:r>
+      <w:r>
+        <w:t xml:space="preserve"> </w:t>
+      </w:r>
+      <w:r>
+        <w:t xml:space="preserve">The next step would be a model that lets the smoking probability depend on race,</w:t>
+      </w:r>
+      <w:r>
+        <w:t xml:space="preserve"> </w:t>
+      </w:r>
+      <w:r>
+        <w:t xml:space="preserve">such as the</w:t>
+      </w:r>
+      <w:r>
+        <w:t xml:space="preserve"> </w:t>
+      </w:r>
+      <w:hyperlink r:id="rId132">
+        <w:r>
+          <w:rPr>
+            <w:rStyle w:val="Hyperlink"/>
+          </w:rPr>
+          <w:t xml:space="preserve">Bayesian logistic regression</w:t>
+        </w:r>
+      </w:hyperlink>
+      <w:r>
+        <w:t xml:space="preserve"> </w:t>
+      </w:r>
+      <w:r>
+        <w:t xml:space="preserve">fitted on the companion page.</w:t>
+      </w:r>
+    </w:p>
+    <w:bookmarkEnd w:id="133"/>
+    <w:bookmarkStart w:id="134" w:name="rem-ppp-value-estimate"/>
+    <w:p>
+      <w:pPr>
+        <w:pStyle w:val="BodyText"/>
+      </w:pPr>
+      <w:r>
+        <w:rPr>
+          <w:i/>
+          <w:iCs/>
+        </w:rPr>
+        <w:t xml:space="preserve">Remark 7</w:t>
+      </w:r>
+      <w:r>
+        <w:t xml:space="preserve"> (Estimating and interpreting the posterior predictive p-value). </w:t>
+      </w:r>
+      <w:r>
+        <w:t xml:space="preserve">With simulations from a</w:t>
+      </w:r>
+      <w:r>
+        <w:t xml:space="preserve"> </w:t>
+      </w:r>
+      <w:hyperlink w:anchor="def-posterior-predictive-check">
+        <w:r>
+          <w:rPr>
+            <w:rStyle w:val="Hyperlink"/>
+          </w:rPr>
+          <w:t xml:space="preserve">posterior predictive check</w:t>
+        </w:r>
+      </w:hyperlink>
+      <w:r>
+        <w:t xml:space="preserve">,</w:t>
       </w:r>
       <w:r>
         <w:t xml:space="preserve"> </w:t>
@@ -51660,47 +51741,24 @@
         <w:t xml:space="preserve"> </w:t>
       </w:r>
       <w:r>
-        <w:t xml:space="preserve">is 0.002,</w:t>
-      </w:r>
-      <w:r>
-        <w:t xml:space="preserve"> </w:t>
-      </w:r>
-      <w:r>
-        <w:t xml:space="preserve">so the model fails it.</w:t>
-      </w:r>
-      <w:r>
-        <w:t xml:space="preserve"> </w:t>
-      </w:r>
-      <w:r>
-        <w:t xml:space="preserve">The next step would be a model that lets the smoking probability depend on race,</w:t>
-      </w:r>
-      <w:r>
-        <w:t xml:space="preserve"> </w:t>
-      </w:r>
-      <w:r>
-        <w:t xml:space="preserve">such as the</w:t>
-      </w:r>
-      <w:r>
-        <w:t xml:space="preserve"> </w:t>
-      </w:r>
-      <w:hyperlink r:id="rId130">
-        <w:r>
-          <w:rPr>
-            <w:rStyle w:val="Hyperlink"/>
-          </w:rPr>
-          <w:t xml:space="preserve">Bayesian logistic regression</w:t>
-        </w:r>
-      </w:hyperlink>
-      <w:r>
-        <w:t xml:space="preserve"> </w:t>
-      </w:r>
-      <w:r>
-        <w:t xml:space="preserve">fitted on the companion page.</w:t>
+        <w:t xml:space="preserve">is estimated by the proportion of replicated values</w:t>
+      </w:r>
+      <w:r>
+        <w:t xml:space="preserve"> </w:t>
+      </w:r>
+      <w:r>
+        <w:t xml:space="preserve">at least as large as the observed value.</w:t>
+      </w:r>
+      <w:r>
+        <w:t xml:space="preserve"> </w:t>
+      </w:r>
+      <w:r>
+        <w:t xml:space="preserve">A value near 0 or 1 means the observed data are unusual under the model.</w:t>
       </w:r>
     </w:p>
-    <w:bookmarkEnd w:id="131"/>
-    <w:bookmarkEnd w:id="132"/>
-    <w:bookmarkStart w:id="140" w:name="sec-bayes-hierarchies"/>
+    <w:bookmarkEnd w:id="134"/>
+    <w:bookmarkEnd w:id="135"/>
+    <w:bookmarkStart w:id="143" w:name="sec-bayes-hierarchies"/>
     <w:p>
       <w:pPr>
         <w:pStyle w:val="Heading2"/>
@@ -51709,7 +51767,7 @@
         <w:t xml:space="preserve">5 Distributions and hierarchies</w:t>
       </w:r>
     </w:p>
-    <w:bookmarkStart w:id="133" w:name="def-hierarchical-model"/>
+    <w:bookmarkStart w:id="136" w:name="def-hierarchical-model"/>
     <w:p>
       <w:pPr>
         <w:pStyle w:val="FirstParagraph"/>
@@ -51781,8 +51839,8 @@
         <w:t xml:space="preserve">.</w:t>
       </w:r>
     </w:p>
-    <w:bookmarkEnd w:id="133"/>
-    <w:bookmarkStart w:id="134" w:name="rem-hierarchical-model-structure"/>
+    <w:bookmarkEnd w:id="136"/>
+    <w:bookmarkStart w:id="137" w:name="rem-hierarchical-model-structure"/>
     <w:p>
       <w:pPr>
         <w:pStyle w:val="BodyText"/>
@@ -51792,7 +51850,7 @@
           <w:i/>
           <w:iCs/>
         </w:rPr>
-        <w:t xml:space="preserve">Remark 5</w:t>
+        <w:t xml:space="preserve">Remark 8</w:t>
       </w:r>
       <w:r>
         <w:t xml:space="preserve"> (A hierarchical model is a model structure). </w:t>
@@ -51838,8 +51896,8 @@
         <w:t xml:space="preserve">).</w:t>
       </w:r>
     </w:p>
-    <w:bookmarkEnd w:id="134"/>
-    <w:bookmarkStart w:id="135" w:name="def-hyperparameter"/>
+    <w:bookmarkEnd w:id="137"/>
+    <w:bookmarkStart w:id="138" w:name="def-hyperparameter"/>
     <w:p>
       <w:pPr>
         <w:pStyle w:val="BodyText"/>
@@ -51900,8 +51958,8 @@
         <w:t xml:space="preserve">of the distribution of the group-level parameters.</w:t>
       </w:r>
     </w:p>
-    <w:bookmarkEnd w:id="135"/>
-    <w:bookmarkStart w:id="136" w:name="def-hyperprior"/>
+    <w:bookmarkEnd w:id="138"/>
+    <w:bookmarkStart w:id="139" w:name="def-hyperprior"/>
     <w:p>
       <w:pPr>
         <w:pStyle w:val="BodyText"/>
@@ -51976,8 +52034,8 @@
         <w:t xml:space="preserve">.</w:t>
       </w:r>
     </w:p>
-    <w:bookmarkEnd w:id="136"/>
-    <w:bookmarkStart w:id="137" w:name="exm-two-level-normal"/>
+    <w:bookmarkEnd w:id="139"/>
+    <w:bookmarkStart w:id="140" w:name="exm-two-level-normal"/>
     <w:p>
       <w:pPr>
         <w:pStyle w:val="BodyText"/>
@@ -52481,7 +52539,7 @@
         <w:t xml:space="preserve">.</w:t>
       </w:r>
     </w:p>
-    <w:bookmarkEnd w:id="137"/>
+    <w:bookmarkEnd w:id="140"/>
     <w:p>
       <w:pPr>
         <w:pStyle w:val="BodyText"/>
@@ -52614,7 +52672,7 @@
       <w:r>
         <w:t xml:space="preserve"> </w:t>
       </w:r>
-      <w:hyperlink r:id="rId138">
+      <w:hyperlink r:id="rId141">
         <w:r>
           <w:rPr>
             <w:rStyle w:val="Hyperlink"/>
@@ -52696,7 +52754,7 @@
       <w:r>
         <w:t xml:space="preserve"> </w:t>
       </w:r>
-      <w:hyperlink r:id="rId139">
+      <w:hyperlink r:id="rId142">
         <w:r>
           <w:rPr>
             <w:rStyle w:val="Hyperlink"/>
@@ -52713,8 +52771,8 @@
         <w:t xml:space="preserve">(Statistical Rethinking 2026, Lecture B01).</w:t>
       </w:r>
     </w:p>
-    <w:bookmarkEnd w:id="140"/>
-    <w:bookmarkStart w:id="155" w:name="sec-bayes-resources"/>
+    <w:bookmarkEnd w:id="143"/>
+    <w:bookmarkStart w:id="158" w:name="sec-bayes-resources"/>
     <w:p>
       <w:pPr>
         <w:pStyle w:val="Heading2"/>
@@ -52731,91 +52789,13 @@
         <w:t xml:space="preserve">The following resources cover Bayesian inference in more depth.</w:t>
       </w:r>
     </w:p>
-    <w:bookmarkStart w:id="149" w:name="uc-davis-courses"/>
+    <w:bookmarkStart w:id="152" w:name="uc-davis-courses"/>
     <w:p>
       <w:pPr>
         <w:pStyle w:val="Heading3"/>
       </w:pPr>
       <w:r>
         <w:t xml:space="preserve">6.1 UC Davis courses</w:t>
-      </w:r>
-    </w:p>
-    <w:p>
-      <w:pPr>
-        <w:pStyle w:val="Compact"/>
-        <w:numPr>
-          <w:ilvl w:val="0"/>
-          <w:numId w:val="1007"/>
-        </w:numPr>
-      </w:pPr>
-      <w:hyperlink r:id="rId141">
-        <w:r>
-          <w:rPr>
-            <w:rStyle w:val="Hyperlink"/>
-          </w:rPr>
-          <w:t xml:space="preserve">STA 015C</w:t>
-        </w:r>
-      </w:hyperlink>
-      <w:r>
-        <w:t xml:space="preserve">:</w:t>
-      </w:r>
-      <w:r>
-        <w:t xml:space="preserve"> </w:t>
-      </w:r>
-      <w:r>
-        <w:t xml:space="preserve">“Introduction to Statistical Data Science III”</w:t>
-      </w:r>
-    </w:p>
-    <w:p>
-      <w:pPr>
-        <w:pStyle w:val="Compact"/>
-        <w:numPr>
-          <w:ilvl w:val="0"/>
-          <w:numId w:val="1007"/>
-        </w:numPr>
-      </w:pPr>
-      <w:hyperlink r:id="rId142">
-        <w:r>
-          <w:rPr>
-            <w:rStyle w:val="Hyperlink"/>
-          </w:rPr>
-          <w:t xml:space="preserve">STA 035C</w:t>
-        </w:r>
-      </w:hyperlink>
-      <w:r>
-        <w:t xml:space="preserve">:</w:t>
-      </w:r>
-      <w:r>
-        <w:t xml:space="preserve"> </w:t>
-      </w:r>
-      <w:r>
-        <w:t xml:space="preserve">“Statistical Data Science III”</w:t>
-      </w:r>
-    </w:p>
-    <w:p>
-      <w:pPr>
-        <w:pStyle w:val="Compact"/>
-        <w:numPr>
-          <w:ilvl w:val="0"/>
-          <w:numId w:val="1007"/>
-        </w:numPr>
-      </w:pPr>
-      <w:hyperlink r:id="rId143">
-        <w:r>
-          <w:rPr>
-            <w:rStyle w:val="Hyperlink"/>
-          </w:rPr>
-          <w:t xml:space="preserve">STA 145</w:t>
-        </w:r>
-      </w:hyperlink>
-      <w:r>
-        <w:t xml:space="preserve">:</w:t>
-      </w:r>
-      <w:r>
-        <w:t xml:space="preserve"> </w:t>
-      </w:r>
-      <w:r>
-        <w:t xml:space="preserve">“Bayesian Statistical Inference”</w:t>
       </w:r>
     </w:p>
     <w:p>
@@ -52831,7 +52811,7 @@
           <w:rPr>
             <w:rStyle w:val="Hyperlink"/>
           </w:rPr>
-          <w:t xml:space="preserve">ECL 234</w:t>
+          <w:t xml:space="preserve">STA 015C</w:t>
         </w:r>
       </w:hyperlink>
       <w:r>
@@ -52841,7 +52821,7 @@
         <w:t xml:space="preserve"> </w:t>
       </w:r>
       <w:r>
-        <w:t xml:space="preserve">“Bayesian Models - A Statistical Primer”</w:t>
+        <w:t xml:space="preserve">“Introduction to Statistical Data Science III”</w:t>
       </w:r>
     </w:p>
     <w:p>
@@ -52857,7 +52837,7 @@
           <w:rPr>
             <w:rStyle w:val="Hyperlink"/>
           </w:rPr>
-          <w:t xml:space="preserve">PLS 207</w:t>
+          <w:t xml:space="preserve">STA 035C</w:t>
         </w:r>
       </w:hyperlink>
       <w:r>
@@ -52867,7 +52847,7 @@
         <w:t xml:space="preserve"> </w:t>
       </w:r>
       <w:r>
-        <w:t xml:space="preserve">“Applied Statistical Modeling for the Environmental Sciences”</w:t>
+        <w:t xml:space="preserve">“Statistical Data Science III”</w:t>
       </w:r>
     </w:p>
     <w:p>
@@ -52883,7 +52863,7 @@
           <w:rPr>
             <w:rStyle w:val="Hyperlink"/>
           </w:rPr>
-          <w:t xml:space="preserve">PSC 205H</w:t>
+          <w:t xml:space="preserve">STA 145</w:t>
         </w:r>
       </w:hyperlink>
       <w:r>
@@ -52893,7 +52873,7 @@
         <w:t xml:space="preserve"> </w:t>
       </w:r>
       <w:r>
-        <w:t xml:space="preserve">“Applied Bayesian Statistics for Social Scientists”</w:t>
+        <w:t xml:space="preserve">“Bayesian Statistical Inference”</w:t>
       </w:r>
     </w:p>
     <w:p>
@@ -52909,7 +52889,7 @@
           <w:rPr>
             <w:rStyle w:val="Hyperlink"/>
           </w:rPr>
-          <w:t xml:space="preserve">POL 280</w:t>
+          <w:t xml:space="preserve">ECL 234</w:t>
         </w:r>
       </w:hyperlink>
       <w:r>
@@ -52919,7 +52899,7 @@
         <w:t xml:space="preserve"> </w:t>
       </w:r>
       <w:r>
-        <w:t xml:space="preserve">“Bayesian Methods: for Social &amp; Behavioral Sciences”</w:t>
+        <w:t xml:space="preserve">“Bayesian Models - A Statistical Primer”</w:t>
       </w:r>
     </w:p>
     <w:p>
@@ -52935,6 +52915,84 @@
           <w:rPr>
             <w:rStyle w:val="Hyperlink"/>
           </w:rPr>
+          <w:t xml:space="preserve">PLS 207</w:t>
+        </w:r>
+      </w:hyperlink>
+      <w:r>
+        <w:t xml:space="preserve">:</w:t>
+      </w:r>
+      <w:r>
+        <w:t xml:space="preserve"> </w:t>
+      </w:r>
+      <w:r>
+        <w:t xml:space="preserve">“Applied Statistical Modeling for the Environmental Sciences”</w:t>
+      </w:r>
+    </w:p>
+    <w:p>
+      <w:pPr>
+        <w:pStyle w:val="Compact"/>
+        <w:numPr>
+          <w:ilvl w:val="0"/>
+          <w:numId w:val="1007"/>
+        </w:numPr>
+      </w:pPr>
+      <w:hyperlink r:id="rId149">
+        <w:r>
+          <w:rPr>
+            <w:rStyle w:val="Hyperlink"/>
+          </w:rPr>
+          <w:t xml:space="preserve">PSC 205H</w:t>
+        </w:r>
+      </w:hyperlink>
+      <w:r>
+        <w:t xml:space="preserve">:</w:t>
+      </w:r>
+      <w:r>
+        <w:t xml:space="preserve"> </w:t>
+      </w:r>
+      <w:r>
+        <w:t xml:space="preserve">“Applied Bayesian Statistics for Social Scientists”</w:t>
+      </w:r>
+    </w:p>
+    <w:p>
+      <w:pPr>
+        <w:pStyle w:val="Compact"/>
+        <w:numPr>
+          <w:ilvl w:val="0"/>
+          <w:numId w:val="1007"/>
+        </w:numPr>
+      </w:pPr>
+      <w:hyperlink r:id="rId150">
+        <w:r>
+          <w:rPr>
+            <w:rStyle w:val="Hyperlink"/>
+          </w:rPr>
+          <w:t xml:space="preserve">POL 280</w:t>
+        </w:r>
+      </w:hyperlink>
+      <w:r>
+        <w:t xml:space="preserve">:</w:t>
+      </w:r>
+      <w:r>
+        <w:t xml:space="preserve"> </w:t>
+      </w:r>
+      <w:r>
+        <w:t xml:space="preserve">“Bayesian Methods: for Social &amp; Behavioral Sciences”</w:t>
+      </w:r>
+    </w:p>
+    <w:p>
+      <w:pPr>
+        <w:pStyle w:val="Compact"/>
+        <w:numPr>
+          <w:ilvl w:val="0"/>
+          <w:numId w:val="1007"/>
+        </w:numPr>
+      </w:pPr>
+      <w:hyperlink r:id="rId151">
+        <w:r>
+          <w:rPr>
+            <w:rStyle w:val="Hyperlink"/>
+          </w:rPr>
           <w:t xml:space="preserve">BAX 442</w:t>
         </w:r>
       </w:hyperlink>
@@ -52948,8 +53006,8 @@
         <w:t xml:space="preserve">“Advanced Statistics”</w:t>
       </w:r>
     </w:p>
-    <w:bookmarkEnd w:id="149"/>
-    <w:bookmarkStart w:id="154" w:name="books"/>
+    <w:bookmarkEnd w:id="152"/>
+    <w:bookmarkStart w:id="157" w:name="books"/>
     <w:p>
       <w:pPr>
         <w:pStyle w:val="Heading3"/>
@@ -53011,7 +53069,7 @@
       <w:r>
         <w:t xml:space="preserve"> </w:t>
       </w:r>
-      <w:hyperlink r:id="rId144">
+      <w:hyperlink r:id="rId147">
         <w:r>
           <w:rPr>
             <w:rStyle w:val="Hyperlink"/>
@@ -53040,7 +53098,7 @@
       <w:r>
         <w:t xml:space="preserve"> </w:t>
       </w:r>
-      <w:hyperlink r:id="rId150">
+      <w:hyperlink r:id="rId153">
         <w:r>
           <w:rPr>
             <w:rStyle w:val="Hyperlink"/>
@@ -53060,7 +53118,7 @@
       <w:r>
         <w:t xml:space="preserve"> </w:t>
       </w:r>
-      <w:hyperlink r:id="rId151">
+      <w:hyperlink r:id="rId154">
         <w:r>
           <w:rPr>
             <w:rStyle w:val="Hyperlink"/>
@@ -53080,7 +53138,7 @@
       <w:r>
         <w:t xml:space="preserve"> </w:t>
       </w:r>
-      <w:hyperlink r:id="rId152">
+      <w:hyperlink r:id="rId155">
         <w:r>
           <w:rPr>
             <w:rStyle w:val="Hyperlink"/>
@@ -53100,7 +53158,7 @@
       <w:r>
         <w:t xml:space="preserve"> </w:t>
       </w:r>
-      <w:hyperlink r:id="rId153">
+      <w:hyperlink r:id="rId156">
         <w:r>
           <w:rPr>
             <w:rStyle w:val="Hyperlink"/>
@@ -53174,7 +53232,7 @@
       <w:r>
         <w:t xml:space="preserve"> </w:t>
       </w:r>
-      <w:hyperlink r:id="rId145">
+      <w:hyperlink r:id="rId148">
         <w:r>
           <w:rPr>
             <w:rStyle w:val="Hyperlink"/>
@@ -53183,9 +53241,9 @@
         </w:r>
       </w:hyperlink>
     </w:p>
-    <w:bookmarkEnd w:id="154"/>
-    <w:bookmarkEnd w:id="155"/>
-    <w:bookmarkStart w:id="177" w:name="references"/>
+    <w:bookmarkEnd w:id="157"/>
+    <w:bookmarkEnd w:id="158"/>
+    <w:bookmarkStart w:id="180" w:name="references"/>
     <w:p>
       <w:pPr>
         <w:pStyle w:val="Heading2"/>
@@ -53194,8 +53252,8 @@
         <w:t xml:space="preserve">References</w:t>
       </w:r>
     </w:p>
-    <w:bookmarkStart w:id="176" w:name="refs"/>
-    <w:bookmarkStart w:id="157" w:name="ref-aragon2018population"/>
+    <w:bookmarkStart w:id="179" w:name="refs"/>
+    <w:bookmarkStart w:id="160" w:name="ref-aragon2018population"/>
     <w:p>
       <w:pPr>
         <w:pStyle w:val="Bibliography"/>
@@ -53247,7 +53305,7 @@
       <w:r>
         <w:t xml:space="preserve"> </w:t>
       </w:r>
-      <w:hyperlink r:id="rId156">
+      <w:hyperlink r:id="rId159">
         <w:r>
           <w:rPr>
             <w:rStyle w:val="Hyperlink"/>
@@ -53259,8 +53317,8 @@
         <w:t xml:space="preserve">.</w:t>
       </w:r>
     </w:p>
-    <w:bookmarkEnd w:id="157"/>
-    <w:bookmarkStart w:id="159" w:name="ref-CaseBerg01"/>
+    <w:bookmarkEnd w:id="160"/>
+    <w:bookmarkStart w:id="162" w:name="ref-CaseBerg01"/>
     <w:p>
       <w:pPr>
         <w:pStyle w:val="Bibliography"/>
@@ -53284,7 +53342,7 @@
       <w:r>
         <w:t xml:space="preserve"> </w:t>
       </w:r>
-      <w:hyperlink r:id="rId158">
+      <w:hyperlink r:id="rId161">
         <w:r>
           <w:rPr>
             <w:rStyle w:val="Hyperlink"/>
@@ -53296,8 +53354,8 @@
         <w:t xml:space="preserve">.</w:t>
       </w:r>
     </w:p>
-    <w:bookmarkEnd w:id="159"/>
-    <w:bookmarkStart w:id="161" w:name="ref-CowlesMaryKathryn2013ABSW"/>
+    <w:bookmarkEnd w:id="162"/>
+    <w:bookmarkStart w:id="164" w:name="ref-CowlesMaryKathryn2013ABSW"/>
     <w:p>
       <w:pPr>
         <w:pStyle w:val="Bibliography"/>
@@ -53377,7 +53435,7 @@
       <w:r>
         <w:t xml:space="preserve"> </w:t>
       </w:r>
-      <w:hyperlink r:id="rId160">
+      <w:hyperlink r:id="rId163">
         <w:r>
           <w:rPr>
             <w:rStyle w:val="Hyperlink"/>
@@ -53389,8 +53447,8 @@
         <w:t xml:space="preserve">.</w:t>
       </w:r>
     </w:p>
-    <w:bookmarkEnd w:id="161"/>
-    <w:bookmarkStart w:id="163" w:name="ref-dobson4e"/>
+    <w:bookmarkEnd w:id="164"/>
+    <w:bookmarkStart w:id="166" w:name="ref-dobson4e"/>
     <w:p>
       <w:pPr>
         <w:pStyle w:val="Bibliography"/>
@@ -53414,7 +53472,7 @@
       <w:r>
         <w:t xml:space="preserve"> </w:t>
       </w:r>
-      <w:hyperlink r:id="rId162">
+      <w:hyperlink r:id="rId165">
         <w:r>
           <w:rPr>
             <w:rStyle w:val="Hyperlink"/>
@@ -53426,8 +53484,8 @@
         <w:t xml:space="preserve">.</w:t>
       </w:r>
     </w:p>
-    <w:bookmarkEnd w:id="163"/>
-    <w:bookmarkStart w:id="165" w:name="ref-gelman2013bda"/>
+    <w:bookmarkEnd w:id="166"/>
+    <w:bookmarkStart w:id="168" w:name="ref-gelman2013bda"/>
     <w:p>
       <w:pPr>
         <w:pStyle w:val="Bibliography"/>
@@ -53451,7 +53509,7 @@
       <w:r>
         <w:t xml:space="preserve"> </w:t>
       </w:r>
-      <w:hyperlink r:id="rId164">
+      <w:hyperlink r:id="rId167">
         <w:r>
           <w:rPr>
             <w:rStyle w:val="Hyperlink"/>
@@ -53463,8 +53521,8 @@
         <w:t xml:space="preserve">.</w:t>
       </w:r>
     </w:p>
-    <w:bookmarkEnd w:id="165"/>
-    <w:bookmarkStart w:id="166" w:name="ref-HobbsN.Thompson2015Bmas"/>
+    <w:bookmarkEnd w:id="168"/>
+    <w:bookmarkStart w:id="169" w:name="ref-HobbsN.Thompson2015Bmas"/>
     <w:p>
       <w:pPr>
         <w:pStyle w:val="Bibliography"/>
@@ -53486,8 +53544,8 @@
         <w:t xml:space="preserve">. STU - Student edition. Princeton University Press.</w:t>
       </w:r>
     </w:p>
-    <w:bookmarkEnd w:id="166"/>
-    <w:bookmarkStart w:id="167" w:name="ref-hosmer1989applied"/>
+    <w:bookmarkEnd w:id="169"/>
+    <w:bookmarkStart w:id="170" w:name="ref-hosmer1989applied"/>
     <w:p>
       <w:pPr>
         <w:pStyle w:val="Bibliography"/>
@@ -53509,8 +53567,8 @@
         <w:t xml:space="preserve">. Wiley.</w:t>
       </w:r>
     </w:p>
-    <w:bookmarkEnd w:id="167"/>
-    <w:bookmarkStart w:id="169" w:name="ref-kery-bayes-pop"/>
+    <w:bookmarkEnd w:id="170"/>
+    <w:bookmarkStart w:id="172" w:name="ref-kery-bayes-pop"/>
     <w:p>
       <w:pPr>
         <w:pStyle w:val="Bibliography"/>
@@ -53562,7 +53620,7 @@
       <w:r>
         <w:t xml:space="preserve"> </w:t>
       </w:r>
-      <w:hyperlink r:id="rId168">
+      <w:hyperlink r:id="rId171">
         <w:r>
           <w:rPr>
             <w:rStyle w:val="Hyperlink"/>
@@ -53574,8 +53632,8 @@
         <w:t xml:space="preserve">.</w:t>
       </w:r>
     </w:p>
-    <w:bookmarkEnd w:id="169"/>
-    <w:bookmarkStart w:id="170" w:name="ref-korner.bayes.ecology"/>
+    <w:bookmarkEnd w:id="172"/>
+    <w:bookmarkStart w:id="173" w:name="ref-korner.bayes.ecology"/>
     <w:p>
       <w:pPr>
         <w:pStyle w:val="Bibliography"/>
@@ -53653,8 +53711,8 @@
         <w:t xml:space="preserve">. 1st ed. Academic Press.</w:t>
       </w:r>
     </w:p>
-    <w:bookmarkEnd w:id="170"/>
-    <w:bookmarkStart w:id="171" w:name="ref-statrethink2e"/>
+    <w:bookmarkEnd w:id="173"/>
+    <w:bookmarkStart w:id="174" w:name="ref-statrethink2e"/>
     <w:p>
       <w:pPr>
         <w:pStyle w:val="Bibliography"/>
@@ -53746,8 +53804,8 @@
         <w:t xml:space="preserve">. Second edition. Chapman &amp; Hall/CRC Texts in Statistical Science Series. CRC Press.</w:t>
       </w:r>
     </w:p>
-    <w:bookmarkEnd w:id="171"/>
-    <w:bookmarkStart w:id="173" w:name="ref-rossbayes"/>
+    <w:bookmarkEnd w:id="174"/>
+    <w:bookmarkStart w:id="176" w:name="ref-rossbayes"/>
     <w:p>
       <w:pPr>
         <w:pStyle w:val="Bibliography"/>
@@ -53771,7 +53829,7 @@
       <w:r>
         <w:t xml:space="preserve"> </w:t>
       </w:r>
-      <w:hyperlink r:id="rId172">
+      <w:hyperlink r:id="rId175">
         <w:r>
           <w:rPr>
             <w:rStyle w:val="Hyperlink"/>
@@ -53783,8 +53841,8 @@
         <w:t xml:space="preserve">.</w:t>
       </w:r>
     </w:p>
-    <w:bookmarkEnd w:id="173"/>
-    <w:bookmarkStart w:id="175" w:name="ref-venables2002modern"/>
+    <w:bookmarkEnd w:id="176"/>
+    <w:bookmarkStart w:id="178" w:name="ref-venables2002modern"/>
     <w:p>
       <w:pPr>
         <w:pStyle w:val="Bibliography"/>
@@ -53822,7 +53880,7 @@
       <w:r>
         <w:t xml:space="preserve"> </w:t>
       </w:r>
-      <w:hyperlink r:id="rId174">
+      <w:hyperlink r:id="rId177">
         <w:r>
           <w:rPr>
             <w:rStyle w:val="Hyperlink"/>
@@ -53834,9 +53892,9 @@
         <w:t xml:space="preserve">.</w:t>
       </w:r>
     </w:p>
-    <w:bookmarkEnd w:id="175"/>
-    <w:bookmarkEnd w:id="176"/>
-    <w:bookmarkEnd w:id="177"/>
+    <w:bookmarkEnd w:id="178"/>
+    <w:bookmarkEnd w:id="179"/>
+    <w:bookmarkEnd w:id="180"/>
     <w:sectPr>
       <w:footnotePr>
         <w:numRestart w:val="eachSect"/>

</xml_diff>

<commit_message>
Deploying to gh-pages from @ Morrison-Lab/sds@ee4ad1cc1aea24d5f319ea4560b15e7a9964bba7 🚀
</commit_message>
<xml_diff>
--- a/bayesian-inference-handout.docx
+++ b/bayesian-inference-handout.docx
@@ -15,7 +15,7 @@
         <w:pStyle w:val="Date"/>
       </w:pPr>
       <w:r>
-        <w:t xml:space="preserve">Last modified: 2026-10-15 06:02:37 (PDT)</w:t>
+        <w:t xml:space="preserve">Last modified: 2026-10-15 06:17:56 (PDT)</w:t>
       </w:r>
     </w:p>
     <w:p>
@@ -1453,7 +1453,7 @@
           <w:b/>
           <w:bCs/>
         </w:rPr>
-        <w:t xml:space="preserve">Definition 5 (Marginal likelihood)</w:t>
+        <w:t xml:space="preserve">Definition 5 (Marginal likelihood (evidence))</w:t>
       </w:r>
       <w:r>
         <w:t xml:space="preserve"> </w:t>
@@ -32496,7 +32496,7 @@
           <w:b/>
           <w:bCs/>
         </w:rPr>
-        <w:t xml:space="preserve">Definition 13 (Flat prior)</w:t>
+        <w:t xml:space="preserve">Definition 13 (Flat prior (uniform prior))</w:t>
       </w:r>
       <w:r>
         <w:t xml:space="preserve"> </w:t>
@@ -32531,29 +32531,10 @@
           <w:b/>
           <w:bCs/>
         </w:rPr>
-        <w:t xml:space="preserve">uniform</w:t>
-      </w:r>
-      <w:r>
-        <w:t xml:space="preserve"> </w:t>
-      </w:r>
-      <w:r>
-        <w:t xml:space="preserve">or</w:t>
-      </w:r>
-      <w:r>
-        <w:t xml:space="preserve"> </w:t>
-      </w:r>
-      <w:r>
-        <w:rPr>
-          <w:b/>
-          <w:bCs/>
-        </w:rPr>
-        <w:t xml:space="preserve">noninformative</w:t>
-      </w:r>
-      <w:r>
-        <w:t xml:space="preserve"> </w:t>
-      </w:r>
-      <w:r>
-        <w:t xml:space="preserve">prior,</w:t>
+        <w:t xml:space="preserve">uniform prior</w:t>
+      </w:r>
+      <w:r>
+        <w:t xml:space="preserve">,</w:t>
       </w:r>
       <w:r>
         <w:t xml:space="preserve"> </w:t>
@@ -32644,6 +32625,38 @@
       </w:r>
     </w:p>
     <w:bookmarkEnd w:id="91"/>
+    <w:p>
+      <w:pPr>
+        <w:pStyle w:val="BodyText"/>
+      </w:pPr>
+      <w:r>
+        <w:t xml:space="preserve">A flat prior is a common choice of noninformative prior,</w:t>
+      </w:r>
+      <w:r>
+        <w:t xml:space="preserve"> </w:t>
+      </w:r>
+      <w:r>
+        <w:t xml:space="preserve">but</w:t>
+      </w:r>
+      <w:r>
+        <w:t xml:space="preserve"> </w:t>
+      </w:r>
+      <w:r>
+        <w:t xml:space="preserve">“noninformative prior”</w:t>
+      </w:r>
+      <w:r>
+        <w:t xml:space="preserve"> </w:t>
+      </w:r>
+      <w:r>
+        <w:t xml:space="preserve">is the broader idea:</w:t>
+      </w:r>
+      <w:r>
+        <w:t xml:space="preserve"> </w:t>
+      </w:r>
+      <w:r>
+        <w:t xml:space="preserve">other noninformative priors, such as Jeffreys priors, are not flat.</w:t>
+      </w:r>
+    </w:p>
     <w:bookmarkStart w:id="92" w:name="def-improper-prior"/>
     <w:p>
       <w:pPr>
@@ -51777,7 +51790,7 @@
           <w:b/>
           <w:bCs/>
         </w:rPr>
-        <w:t xml:space="preserve">Definition 22 (Hierarchical model)</w:t>
+        <w:t xml:space="preserve">Definition 22 (Hierarchical model (multilevel model))</w:t>
       </w:r>
       <w:r>
         <w:t xml:space="preserve"> </w:t>

</xml_diff>

<commit_message>
Deploying to gh-pages from @ Morrison-Lab/sds@d802610426d8886ae973bcaf545833f290e088c2 🚀
</commit_message>
<xml_diff>
--- a/bayesian-inference-handout.docx
+++ b/bayesian-inference-handout.docx
@@ -15,7 +15,7 @@
         <w:pStyle w:val="Date"/>
       </w:pPr>
       <w:r>
-        <w:t xml:space="preserve">Last modified: 2026-10-22 16:10:27 (PDT)</w:t>
+        <w:t xml:space="preserve">Last modified: 2026-10-22 16:26:34 (PDT)</w:t>
       </w:r>
     </w:p>
     <w:p>
@@ -4890,7 +4890,7 @@
       <w:bookmarkStart w:id="37" w:name="eq-normal-normal-exm-3"/>
       <w:r>
         <w:t xml:space="preserve">$$
-    \mu\mid \mathord{\smash[b]{\underset{\raise.3ex\hbox{$\scriptstyle\sim$}}{x}}\vphantom{x}}\;\sim\; {\operatorname{N}\mathopen{}\left(\frac{n}{n+1}\bar{x},\; \frac{1}{n+1}\right)\mathclose{}}.
+    \mu\mid \mathord{\smash[b]{\underset{\raise.3ex\hbox{$\scriptstyle\sim$}}{x}}\vphantom{x}}\;\sim\; {\operatorname{N}\mathopen{}\left(\frac{n}{n+1}{\bar{x}},\; \frac{1}{n+1}\right)\mathclose{}}.
      \qquad(8)$$</w:t>
       </w:r>
       <w:bookmarkEnd w:id="37"/>
@@ -33486,7 +33486,7 @@
         <w:t xml:space="preserve"> </w:t>
       </w:r>
       <w:r>
-        <w:t xml:space="preserve">$T_2(\mathord{\smash[b]{\underset{\raise.3ex\hbox{$\scriptstyle\sim$}}{y}}\vphantom{y}}) = \max_g \bar{y}_g - \min_g \bar{y}_g$</w:t>
+        <w:t xml:space="preserve">$T_2(\mathord{\smash[b]{\underset{\raise.3ex\hbox{$\scriptstyle\sim$}}{y}}\vphantom{y}}) = \max_g {\bar{y}}_g - \min_g {\bar{y}}_g$</w:t>
       </w:r>
       <w:r>
         <w:t xml:space="preserve">,</w:t>

</xml_diff>

<commit_message>
Deploying to gh-pages from @ Morrison-Lab/sds@8983e63d4bdb790d4a6071c62101559f3e1d1ab0 🚀
</commit_message>
<xml_diff>
--- a/bayesian-inference-handout.docx
+++ b/bayesian-inference-handout.docx
@@ -15,7 +15,7 @@
         <w:pStyle w:val="Date"/>
       </w:pPr>
       <w:r>
-        <w:t xml:space="preserve">Last modified: 2026-10-26 01:50:35 (PDT)</w:t>
+        <w:t xml:space="preserve">Last modified: 2026-10-26 03:19:48 (PDT)</w:t>
       </w:r>
     </w:p>
     <w:p>
@@ -9253,7 +9253,31 @@
               <w:rPr>
                 <w:rStyle w:val="NormalTok"/>
               </w:rPr>
-              <w:t xml:space="preserve">(mu), </w:t>
+              <w:t xml:space="preserve">(</w:t>
+            </w:r>
+            <w:r>
+              <w:rPr>
+                <w:rStyle w:val="StringTok"/>
+              </w:rPr>
+              <w:t xml:space="preserve">"Mean, "</w:t>
+            </w:r>
+            <w:r>
+              <w:rPr>
+                <w:rStyle w:val="NormalTok"/>
+              </w:rPr>
+              <w:t xml:space="preserve"> </w:t>
+            </w:r>
+            <w:r>
+              <w:rPr>
+                <w:rStyle w:val="SpecialCharTok"/>
+              </w:rPr>
+              <w:t xml:space="preserve">*</w:t>
+            </w:r>
+            <w:r>
+              <w:rPr>
+                <w:rStyle w:val="NormalTok"/>
+              </w:rPr>
+              <w:t xml:space="preserve"> mu), </w:t>
             </w:r>
             <w:r>
               <w:rPr>
@@ -12165,7 +12189,31 @@
               <w:rPr>
                 <w:rStyle w:val="NormalTok"/>
               </w:rPr>
-              <w:t xml:space="preserve">(mu), </w:t>
+              <w:t xml:space="preserve">(</w:t>
+            </w:r>
+            <w:r>
+              <w:rPr>
+                <w:rStyle w:val="StringTok"/>
+              </w:rPr>
+              <w:t xml:space="preserve">"Mean, "</w:t>
+            </w:r>
+            <w:r>
+              <w:rPr>
+                <w:rStyle w:val="NormalTok"/>
+              </w:rPr>
+              <w:t xml:space="preserve"> </w:t>
+            </w:r>
+            <w:r>
+              <w:rPr>
+                <w:rStyle w:val="SpecialCharTok"/>
+              </w:rPr>
+              <w:t xml:space="preserve">*</w:t>
+            </w:r>
+            <w:r>
+              <w:rPr>
+                <w:rStyle w:val="NormalTok"/>
+              </w:rPr>
+              <w:t xml:space="preserve"> mu), </w:t>
             </w:r>
             <w:r>
               <w:rPr>

</xml_diff>

<commit_message>
Deploying to gh-pages from @ Morrison-Lab/sds@7982a7267646526affcb8c0cf6d2ef8878555e0c 🚀
</commit_message>
<xml_diff>
--- a/bayesian-inference-handout.docx
+++ b/bayesian-inference-handout.docx
@@ -15,7 +15,7 @@
         <w:pStyle w:val="Date"/>
       </w:pPr>
       <w:r>
-        <w:t xml:space="preserve">Last modified: 2026-10-26 13:14:30 (PDT)</w:t>
+        <w:t xml:space="preserve">Last modified: 2026-10-26 13:33:48 (PDT)</w:t>
       </w:r>
     </w:p>
     <w:p>
@@ -851,25 +851,37 @@
             <m:t> </m:t>
           </m:r>
           <m:r>
+            <m:t>π</m:t>
+          </m:r>
+          <m:r>
+            <m:rPr>
+              <m:sty m:val="p"/>
+            </m:rPr>
+            <m:t>∈</m:t>
+          </m:r>
+          <m:r>
+            <m:rPr>
+              <m:sty m:val="p"/>
+            </m:rPr>
+            <m:t>(</m:t>
+          </m:r>
+          <m:r>
             <m:t>0</m:t>
           </m:r>
           <m:r>
             <m:rPr>
               <m:sty m:val="p"/>
             </m:rPr>
-            <m:t>&lt;</m:t>
+            <m:t>,</m:t>
           </m:r>
           <m:r>
-            <m:t>π</m:t>
+            <m:t>1</m:t>
           </m:r>
           <m:r>
             <m:rPr>
               <m:sty m:val="p"/>
             </m:rPr>
-            <m:t>&lt;</m:t>
-          </m:r>
-          <m:r>
-            <m:t>1</m:t>
+            <m:t>)</m:t>
           </m:r>
           <m:r>
             <m:rPr>

</xml_diff>